<commit_message>
docs: perditesova Raportin Teknik 1 me kerkesat e sistemi
</commit_message>
<xml_diff>
--- a/docs/School_Control_Raporti_Teknik_1.docx
+++ b/docs/School_Control_Raporti_Teknik_1.docx
@@ -25,15 +25,9 @@
           </w:tcPr>
           <w:p>
             <w:pPr>
-              <w:spacing w:before="120" w:after="120"/>
-              <w:jc w:val="center"/>
+              <w:pStyle w:val="NoSpacing"/>
             </w:pPr>
             <w:r>
-              <w:rPr>
-                <w:b/>
-                <w:color w:val="FFFFFF"/>
-                <w:sz w:val="30"/>
-              </w:rPr>
               <w:t>SC</w:t>
             </w:r>
           </w:p>
@@ -65,14 +59,7 @@
                 <w:color w:val="56687D"/>
                 <w:sz w:val="18"/>
               </w:rPr>
-              <w:t>Fakulteti i Shkencave Kompjuterike  •  Dizajn Softuer</w:t>
-            </w:r>
-            <w:r>
-              <w:rPr>
-                <w:color w:val="56687D"/>
-                <w:sz w:val="18"/>
-              </w:rPr>
-              <w:t xml:space="preserve"> Profesional</w:t>
+              <w:t>Fakulteti i Shkencave Kompjuterike  •  Dizajn Softueri</w:t>
             </w:r>
           </w:p>
         </w:tc>
@@ -162,16 +149,6 @@
         </w:rPr>
         <w:t xml:space="preserve"> </w:t>
       </w:r>
-    </w:p>
-    <w:p>
-      <w:pPr>
-        <w:spacing w:after="100"/>
-        <w:rPr>
-          <w:b/>
-          <w:color w:val="0F9F9D"/>
-          <w:sz w:val="23"/>
-        </w:rPr>
-      </w:pPr>
     </w:p>
     <w:p>
       <w:pPr>
@@ -990,12 +967,8 @@
     </w:p>
     <w:p>
       <w:pPr>
-        <w:spacing w:after="100"/>
-        <w:rPr>
-          <w:b/>
-          <w:color w:val="0F9F9D"/>
-          <w:sz w:val="17"/>
-        </w:rPr>
+        <w:spacing w:after="200" w:line="305" w:lineRule="auto"/>
+        <w:jc w:val="both"/>
       </w:pPr>
     </w:p>
     <w:p>
@@ -1402,10 +1375,372 @@
       </w:tr>
     </w:tbl>
     <w:p>
-      <w:pPr>
-        <w:spacing w:before="100" w:after="120"/>
-      </w:pPr>
+      <w:r>
+        <w:br w:type="page"/>
+      </w:r>
     </w:p>
+    <w:tbl>
+      <w:tblPr>
+        <w:tblW w:w="0" w:type="auto"/>
+        <w:jc w:val="center"/>
+        <w:tblLayout w:type="fixed"/>
+        <w:tblLook w:val="04A0" w:firstRow="1" w:lastRow="0" w:firstColumn="1" w:lastColumn="0" w:noHBand="0" w:noVBand="1"/>
+      </w:tblPr>
+      <w:tblGrid>
+        <w:gridCol w:w="4677"/>
+        <w:gridCol w:w="4677"/>
+      </w:tblGrid>
+      <w:tr>
+        <w:trPr>
+          <w:jc w:val="center"/>
+        </w:trPr>
+        <w:tc>
+          <w:tcPr>
+            <w:tcW w:w="4677" w:type="dxa"/>
+          </w:tcPr>
+          <w:p>
+            <w:pPr>
+              <w:spacing w:after="60"/>
+            </w:pPr>
+            <w:r>
+              <w:rPr>
+                <w:b/>
+                <w:color w:val="0F9F9D"/>
+                <w:sz w:val="24"/>
+              </w:rPr>
+              <w:lastRenderedPageBreak/>
+              <w:t xml:space="preserve">SC  </w:t>
+            </w:r>
+            <w:r>
+              <w:rPr>
+                <w:b/>
+                <w:sz w:val="20"/>
+              </w:rPr>
+              <w:t>SCHOOL CONTROL</w:t>
+            </w:r>
+          </w:p>
+        </w:tc>
+        <w:tc>
+          <w:tcPr>
+            <w:tcW w:w="4677" w:type="dxa"/>
+          </w:tcPr>
+          <w:p>
+            <w:pPr>
+              <w:spacing w:after="60"/>
+              <w:jc w:val="right"/>
+            </w:pPr>
+            <w:r>
+              <w:rPr>
+                <w:b/>
+                <w:color w:val="56687D"/>
+                <w:sz w:val="17"/>
+              </w:rPr>
+              <w:t>RAPORTI TEKNIK 1</w:t>
+            </w:r>
+          </w:p>
+        </w:tc>
+      </w:tr>
+    </w:tbl>
+    <w:p>
+      <w:pPr>
+        <w:pBdr>
+          <w:bottom w:val="single" w:sz="17" w:space="2" w:color="0F9F9D"/>
+        </w:pBdr>
+        <w:spacing w:after="340"/>
+      </w:pPr>
+    </w:p>
+    <w:p>
+      <w:pPr>
+        <w:spacing w:after="120"/>
+      </w:pPr>
+      <w:r>
+        <w:rPr>
+          <w:b/>
+          <w:color w:val="0F9F9D"/>
+          <w:sz w:val="18"/>
+        </w:rPr>
+        <w:t>KAPITULLI 03  /  FUNKSIONALITETET</w:t>
+      </w:r>
+    </w:p>
+    <w:p>
+      <w:pPr>
+        <w:pStyle w:val="Heading1"/>
+        <w:spacing w:after="240" w:line="264" w:lineRule="auto"/>
+      </w:pPr>
+      <w:r>
+        <w:rPr>
+          <w:rFonts w:ascii="Arial" w:hAnsi="Arial"/>
+          <w:sz w:val="50"/>
+        </w:rPr>
+        <w:t>Funksionalitetet kryesore</w:t>
+      </w:r>
+      <w:r>
+        <w:rPr>
+          <w:rFonts w:ascii="Arial" w:hAnsi="Arial"/>
+          <w:sz w:val="50"/>
+        </w:rPr>
+        <w:t xml:space="preserve"> </w:t>
+      </w:r>
+      <w:r>
+        <w:rPr>
+          <w:rFonts w:ascii="Arial" w:hAnsi="Arial"/>
+          <w:sz w:val="50"/>
+        </w:rPr>
+        <w:t>të sistemit</w:t>
+      </w:r>
+    </w:p>
+    <w:p>
+      <w:pPr>
+        <w:pBdr>
+          <w:left w:val="single" w:sz="22" w:space="11" w:color="0F9F9D"/>
+        </w:pBdr>
+        <w:spacing w:after="300" w:line="302" w:lineRule="auto"/>
+        <w:ind w:left="142"/>
+      </w:pPr>
+      <w:r>
+        <w:rPr>
+          <w:color w:val="244B6E"/>
+          <w:sz w:val="22"/>
+        </w:rPr>
+        <w:t>Për versionin e parë të School Control kam zgjedhur shtatë funksionalitete. Dua që ato të jenë të thjeshta për përdorim dhe të funksionojnë realisht, jo vetëm të duken bukur në ekran.</w:t>
+      </w:r>
+    </w:p>
+    <w:p>
+      <w:pPr>
+        <w:pStyle w:val="Heading2"/>
+        <w:spacing w:before="180" w:after="60"/>
+      </w:pPr>
+      <w:r>
+        <w:rPr>
+          <w:rFonts w:ascii="Arial" w:hAnsi="Arial"/>
+          <w:sz w:val="24"/>
+        </w:rPr>
+        <w:t>3.1  Hyrja dhe rolet e përdoruesve</w:t>
+      </w:r>
+    </w:p>
+    <w:p>
+      <w:pPr>
+        <w:spacing w:after="80" w:line="290" w:lineRule="auto"/>
+        <w:jc w:val="both"/>
+      </w:pPr>
+      <w:r>
+        <w:rPr>
+          <w:sz w:val="20"/>
+        </w:rPr>
+        <w:t>Secili përdorues do të hyjë me llogarinë e vet. Sistemi do t’i japë qasje sipas rolit: drejtor, mësimdhënës ose nxënës.</w:t>
+      </w:r>
+    </w:p>
+    <w:p>
+      <w:pPr>
+        <w:pStyle w:val="Heading2"/>
+        <w:spacing w:before="180" w:after="60"/>
+      </w:pPr>
+      <w:r>
+        <w:rPr>
+          <w:rFonts w:ascii="Arial" w:hAnsi="Arial"/>
+          <w:sz w:val="24"/>
+        </w:rPr>
+        <w:t>3.2  Regjistrimi i nxënësve</w:t>
+      </w:r>
+    </w:p>
+    <w:p>
+      <w:pPr>
+        <w:spacing w:after="80" w:line="290" w:lineRule="auto"/>
+        <w:jc w:val="both"/>
+      </w:pPr>
+      <w:r>
+        <w:rPr>
+          <w:sz w:val="20"/>
+        </w:rPr>
+        <w:t>Drejtori do të shtojë të dhënat bazë të nxënësve, t’i përditësojë kur është e nevojshme dhe t’i caktojë ata në klasa.</w:t>
+      </w:r>
+    </w:p>
+    <w:p>
+      <w:pPr>
+        <w:pStyle w:val="Heading2"/>
+        <w:spacing w:before="180" w:after="60"/>
+      </w:pPr>
+      <w:r>
+        <w:rPr>
+          <w:rFonts w:ascii="Arial" w:hAnsi="Arial"/>
+          <w:sz w:val="24"/>
+        </w:rPr>
+        <w:t>3.3  Organizimi i klasave dhe mësimdhënësve</w:t>
+      </w:r>
+    </w:p>
+    <w:p>
+      <w:pPr>
+        <w:spacing w:after="80" w:line="290" w:lineRule="auto"/>
+        <w:jc w:val="both"/>
+      </w:pPr>
+      <w:r>
+        <w:rPr>
+          <w:sz w:val="20"/>
+        </w:rPr>
+        <w:t>Drejtori do të krijojë klasat dhe do t’u caktojë mësimdhënësve klasat dhe lëndët përkatëse.</w:t>
+      </w:r>
+    </w:p>
+    <w:p>
+      <w:pPr>
+        <w:pStyle w:val="Heading2"/>
+        <w:spacing w:before="180" w:after="60"/>
+      </w:pPr>
+      <w:r>
+        <w:rPr>
+          <w:rFonts w:ascii="Arial" w:hAnsi="Arial"/>
+          <w:sz w:val="24"/>
+        </w:rPr>
+        <w:t>3.4  Regjistrimi i notave</w:t>
+      </w:r>
+    </w:p>
+    <w:p>
+      <w:pPr>
+        <w:spacing w:after="80" w:line="290" w:lineRule="auto"/>
+        <w:jc w:val="both"/>
+      </w:pPr>
+      <w:r>
+        <w:rPr>
+          <w:sz w:val="20"/>
+        </w:rPr>
+        <w:t>Mësimdhënësi do të regjistrojë notat për nxënësit e klasave që i janë caktuar. Notat do të ruhen sipas nxënësit dhe lëndës.</w:t>
+      </w:r>
+    </w:p>
+    <w:p>
+      <w:pPr>
+        <w:pStyle w:val="Heading2"/>
+        <w:spacing w:before="180" w:after="60"/>
+      </w:pPr>
+      <w:r>
+        <w:rPr>
+          <w:rFonts w:ascii="Arial" w:hAnsi="Arial"/>
+          <w:sz w:val="24"/>
+        </w:rPr>
+        <w:t>3.5  Evidentimi i mungesave</w:t>
+      </w:r>
+    </w:p>
+    <w:p>
+      <w:pPr>
+        <w:spacing w:after="80" w:line="290" w:lineRule="auto"/>
+        <w:jc w:val="both"/>
+      </w:pPr>
+      <w:r>
+        <w:rPr>
+          <w:sz w:val="20"/>
+        </w:rPr>
+        <w:t>Mësimdhënësi do të shënojë mungesat sipas datës. Më pas ato do të mund të kontrollohen dhe të përmblidhen për secilin nxënës.</w:t>
+      </w:r>
+    </w:p>
+    <w:p>
+      <w:pPr>
+        <w:pStyle w:val="Heading2"/>
+        <w:spacing w:before="180" w:after="60"/>
+      </w:pPr>
+      <w:r>
+        <w:rPr>
+          <w:rFonts w:ascii="Arial" w:hAnsi="Arial"/>
+          <w:sz w:val="24"/>
+        </w:rPr>
+        <w:t>3.6  Pamja personale e nxënësit</w:t>
+      </w:r>
+    </w:p>
+    <w:p>
+      <w:pPr>
+        <w:spacing w:after="80" w:line="290" w:lineRule="auto"/>
+        <w:jc w:val="both"/>
+      </w:pPr>
+      <w:r>
+        <w:rPr>
+          <w:sz w:val="20"/>
+        </w:rPr>
+        <w:t>Nxënësi do të shohë vetëm notat dhe mungesat e veta, pa pasur mundësi t’i ndryshojë.</w:t>
+      </w:r>
+    </w:p>
+    <w:p>
+      <w:pPr>
+        <w:pStyle w:val="Heading2"/>
+        <w:spacing w:before="180" w:after="60"/>
+      </w:pPr>
+      <w:r>
+        <w:rPr>
+          <w:rFonts w:ascii="Arial" w:hAnsi="Arial"/>
+          <w:sz w:val="24"/>
+        </w:rPr>
+        <w:t>3.7  Statistikat bazë të shkollës</w:t>
+      </w:r>
+    </w:p>
+    <w:p>
+      <w:pPr>
+        <w:spacing w:after="80" w:line="290" w:lineRule="auto"/>
+        <w:jc w:val="both"/>
+        <w:rPr>
+          <w:sz w:val="20"/>
+        </w:rPr>
+      </w:pPr>
+      <w:r>
+        <w:rPr>
+          <w:sz w:val="20"/>
+        </w:rPr>
+        <w:t>Drejtori do të shohë numrin e nxënësve dhe klasave, si dhe përmbledhje të thjeshta për notat dhe mungesat.</w:t>
+      </w:r>
+    </w:p>
+    <w:p>
+      <w:pPr>
+        <w:spacing w:after="80" w:line="290" w:lineRule="auto"/>
+        <w:jc w:val="both"/>
+        <w:rPr>
+          <w:sz w:val="20"/>
+        </w:rPr>
+      </w:pPr>
+    </w:p>
+    <w:p>
+      <w:pPr>
+        <w:spacing w:after="80" w:line="290" w:lineRule="auto"/>
+        <w:jc w:val="both"/>
+      </w:pPr>
+    </w:p>
+    <w:p>
+      <w:pPr>
+        <w:spacing w:before="180" w:after="100"/>
+      </w:pPr>
+      <w:r>
+        <w:rPr>
+          <w:b/>
+          <w:color w:val="0F9F9D"/>
+          <w:sz w:val="17"/>
+        </w:rPr>
+        <w:t>SHEMBULL I PËRDORIMIT</w:t>
+      </w:r>
+    </w:p>
+    <w:tbl>
+      <w:tblPr>
+        <w:tblW w:w="0" w:type="auto"/>
+        <w:tblLayout w:type="fixed"/>
+        <w:tblLook w:val="04A0" w:firstRow="1" w:lastRow="0" w:firstColumn="1" w:lastColumn="0" w:noHBand="0" w:noVBand="1"/>
+      </w:tblPr>
+      <w:tblGrid>
+        <w:gridCol w:w="9354"/>
+      </w:tblGrid>
+      <w:tr>
+        <w:tc>
+          <w:tcPr>
+            <w:tcW w:w="9354" w:type="dxa"/>
+            <w:shd w:val="clear" w:color="auto" w:fill="EFF5F8"/>
+          </w:tcPr>
+          <w:p>
+            <w:pPr>
+              <w:spacing w:before="140" w:after="140" w:line="283" w:lineRule="auto"/>
+              <w:ind w:left="142" w:right="113"/>
+            </w:pPr>
+            <w:r>
+              <w:rPr>
+                <w:sz w:val="19"/>
+              </w:rPr>
+              <w:t>Një mësimdhënës hyn në sistem, zgjedh klasën dhe regjistron një mungesë. Informacioni ruhet në databazë; drejtori mund ta kontrollojë, ndërsa nxënësi sheh vetëm mungesat e veta.</w:t>
+            </w:r>
+          </w:p>
+        </w:tc>
+      </w:tr>
+    </w:tbl>
     <w:p>
       <w:r>
         <w:br w:type="page"/>
@@ -1491,7 +1826,7 @@
           <w:color w:val="0F9F9D"/>
           <w:sz w:val="18"/>
         </w:rPr>
-        <w:t>KAPITULLI 03  /  FUNKSIONALITETET</w:t>
+        <w:t>KAPITULLI 04  /  KËRKESAT E SISTEMIT</w:t>
       </w:r>
     </w:p>
     <w:p>
@@ -1504,7 +1839,7 @@
           <w:rFonts w:ascii="Arial" w:hAnsi="Arial"/>
           <w:sz w:val="50"/>
         </w:rPr>
-        <w:t>Funksionalitetet kryesore</w:t>
+        <w:t>Kërkesat funksionale dhe</w:t>
       </w:r>
       <w:r>
         <w:rPr>
@@ -1518,7 +1853,7 @@
           <w:rFonts w:ascii="Arial" w:hAnsi="Arial"/>
           <w:sz w:val="50"/>
         </w:rPr>
-        <w:t>të sistemit</w:t>
+        <w:t>jofunksionale</w:t>
       </w:r>
     </w:p>
     <w:p>
@@ -1528,24 +1863,13 @@
         </w:pBdr>
         <w:spacing w:after="300" w:line="302" w:lineRule="auto"/>
         <w:ind w:left="142"/>
-        <w:rPr>
-          <w:color w:val="244B6E"/>
-          <w:sz w:val="22"/>
-        </w:rPr>
       </w:pPr>
       <w:r>
         <w:rPr>
           <w:color w:val="244B6E"/>
           <w:sz w:val="22"/>
         </w:rPr>
-        <w:t>Për versionin e parë të School Control kam zgjedhur shtatë funksionalitete. Dua që ato të jenë të thjesht</w:t>
-      </w:r>
-      <w:r>
-        <w:rPr>
-          <w:color w:val="244B6E"/>
-          <w:sz w:val="22"/>
-        </w:rPr>
-        <w:t>a për përdorim dhe të funksionojnë realisht, jo vetëm të duken bukur në ekran.</w:t>
+        <w:t>Në këtë pjesë kam përcaktuar çfarë duhet të bëjë School Control dhe çfarë duhet të plotësojë gjatë përdorimit. Këto kërkesa do t’i kontrolloj kur të fillojë testimi i aplikacionit.</w:t>
       </w:r>
     </w:p>
     <w:p>
@@ -1558,181 +1882,1199 @@
           <w:rFonts w:ascii="Arial" w:hAnsi="Arial"/>
           <w:sz w:val="24"/>
         </w:rPr>
-        <w:t>3</w:t>
+        <w:t>4.1  Kërkesat funksionale</w:t>
       </w:r>
+    </w:p>
+    <w:p>
+      <w:pPr>
+        <w:spacing w:after="120" w:line="290" w:lineRule="auto"/>
+        <w:jc w:val="both"/>
+      </w:pPr>
+      <w:r>
+        <w:rPr>
+          <w:sz w:val="20"/>
+        </w:rPr>
+        <w:t>Këto janë veprimet kryesore që planifikoj t’i realizoj në sistem.</w:t>
+      </w:r>
+    </w:p>
+    <w:tbl>
+      <w:tblPr>
+        <w:tblW w:w="0" w:type="auto"/>
+        <w:jc w:val="center"/>
+        <w:tblLayout w:type="fixed"/>
+        <w:tblLook w:val="04A0" w:firstRow="1" w:lastRow="0" w:firstColumn="1" w:lastColumn="0" w:noHBand="0" w:noVBand="1"/>
+      </w:tblPr>
+      <w:tblGrid>
+        <w:gridCol w:w="879"/>
+        <w:gridCol w:w="4110"/>
+        <w:gridCol w:w="4139"/>
+      </w:tblGrid>
+      <w:tr>
+        <w:trPr>
+          <w:tblHeader/>
+          <w:jc w:val="center"/>
+        </w:trPr>
+        <w:tc>
+          <w:tcPr>
+            <w:tcW w:w="879" w:type="dxa"/>
+            <w:tcBorders>
+              <w:top w:val="nil"/>
+              <w:left w:val="nil"/>
+              <w:bottom w:val="nil"/>
+              <w:right w:val="nil"/>
+            </w:tcBorders>
+            <w:shd w:val="clear" w:color="auto" w:fill="172E4F"/>
+            <w:tcMar>
+              <w:top w:w="110" w:type="dxa"/>
+              <w:left w:w="105" w:type="dxa"/>
+              <w:bottom w:w="110" w:type="dxa"/>
+              <w:right w:w="105" w:type="dxa"/>
+            </w:tcMar>
+            <w:vAlign w:val="center"/>
+          </w:tcPr>
+          <w:p>
+            <w:pPr>
+              <w:spacing w:line="250" w:lineRule="auto"/>
+            </w:pPr>
+            <w:r>
+              <w:rPr>
+                <w:b/>
+                <w:color w:val="FFFFFF"/>
+                <w:sz w:val="18"/>
+              </w:rPr>
+              <w:t>Kodi</w:t>
+            </w:r>
+          </w:p>
+        </w:tc>
+        <w:tc>
+          <w:tcPr>
+            <w:tcW w:w="4110" w:type="dxa"/>
+            <w:tcBorders>
+              <w:top w:val="nil"/>
+              <w:left w:val="nil"/>
+              <w:bottom w:val="nil"/>
+              <w:right w:val="nil"/>
+            </w:tcBorders>
+            <w:shd w:val="clear" w:color="auto" w:fill="172E4F"/>
+            <w:tcMar>
+              <w:top w:w="110" w:type="dxa"/>
+              <w:left w:w="105" w:type="dxa"/>
+              <w:bottom w:w="110" w:type="dxa"/>
+              <w:right w:w="105" w:type="dxa"/>
+            </w:tcMar>
+            <w:vAlign w:val="center"/>
+          </w:tcPr>
+          <w:p>
+            <w:pPr>
+              <w:spacing w:line="250" w:lineRule="auto"/>
+            </w:pPr>
+            <w:r>
+              <w:rPr>
+                <w:b/>
+                <w:color w:val="FFFFFF"/>
+                <w:sz w:val="18"/>
+              </w:rPr>
+              <w:t>Çfarë duhet të bëjë sistemi</w:t>
+            </w:r>
+          </w:p>
+        </w:tc>
+        <w:tc>
+          <w:tcPr>
+            <w:tcW w:w="4139" w:type="dxa"/>
+            <w:tcBorders>
+              <w:top w:val="nil"/>
+              <w:left w:val="nil"/>
+              <w:bottom w:val="nil"/>
+              <w:right w:val="nil"/>
+            </w:tcBorders>
+            <w:shd w:val="clear" w:color="auto" w:fill="172E4F"/>
+            <w:tcMar>
+              <w:top w:w="110" w:type="dxa"/>
+              <w:left w:w="105" w:type="dxa"/>
+              <w:bottom w:w="110" w:type="dxa"/>
+              <w:right w:w="105" w:type="dxa"/>
+            </w:tcMar>
+            <w:vAlign w:val="center"/>
+          </w:tcPr>
+          <w:p>
+            <w:pPr>
+              <w:spacing w:line="250" w:lineRule="auto"/>
+            </w:pPr>
+            <w:r>
+              <w:rPr>
+                <w:b/>
+                <w:color w:val="FFFFFF"/>
+                <w:sz w:val="18"/>
+              </w:rPr>
+              <w:t>Si e kontrolloj</w:t>
+            </w:r>
+          </w:p>
+        </w:tc>
+      </w:tr>
+      <w:tr>
+        <w:trPr>
+          <w:jc w:val="center"/>
+        </w:trPr>
+        <w:tc>
+          <w:tcPr>
+            <w:tcW w:w="879" w:type="dxa"/>
+            <w:tcBorders>
+              <w:top w:val="nil"/>
+              <w:left w:val="nil"/>
+              <w:bottom w:val="nil"/>
+              <w:right w:val="nil"/>
+            </w:tcBorders>
+            <w:shd w:val="clear" w:color="auto" w:fill="EAF2F5"/>
+            <w:tcMar>
+              <w:top w:w="105" w:type="dxa"/>
+              <w:left w:w="105" w:type="dxa"/>
+              <w:bottom w:w="105" w:type="dxa"/>
+              <w:right w:w="105" w:type="dxa"/>
+            </w:tcMar>
+            <w:vAlign w:val="center"/>
+          </w:tcPr>
+          <w:p>
+            <w:pPr>
+              <w:spacing w:line="254" w:lineRule="auto"/>
+            </w:pPr>
+            <w:r>
+              <w:rPr>
+                <w:b/>
+                <w:color w:val="009499"/>
+                <w:sz w:val="18"/>
+              </w:rPr>
+              <w:t>F01</w:t>
+            </w:r>
+          </w:p>
+        </w:tc>
+        <w:tc>
+          <w:tcPr>
+            <w:tcW w:w="4110" w:type="dxa"/>
+            <w:tcBorders>
+              <w:top w:val="nil"/>
+              <w:left w:val="nil"/>
+              <w:bottom w:val="nil"/>
+              <w:right w:val="nil"/>
+            </w:tcBorders>
+            <w:shd w:val="clear" w:color="auto" w:fill="EAF2F5"/>
+            <w:tcMar>
+              <w:top w:w="105" w:type="dxa"/>
+              <w:left w:w="105" w:type="dxa"/>
+              <w:bottom w:w="105" w:type="dxa"/>
+              <w:right w:w="105" w:type="dxa"/>
+            </w:tcMar>
+            <w:vAlign w:val="center"/>
+          </w:tcPr>
+          <w:p>
+            <w:pPr>
+              <w:spacing w:line="254" w:lineRule="auto"/>
+            </w:pPr>
+            <w:r>
+              <w:rPr>
+                <w:color w:val="172E4F"/>
+                <w:sz w:val="18"/>
+              </w:rPr>
+              <w:t>Përdoruesi hyn me email dhe fjalëkalim.</w:t>
+            </w:r>
+          </w:p>
+        </w:tc>
+        <w:tc>
+          <w:tcPr>
+            <w:tcW w:w="4139" w:type="dxa"/>
+            <w:tcBorders>
+              <w:top w:val="nil"/>
+              <w:left w:val="nil"/>
+              <w:bottom w:val="nil"/>
+              <w:right w:val="nil"/>
+            </w:tcBorders>
+            <w:shd w:val="clear" w:color="auto" w:fill="EAF2F5"/>
+            <w:tcMar>
+              <w:top w:w="105" w:type="dxa"/>
+              <w:left w:w="105" w:type="dxa"/>
+              <w:bottom w:w="105" w:type="dxa"/>
+              <w:right w:w="105" w:type="dxa"/>
+            </w:tcMar>
+            <w:vAlign w:val="center"/>
+          </w:tcPr>
+          <w:p>
+            <w:pPr>
+              <w:spacing w:line="254" w:lineRule="auto"/>
+            </w:pPr>
+            <w:r>
+              <w:rPr>
+                <w:color w:val="172E4F"/>
+                <w:sz w:val="18"/>
+              </w:rPr>
+              <w:t>Me të dhëna të sakta hyn; me të gabuara merr njoftim.</w:t>
+            </w:r>
+          </w:p>
+        </w:tc>
+      </w:tr>
+      <w:tr>
+        <w:trPr>
+          <w:jc w:val="center"/>
+        </w:trPr>
+        <w:tc>
+          <w:tcPr>
+            <w:tcW w:w="879" w:type="dxa"/>
+            <w:tcBorders>
+              <w:top w:val="nil"/>
+              <w:left w:val="nil"/>
+              <w:bottom w:val="nil"/>
+              <w:right w:val="nil"/>
+            </w:tcBorders>
+            <w:shd w:val="clear" w:color="auto" w:fill="F8FAFB"/>
+            <w:tcMar>
+              <w:top w:w="105" w:type="dxa"/>
+              <w:left w:w="105" w:type="dxa"/>
+              <w:bottom w:w="105" w:type="dxa"/>
+              <w:right w:w="105" w:type="dxa"/>
+            </w:tcMar>
+            <w:vAlign w:val="center"/>
+          </w:tcPr>
+          <w:p>
+            <w:pPr>
+              <w:spacing w:line="254" w:lineRule="auto"/>
+            </w:pPr>
+            <w:r>
+              <w:rPr>
+                <w:b/>
+                <w:color w:val="009499"/>
+                <w:sz w:val="18"/>
+              </w:rPr>
+              <w:t>F02</w:t>
+            </w:r>
+          </w:p>
+        </w:tc>
+        <w:tc>
+          <w:tcPr>
+            <w:tcW w:w="4110" w:type="dxa"/>
+            <w:tcBorders>
+              <w:top w:val="nil"/>
+              <w:left w:val="nil"/>
+              <w:bottom w:val="nil"/>
+              <w:right w:val="nil"/>
+            </w:tcBorders>
+            <w:shd w:val="clear" w:color="auto" w:fill="F8FAFB"/>
+            <w:tcMar>
+              <w:top w:w="105" w:type="dxa"/>
+              <w:left w:w="105" w:type="dxa"/>
+              <w:bottom w:w="105" w:type="dxa"/>
+              <w:right w:w="105" w:type="dxa"/>
+            </w:tcMar>
+            <w:vAlign w:val="center"/>
+          </w:tcPr>
+          <w:p>
+            <w:pPr>
+              <w:spacing w:line="254" w:lineRule="auto"/>
+            </w:pPr>
+            <w:r>
+              <w:rPr>
+                <w:color w:val="172E4F"/>
+                <w:sz w:val="18"/>
+              </w:rPr>
+              <w:t>Drejtori regjistron nxënës dhe e cakton në një klasë.</w:t>
+            </w:r>
+          </w:p>
+        </w:tc>
+        <w:tc>
+          <w:tcPr>
+            <w:tcW w:w="4139" w:type="dxa"/>
+            <w:tcBorders>
+              <w:top w:val="nil"/>
+              <w:left w:val="nil"/>
+              <w:bottom w:val="nil"/>
+              <w:right w:val="nil"/>
+            </w:tcBorders>
+            <w:shd w:val="clear" w:color="auto" w:fill="F8FAFB"/>
+            <w:tcMar>
+              <w:top w:w="105" w:type="dxa"/>
+              <w:left w:w="105" w:type="dxa"/>
+              <w:bottom w:w="105" w:type="dxa"/>
+              <w:right w:w="105" w:type="dxa"/>
+            </w:tcMar>
+            <w:vAlign w:val="center"/>
+          </w:tcPr>
+          <w:p>
+            <w:pPr>
+              <w:spacing w:line="254" w:lineRule="auto"/>
+            </w:pPr>
+            <w:r>
+              <w:rPr>
+                <w:color w:val="172E4F"/>
+                <w:sz w:val="18"/>
+              </w:rPr>
+              <w:t>Nxënësi shfaqet në listën e klasës.</w:t>
+            </w:r>
+          </w:p>
+        </w:tc>
+      </w:tr>
+      <w:tr>
+        <w:trPr>
+          <w:jc w:val="center"/>
+        </w:trPr>
+        <w:tc>
+          <w:tcPr>
+            <w:tcW w:w="879" w:type="dxa"/>
+            <w:tcBorders>
+              <w:top w:val="nil"/>
+              <w:left w:val="nil"/>
+              <w:bottom w:val="nil"/>
+              <w:right w:val="nil"/>
+            </w:tcBorders>
+            <w:shd w:val="clear" w:color="auto" w:fill="EAF2F5"/>
+            <w:tcMar>
+              <w:top w:w="105" w:type="dxa"/>
+              <w:left w:w="105" w:type="dxa"/>
+              <w:bottom w:w="105" w:type="dxa"/>
+              <w:right w:w="105" w:type="dxa"/>
+            </w:tcMar>
+            <w:vAlign w:val="center"/>
+          </w:tcPr>
+          <w:p>
+            <w:pPr>
+              <w:spacing w:line="254" w:lineRule="auto"/>
+            </w:pPr>
+            <w:r>
+              <w:rPr>
+                <w:b/>
+                <w:color w:val="009499"/>
+                <w:sz w:val="18"/>
+              </w:rPr>
+              <w:t>F03</w:t>
+            </w:r>
+          </w:p>
+        </w:tc>
+        <w:tc>
+          <w:tcPr>
+            <w:tcW w:w="4110" w:type="dxa"/>
+            <w:tcBorders>
+              <w:top w:val="nil"/>
+              <w:left w:val="nil"/>
+              <w:bottom w:val="nil"/>
+              <w:right w:val="nil"/>
+            </w:tcBorders>
+            <w:shd w:val="clear" w:color="auto" w:fill="EAF2F5"/>
+            <w:tcMar>
+              <w:top w:w="105" w:type="dxa"/>
+              <w:left w:w="105" w:type="dxa"/>
+              <w:bottom w:w="105" w:type="dxa"/>
+              <w:right w:w="105" w:type="dxa"/>
+            </w:tcMar>
+            <w:vAlign w:val="center"/>
+          </w:tcPr>
+          <w:p>
+            <w:pPr>
+              <w:spacing w:line="254" w:lineRule="auto"/>
+            </w:pPr>
+            <w:r>
+              <w:rPr>
+                <w:color w:val="172E4F"/>
+                <w:sz w:val="18"/>
+              </w:rPr>
+              <w:t>Drejtori krijon klasa dhe cakton mësimdhënës e lëndë.</w:t>
+            </w:r>
+          </w:p>
+        </w:tc>
+        <w:tc>
+          <w:tcPr>
+            <w:tcW w:w="4139" w:type="dxa"/>
+            <w:tcBorders>
+              <w:top w:val="nil"/>
+              <w:left w:val="nil"/>
+              <w:bottom w:val="nil"/>
+              <w:right w:val="nil"/>
+            </w:tcBorders>
+            <w:shd w:val="clear" w:color="auto" w:fill="EAF2F5"/>
+            <w:tcMar>
+              <w:top w:w="105" w:type="dxa"/>
+              <w:left w:w="105" w:type="dxa"/>
+              <w:bottom w:w="105" w:type="dxa"/>
+              <w:right w:w="105" w:type="dxa"/>
+            </w:tcMar>
+            <w:vAlign w:val="center"/>
+          </w:tcPr>
+          <w:p>
+            <w:pPr>
+              <w:spacing w:line="254" w:lineRule="auto"/>
+            </w:pPr>
+            <w:r>
+              <w:rPr>
+                <w:color w:val="172E4F"/>
+                <w:sz w:val="18"/>
+              </w:rPr>
+              <w:t>Caktimet shfaqen te mësimdhënësi.</w:t>
+            </w:r>
+          </w:p>
+        </w:tc>
+      </w:tr>
+      <w:tr>
+        <w:trPr>
+          <w:jc w:val="center"/>
+        </w:trPr>
+        <w:tc>
+          <w:tcPr>
+            <w:tcW w:w="879" w:type="dxa"/>
+            <w:tcBorders>
+              <w:top w:val="nil"/>
+              <w:left w:val="nil"/>
+              <w:bottom w:val="nil"/>
+              <w:right w:val="nil"/>
+            </w:tcBorders>
+            <w:shd w:val="clear" w:color="auto" w:fill="F8FAFB"/>
+            <w:tcMar>
+              <w:top w:w="105" w:type="dxa"/>
+              <w:left w:w="105" w:type="dxa"/>
+              <w:bottom w:w="105" w:type="dxa"/>
+              <w:right w:w="105" w:type="dxa"/>
+            </w:tcMar>
+            <w:vAlign w:val="center"/>
+          </w:tcPr>
+          <w:p>
+            <w:pPr>
+              <w:spacing w:line="254" w:lineRule="auto"/>
+            </w:pPr>
+            <w:r>
+              <w:rPr>
+                <w:b/>
+                <w:color w:val="009499"/>
+                <w:sz w:val="18"/>
+              </w:rPr>
+              <w:t>F04</w:t>
+            </w:r>
+          </w:p>
+        </w:tc>
+        <w:tc>
+          <w:tcPr>
+            <w:tcW w:w="4110" w:type="dxa"/>
+            <w:tcBorders>
+              <w:top w:val="nil"/>
+              <w:left w:val="nil"/>
+              <w:bottom w:val="nil"/>
+              <w:right w:val="nil"/>
+            </w:tcBorders>
+            <w:shd w:val="clear" w:color="auto" w:fill="F8FAFB"/>
+            <w:tcMar>
+              <w:top w:w="105" w:type="dxa"/>
+              <w:left w:w="105" w:type="dxa"/>
+              <w:bottom w:w="105" w:type="dxa"/>
+              <w:right w:w="105" w:type="dxa"/>
+            </w:tcMar>
+            <w:vAlign w:val="center"/>
+          </w:tcPr>
+          <w:p>
+            <w:pPr>
+              <w:spacing w:line="254" w:lineRule="auto"/>
+            </w:pPr>
+            <w:r>
+              <w:rPr>
+                <w:color w:val="172E4F"/>
+                <w:sz w:val="18"/>
+              </w:rPr>
+              <w:t>Mësimdhënësi vendos nota në lëndën që i është caktuar.</w:t>
+            </w:r>
+          </w:p>
+        </w:tc>
+        <w:tc>
+          <w:tcPr>
+            <w:tcW w:w="4139" w:type="dxa"/>
+            <w:tcBorders>
+              <w:top w:val="nil"/>
+              <w:left w:val="nil"/>
+              <w:bottom w:val="nil"/>
+              <w:right w:val="nil"/>
+            </w:tcBorders>
+            <w:shd w:val="clear" w:color="auto" w:fill="F8FAFB"/>
+            <w:tcMar>
+              <w:top w:w="105" w:type="dxa"/>
+              <w:left w:w="105" w:type="dxa"/>
+              <w:bottom w:w="105" w:type="dxa"/>
+              <w:right w:w="105" w:type="dxa"/>
+            </w:tcMar>
+            <w:vAlign w:val="center"/>
+          </w:tcPr>
+          <w:p>
+            <w:pPr>
+              <w:spacing w:line="254" w:lineRule="auto"/>
+            </w:pPr>
+            <w:r>
+              <w:rPr>
+                <w:color w:val="172E4F"/>
+                <w:sz w:val="18"/>
+              </w:rPr>
+              <w:t>Nota shfaqet te nxënësi përkatës.</w:t>
+            </w:r>
+          </w:p>
+        </w:tc>
+      </w:tr>
+      <w:tr>
+        <w:trPr>
+          <w:jc w:val="center"/>
+        </w:trPr>
+        <w:tc>
+          <w:tcPr>
+            <w:tcW w:w="879" w:type="dxa"/>
+            <w:tcBorders>
+              <w:top w:val="nil"/>
+              <w:left w:val="nil"/>
+              <w:bottom w:val="nil"/>
+              <w:right w:val="nil"/>
+            </w:tcBorders>
+            <w:shd w:val="clear" w:color="auto" w:fill="EAF2F5"/>
+            <w:tcMar>
+              <w:top w:w="105" w:type="dxa"/>
+              <w:left w:w="105" w:type="dxa"/>
+              <w:bottom w:w="105" w:type="dxa"/>
+              <w:right w:w="105" w:type="dxa"/>
+            </w:tcMar>
+            <w:vAlign w:val="center"/>
+          </w:tcPr>
+          <w:p>
+            <w:pPr>
+              <w:spacing w:line="254" w:lineRule="auto"/>
+            </w:pPr>
+            <w:r>
+              <w:rPr>
+                <w:b/>
+                <w:color w:val="009499"/>
+                <w:sz w:val="18"/>
+              </w:rPr>
+              <w:t>F05</w:t>
+            </w:r>
+          </w:p>
+        </w:tc>
+        <w:tc>
+          <w:tcPr>
+            <w:tcW w:w="4110" w:type="dxa"/>
+            <w:tcBorders>
+              <w:top w:val="nil"/>
+              <w:left w:val="nil"/>
+              <w:bottom w:val="nil"/>
+              <w:right w:val="nil"/>
+            </w:tcBorders>
+            <w:shd w:val="clear" w:color="auto" w:fill="EAF2F5"/>
+            <w:tcMar>
+              <w:top w:w="105" w:type="dxa"/>
+              <w:left w:w="105" w:type="dxa"/>
+              <w:bottom w:w="105" w:type="dxa"/>
+              <w:right w:w="105" w:type="dxa"/>
+            </w:tcMar>
+            <w:vAlign w:val="center"/>
+          </w:tcPr>
+          <w:p>
+            <w:pPr>
+              <w:spacing w:line="254" w:lineRule="auto"/>
+            </w:pPr>
+            <w:r>
+              <w:rPr>
+                <w:color w:val="172E4F"/>
+                <w:sz w:val="18"/>
+              </w:rPr>
+              <w:t>Mësimdhënësi regjistron një mungesë me datë.</w:t>
+            </w:r>
+          </w:p>
+        </w:tc>
+        <w:tc>
+          <w:tcPr>
+            <w:tcW w:w="4139" w:type="dxa"/>
+            <w:tcBorders>
+              <w:top w:val="nil"/>
+              <w:left w:val="nil"/>
+              <w:bottom w:val="nil"/>
+              <w:right w:val="nil"/>
+            </w:tcBorders>
+            <w:shd w:val="clear" w:color="auto" w:fill="EAF2F5"/>
+            <w:tcMar>
+              <w:top w:w="105" w:type="dxa"/>
+              <w:left w:w="105" w:type="dxa"/>
+              <w:bottom w:w="105" w:type="dxa"/>
+              <w:right w:w="105" w:type="dxa"/>
+            </w:tcMar>
+            <w:vAlign w:val="center"/>
+          </w:tcPr>
+          <w:p>
+            <w:pPr>
+              <w:spacing w:line="254" w:lineRule="auto"/>
+            </w:pPr>
+            <w:r>
+              <w:rPr>
+                <w:color w:val="172E4F"/>
+                <w:sz w:val="18"/>
+              </w:rPr>
+              <w:t>Mungesa shfaqet te historiku i nxënësit.</w:t>
+            </w:r>
+          </w:p>
+        </w:tc>
+      </w:tr>
+      <w:tr>
+        <w:trPr>
+          <w:jc w:val="center"/>
+        </w:trPr>
+        <w:tc>
+          <w:tcPr>
+            <w:tcW w:w="879" w:type="dxa"/>
+            <w:tcBorders>
+              <w:top w:val="nil"/>
+              <w:left w:val="nil"/>
+              <w:bottom w:val="nil"/>
+              <w:right w:val="nil"/>
+            </w:tcBorders>
+            <w:shd w:val="clear" w:color="auto" w:fill="F8FAFB"/>
+            <w:tcMar>
+              <w:top w:w="105" w:type="dxa"/>
+              <w:left w:w="105" w:type="dxa"/>
+              <w:bottom w:w="105" w:type="dxa"/>
+              <w:right w:w="105" w:type="dxa"/>
+            </w:tcMar>
+            <w:vAlign w:val="center"/>
+          </w:tcPr>
+          <w:p>
+            <w:pPr>
+              <w:spacing w:line="254" w:lineRule="auto"/>
+            </w:pPr>
+            <w:r>
+              <w:rPr>
+                <w:b/>
+                <w:color w:val="009499"/>
+                <w:sz w:val="18"/>
+              </w:rPr>
+              <w:t>F06</w:t>
+            </w:r>
+          </w:p>
+        </w:tc>
+        <w:tc>
+          <w:tcPr>
+            <w:tcW w:w="4110" w:type="dxa"/>
+            <w:tcBorders>
+              <w:top w:val="nil"/>
+              <w:left w:val="nil"/>
+              <w:bottom w:val="nil"/>
+              <w:right w:val="nil"/>
+            </w:tcBorders>
+            <w:shd w:val="clear" w:color="auto" w:fill="F8FAFB"/>
+            <w:tcMar>
+              <w:top w:w="105" w:type="dxa"/>
+              <w:left w:w="105" w:type="dxa"/>
+              <w:bottom w:w="105" w:type="dxa"/>
+              <w:right w:w="105" w:type="dxa"/>
+            </w:tcMar>
+            <w:vAlign w:val="center"/>
+          </w:tcPr>
+          <w:p>
+            <w:pPr>
+              <w:spacing w:line="254" w:lineRule="auto"/>
+            </w:pPr>
+            <w:r>
+              <w:rPr>
+                <w:color w:val="172E4F"/>
+                <w:sz w:val="18"/>
+              </w:rPr>
+              <w:t>Nxënësi sheh vetëm notat dhe mungesat e veta.</w:t>
+            </w:r>
+          </w:p>
+        </w:tc>
+        <w:tc>
+          <w:tcPr>
+            <w:tcW w:w="4139" w:type="dxa"/>
+            <w:tcBorders>
+              <w:top w:val="nil"/>
+              <w:left w:val="nil"/>
+              <w:bottom w:val="nil"/>
+              <w:right w:val="nil"/>
+            </w:tcBorders>
+            <w:shd w:val="clear" w:color="auto" w:fill="F8FAFB"/>
+            <w:tcMar>
+              <w:top w:w="105" w:type="dxa"/>
+              <w:left w:w="105" w:type="dxa"/>
+              <w:bottom w:w="105" w:type="dxa"/>
+              <w:right w:w="105" w:type="dxa"/>
+            </w:tcMar>
+            <w:vAlign w:val="center"/>
+          </w:tcPr>
+          <w:p>
+            <w:pPr>
+              <w:spacing w:line="254" w:lineRule="auto"/>
+            </w:pPr>
+            <w:r>
+              <w:rPr>
+                <w:color w:val="172E4F"/>
+                <w:sz w:val="18"/>
+              </w:rPr>
+              <w:t>Qasja te të dhënat e të tjerëve refuzohet.</w:t>
+            </w:r>
+          </w:p>
+        </w:tc>
+      </w:tr>
+      <w:tr>
+        <w:trPr>
+          <w:jc w:val="center"/>
+        </w:trPr>
+        <w:tc>
+          <w:tcPr>
+            <w:tcW w:w="879" w:type="dxa"/>
+            <w:tcBorders>
+              <w:top w:val="nil"/>
+              <w:left w:val="nil"/>
+              <w:bottom w:val="nil"/>
+              <w:right w:val="nil"/>
+            </w:tcBorders>
+            <w:shd w:val="clear" w:color="auto" w:fill="EAF2F5"/>
+            <w:tcMar>
+              <w:top w:w="105" w:type="dxa"/>
+              <w:left w:w="105" w:type="dxa"/>
+              <w:bottom w:w="105" w:type="dxa"/>
+              <w:right w:w="105" w:type="dxa"/>
+            </w:tcMar>
+            <w:vAlign w:val="center"/>
+          </w:tcPr>
+          <w:p>
+            <w:pPr>
+              <w:spacing w:line="254" w:lineRule="auto"/>
+            </w:pPr>
+            <w:r>
+              <w:rPr>
+                <w:b/>
+                <w:color w:val="009499"/>
+                <w:sz w:val="18"/>
+              </w:rPr>
+              <w:t>F07</w:t>
+            </w:r>
+          </w:p>
+        </w:tc>
+        <w:tc>
+          <w:tcPr>
+            <w:tcW w:w="4110" w:type="dxa"/>
+            <w:tcBorders>
+              <w:top w:val="nil"/>
+              <w:left w:val="nil"/>
+              <w:bottom w:val="nil"/>
+              <w:right w:val="nil"/>
+            </w:tcBorders>
+            <w:shd w:val="clear" w:color="auto" w:fill="EAF2F5"/>
+            <w:tcMar>
+              <w:top w:w="105" w:type="dxa"/>
+              <w:left w:w="105" w:type="dxa"/>
+              <w:bottom w:w="105" w:type="dxa"/>
+              <w:right w:w="105" w:type="dxa"/>
+            </w:tcMar>
+            <w:vAlign w:val="center"/>
+          </w:tcPr>
+          <w:p>
+            <w:pPr>
+              <w:spacing w:line="254" w:lineRule="auto"/>
+            </w:pPr>
+            <w:r>
+              <w:rPr>
+                <w:color w:val="172E4F"/>
+                <w:sz w:val="18"/>
+              </w:rPr>
+              <w:t>Drejtori sheh statistikat bazë të shkollës.</w:t>
+            </w:r>
+          </w:p>
+        </w:tc>
+        <w:tc>
+          <w:tcPr>
+            <w:tcW w:w="4139" w:type="dxa"/>
+            <w:tcBorders>
+              <w:top w:val="nil"/>
+              <w:left w:val="nil"/>
+              <w:bottom w:val="nil"/>
+              <w:right w:val="nil"/>
+            </w:tcBorders>
+            <w:shd w:val="clear" w:color="auto" w:fill="EAF2F5"/>
+            <w:tcMar>
+              <w:top w:w="105" w:type="dxa"/>
+              <w:left w:w="105" w:type="dxa"/>
+              <w:bottom w:w="105" w:type="dxa"/>
+              <w:right w:w="105" w:type="dxa"/>
+            </w:tcMar>
+            <w:vAlign w:val="center"/>
+          </w:tcPr>
+          <w:p>
+            <w:pPr>
+              <w:spacing w:line="254" w:lineRule="auto"/>
+            </w:pPr>
+            <w:r>
+              <w:rPr>
+                <w:color w:val="172E4F"/>
+                <w:sz w:val="18"/>
+              </w:rPr>
+              <w:t>Numrat përputhen me të dhënat e regjistruara.</w:t>
+            </w:r>
+          </w:p>
+        </w:tc>
+      </w:tr>
+    </w:tbl>
+    <w:p>
+      <w:pPr>
+        <w:pStyle w:val="Heading2"/>
+        <w:spacing w:before="260" w:after="140"/>
+      </w:pPr>
       <w:r>
         <w:rPr>
           <w:rFonts w:ascii="Arial" w:hAnsi="Arial"/>
           <w:sz w:val="24"/>
         </w:rPr>
-        <w:t>.1  Hyrja dhe rolet e përdoruesve</w:t>
+        <w:t>4.2  Kërkesat jofunksionale</w:t>
       </w:r>
     </w:p>
+    <w:tbl>
+      <w:tblPr>
+        <w:tblW w:w="0" w:type="auto"/>
+        <w:jc w:val="center"/>
+        <w:tblLayout w:type="fixed"/>
+        <w:tblLook w:val="04A0" w:firstRow="1" w:lastRow="0" w:firstColumn="1" w:lastColumn="0" w:noHBand="0" w:noVBand="1"/>
+      </w:tblPr>
+      <w:tblGrid>
+        <w:gridCol w:w="879"/>
+        <w:gridCol w:w="8249"/>
+      </w:tblGrid>
+      <w:tr>
+        <w:trPr>
+          <w:tblHeader/>
+          <w:jc w:val="center"/>
+        </w:trPr>
+        <w:tc>
+          <w:tcPr>
+            <w:tcW w:w="879" w:type="dxa"/>
+            <w:tcBorders>
+              <w:top w:val="nil"/>
+              <w:left w:val="nil"/>
+              <w:bottom w:val="nil"/>
+              <w:right w:val="nil"/>
+            </w:tcBorders>
+            <w:shd w:val="clear" w:color="auto" w:fill="172E4F"/>
+            <w:tcMar>
+              <w:top w:w="110" w:type="dxa"/>
+              <w:left w:w="105" w:type="dxa"/>
+              <w:bottom w:w="110" w:type="dxa"/>
+              <w:right w:w="105" w:type="dxa"/>
+            </w:tcMar>
+            <w:vAlign w:val="center"/>
+          </w:tcPr>
+          <w:p>
+            <w:pPr>
+              <w:spacing w:line="250" w:lineRule="auto"/>
+            </w:pPr>
+            <w:r>
+              <w:rPr>
+                <w:b/>
+                <w:color w:val="FFFFFF"/>
+                <w:sz w:val="18"/>
+              </w:rPr>
+              <w:t>Kodi</w:t>
+            </w:r>
+          </w:p>
+        </w:tc>
+        <w:tc>
+          <w:tcPr>
+            <w:tcW w:w="8249" w:type="dxa"/>
+            <w:tcBorders>
+              <w:top w:val="nil"/>
+              <w:left w:val="nil"/>
+              <w:bottom w:val="nil"/>
+              <w:right w:val="nil"/>
+            </w:tcBorders>
+            <w:shd w:val="clear" w:color="auto" w:fill="172E4F"/>
+            <w:tcMar>
+              <w:top w:w="110" w:type="dxa"/>
+              <w:left w:w="105" w:type="dxa"/>
+              <w:bottom w:w="110" w:type="dxa"/>
+              <w:right w:w="105" w:type="dxa"/>
+            </w:tcMar>
+            <w:vAlign w:val="center"/>
+          </w:tcPr>
+          <w:p>
+            <w:pPr>
+              <w:spacing w:line="250" w:lineRule="auto"/>
+            </w:pPr>
+            <w:r>
+              <w:rPr>
+                <w:b/>
+                <w:color w:val="FFFFFF"/>
+                <w:sz w:val="18"/>
+              </w:rPr>
+              <w:t>Kushti dhe mënyra e kontrollit</w:t>
+            </w:r>
+          </w:p>
+        </w:tc>
+      </w:tr>
+      <w:tr>
+        <w:trPr>
+          <w:jc w:val="center"/>
+        </w:trPr>
+        <w:tc>
+          <w:tcPr>
+            <w:tcW w:w="879" w:type="dxa"/>
+            <w:tcBorders>
+              <w:top w:val="nil"/>
+              <w:left w:val="nil"/>
+              <w:bottom w:val="nil"/>
+              <w:right w:val="nil"/>
+            </w:tcBorders>
+            <w:shd w:val="clear" w:color="auto" w:fill="EAF2F5"/>
+            <w:tcMar>
+              <w:top w:w="105" w:type="dxa"/>
+              <w:left w:w="105" w:type="dxa"/>
+              <w:bottom w:w="105" w:type="dxa"/>
+              <w:right w:w="105" w:type="dxa"/>
+            </w:tcMar>
+            <w:vAlign w:val="center"/>
+          </w:tcPr>
+          <w:p>
+            <w:pPr>
+              <w:spacing w:line="254" w:lineRule="auto"/>
+            </w:pPr>
+            <w:r>
+              <w:rPr>
+                <w:b/>
+                <w:color w:val="009499"/>
+                <w:sz w:val="18"/>
+              </w:rPr>
+              <w:t>JF01</w:t>
+            </w:r>
+          </w:p>
+        </w:tc>
+        <w:tc>
+          <w:tcPr>
+            <w:tcW w:w="8249" w:type="dxa"/>
+            <w:tcBorders>
+              <w:top w:val="nil"/>
+              <w:left w:val="nil"/>
+              <w:bottom w:val="nil"/>
+              <w:right w:val="nil"/>
+            </w:tcBorders>
+            <w:shd w:val="clear" w:color="auto" w:fill="EAF2F5"/>
+            <w:tcMar>
+              <w:top w:w="105" w:type="dxa"/>
+              <w:left w:w="105" w:type="dxa"/>
+              <w:bottom w:w="105" w:type="dxa"/>
+              <w:right w:w="105" w:type="dxa"/>
+            </w:tcMar>
+            <w:vAlign w:val="center"/>
+          </w:tcPr>
+          <w:p>
+            <w:pPr>
+              <w:spacing w:line="254" w:lineRule="auto"/>
+            </w:pPr>
+            <w:r>
+              <w:rPr>
+                <w:color w:val="172E4F"/>
+                <w:sz w:val="18"/>
+              </w:rPr>
+              <w:t>Siguria – Fjalëkalimet ruhen si hash dhe sistemi nuk lejon ndryshime pa autorizim. E provoj me një rol që nuk ka leje.</w:t>
+            </w:r>
+          </w:p>
+        </w:tc>
+      </w:tr>
+      <w:tr>
+        <w:trPr>
+          <w:jc w:val="center"/>
+        </w:trPr>
+        <w:tc>
+          <w:tcPr>
+            <w:tcW w:w="879" w:type="dxa"/>
+            <w:tcBorders>
+              <w:top w:val="nil"/>
+              <w:left w:val="nil"/>
+              <w:bottom w:val="nil"/>
+              <w:right w:val="nil"/>
+            </w:tcBorders>
+            <w:shd w:val="clear" w:color="auto" w:fill="F8FAFB"/>
+            <w:tcMar>
+              <w:top w:w="105" w:type="dxa"/>
+              <w:left w:w="105" w:type="dxa"/>
+              <w:bottom w:w="105" w:type="dxa"/>
+              <w:right w:w="105" w:type="dxa"/>
+            </w:tcMar>
+            <w:vAlign w:val="center"/>
+          </w:tcPr>
+          <w:p>
+            <w:pPr>
+              <w:spacing w:line="254" w:lineRule="auto"/>
+            </w:pPr>
+            <w:r>
+              <w:rPr>
+                <w:b/>
+                <w:color w:val="009499"/>
+                <w:sz w:val="18"/>
+              </w:rPr>
+              <w:t>JF02</w:t>
+            </w:r>
+          </w:p>
+        </w:tc>
+        <w:tc>
+          <w:tcPr>
+            <w:tcW w:w="8249" w:type="dxa"/>
+            <w:tcBorders>
+              <w:top w:val="nil"/>
+              <w:left w:val="nil"/>
+              <w:bottom w:val="nil"/>
+              <w:right w:val="nil"/>
+            </w:tcBorders>
+            <w:shd w:val="clear" w:color="auto" w:fill="F8FAFB"/>
+            <w:tcMar>
+              <w:top w:w="105" w:type="dxa"/>
+              <w:left w:w="105" w:type="dxa"/>
+              <w:bottom w:w="105" w:type="dxa"/>
+              <w:right w:w="105" w:type="dxa"/>
+            </w:tcMar>
+            <w:vAlign w:val="center"/>
+          </w:tcPr>
+          <w:p>
+            <w:pPr>
+              <w:spacing w:line="254" w:lineRule="auto"/>
+            </w:pPr>
+            <w:r>
+              <w:rPr>
+                <w:color w:val="172E4F"/>
+                <w:sz w:val="18"/>
+              </w:rPr>
+              <w:t>Saktësia – Fushat e detyrueshme nuk mund të lihen bosh. Një formular i paplotë nuk ruhet.</w:t>
+            </w:r>
+          </w:p>
+        </w:tc>
+      </w:tr>
+      <w:tr>
+        <w:trPr>
+          <w:jc w:val="center"/>
+        </w:trPr>
+        <w:tc>
+          <w:tcPr>
+            <w:tcW w:w="879" w:type="dxa"/>
+            <w:tcBorders>
+              <w:top w:val="nil"/>
+              <w:left w:val="nil"/>
+              <w:bottom w:val="nil"/>
+              <w:right w:val="nil"/>
+            </w:tcBorders>
+            <w:shd w:val="clear" w:color="auto" w:fill="EAF2F5"/>
+            <w:tcMar>
+              <w:top w:w="105" w:type="dxa"/>
+              <w:left w:w="105" w:type="dxa"/>
+              <w:bottom w:w="105" w:type="dxa"/>
+              <w:right w:w="105" w:type="dxa"/>
+            </w:tcMar>
+            <w:vAlign w:val="center"/>
+          </w:tcPr>
+          <w:p>
+            <w:pPr>
+              <w:spacing w:line="254" w:lineRule="auto"/>
+            </w:pPr>
+            <w:r>
+              <w:rPr>
+                <w:b/>
+                <w:color w:val="009499"/>
+                <w:sz w:val="18"/>
+              </w:rPr>
+              <w:t>JF03</w:t>
+            </w:r>
+          </w:p>
+        </w:tc>
+        <w:tc>
+          <w:tcPr>
+            <w:tcW w:w="8249" w:type="dxa"/>
+            <w:tcBorders>
+              <w:top w:val="nil"/>
+              <w:left w:val="nil"/>
+              <w:bottom w:val="nil"/>
+              <w:right w:val="nil"/>
+            </w:tcBorders>
+            <w:shd w:val="clear" w:color="auto" w:fill="EAF2F5"/>
+            <w:tcMar>
+              <w:top w:w="105" w:type="dxa"/>
+              <w:left w:w="105" w:type="dxa"/>
+              <w:bottom w:w="105" w:type="dxa"/>
+              <w:right w:w="105" w:type="dxa"/>
+            </w:tcMar>
+            <w:vAlign w:val="center"/>
+          </w:tcPr>
+          <w:p>
+            <w:pPr>
+              <w:spacing w:line="254" w:lineRule="auto"/>
+            </w:pPr>
+            <w:r>
+              <w:rPr>
+                <w:color w:val="172E4F"/>
+                <w:sz w:val="18"/>
+              </w:rPr>
+              <w:t>Përdorimi – Faqet kryesore duhet të lexohen mirë në kompjuter dhe telefon, pa prerje të përmbajtjes.</w:t>
+            </w:r>
+          </w:p>
+        </w:tc>
+      </w:tr>
+      <w:tr>
+        <w:trPr>
+          <w:jc w:val="center"/>
+        </w:trPr>
+        <w:tc>
+          <w:tcPr>
+            <w:tcW w:w="879" w:type="dxa"/>
+            <w:tcBorders>
+              <w:top w:val="nil"/>
+              <w:left w:val="nil"/>
+              <w:bottom w:val="nil"/>
+              <w:right w:val="nil"/>
+            </w:tcBorders>
+            <w:shd w:val="clear" w:color="auto" w:fill="F8FAFB"/>
+            <w:tcMar>
+              <w:top w:w="105" w:type="dxa"/>
+              <w:left w:w="105" w:type="dxa"/>
+              <w:bottom w:w="105" w:type="dxa"/>
+              <w:right w:w="105" w:type="dxa"/>
+            </w:tcMar>
+            <w:vAlign w:val="center"/>
+          </w:tcPr>
+          <w:p>
+            <w:pPr>
+              <w:spacing w:line="254" w:lineRule="auto"/>
+            </w:pPr>
+            <w:r>
+              <w:rPr>
+                <w:b/>
+                <w:color w:val="009499"/>
+                <w:sz w:val="18"/>
+              </w:rPr>
+              <w:t>JF04</w:t>
+            </w:r>
+          </w:p>
+        </w:tc>
+        <w:tc>
+          <w:tcPr>
+            <w:tcW w:w="8249" w:type="dxa"/>
+            <w:tcBorders>
+              <w:top w:val="nil"/>
+              <w:left w:val="nil"/>
+              <w:bottom w:val="nil"/>
+              <w:right w:val="nil"/>
+            </w:tcBorders>
+            <w:shd w:val="clear" w:color="auto" w:fill="F8FAFB"/>
+            <w:tcMar>
+              <w:top w:w="105" w:type="dxa"/>
+              <w:left w:w="105" w:type="dxa"/>
+              <w:bottom w:w="105" w:type="dxa"/>
+              <w:right w:w="105" w:type="dxa"/>
+            </w:tcMar>
+            <w:vAlign w:val="center"/>
+          </w:tcPr>
+          <w:p>
+            <w:pPr>
+              <w:spacing w:line="254" w:lineRule="auto"/>
+            </w:pPr>
+            <w:r>
+              <w:rPr>
+                <w:color w:val="172E4F"/>
+                <w:sz w:val="18"/>
+              </w:rPr>
+              <w:t>Ruajtja – Të dhënat mbeten në databazë edhe pasi të mbyllet dhe të hapet përsëri aplikacioni.</w:t>
+            </w:r>
+          </w:p>
+        </w:tc>
+      </w:tr>
+    </w:tbl>
     <w:p>
       <w:pPr>
-        <w:spacing w:after="80" w:line="290" w:lineRule="auto"/>
-        <w:jc w:val="both"/>
-      </w:pPr>
-      <w:r>
-        <w:rPr>
-          <w:sz w:val="20"/>
-        </w:rPr>
-        <w:t>Secili përdorues do të hyjë me llogarinë e vet. Sistemi do t’i japë qasje sipas rolit: drejtor, mësimdhënës ose nxënës.</w:t>
-      </w:r>
-    </w:p>
-    <w:p>
-      <w:pPr>
-        <w:pStyle w:val="Heading2"/>
-        <w:spacing w:before="180" w:after="60"/>
-      </w:pPr>
-      <w:r>
-        <w:rPr>
-          <w:rFonts w:ascii="Arial" w:hAnsi="Arial"/>
-          <w:sz w:val="24"/>
-        </w:rPr>
-        <w:t>3.2  Regjistrimi i nxënësve</w:t>
-      </w:r>
-    </w:p>
-    <w:p>
-      <w:pPr>
-        <w:spacing w:after="80" w:line="290" w:lineRule="auto"/>
-        <w:jc w:val="both"/>
-      </w:pPr>
-      <w:r>
-        <w:rPr>
-          <w:sz w:val="20"/>
-        </w:rPr>
-        <w:t>Drejtori do të shtojë të dhënat bazë të nxënësve, t’i përditësojë kur është e nevojshme dhe t’i caktojë ata në klasa.</w:t>
-      </w:r>
-    </w:p>
-    <w:p>
-      <w:pPr>
-        <w:pStyle w:val="Heading2"/>
-        <w:spacing w:before="180" w:after="60"/>
-      </w:pPr>
-      <w:r>
-        <w:rPr>
-          <w:rFonts w:ascii="Arial" w:hAnsi="Arial"/>
-          <w:sz w:val="24"/>
-        </w:rPr>
-        <w:t>3.3  Organizimi i klasave dhe mësimdhënësve</w:t>
-      </w:r>
-    </w:p>
-    <w:p>
-      <w:pPr>
-        <w:spacing w:after="80" w:line="290" w:lineRule="auto"/>
-        <w:jc w:val="both"/>
-      </w:pPr>
-      <w:r>
-        <w:rPr>
-          <w:sz w:val="20"/>
-        </w:rPr>
-        <w:t>Drejtori do të krijojë klasat dhe do t’u caktojë mësimdhënësve klasat dhe lëndët përkatëse.</w:t>
-      </w:r>
-    </w:p>
-    <w:p>
-      <w:pPr>
-        <w:pStyle w:val="Heading2"/>
-        <w:spacing w:before="180" w:after="60"/>
-      </w:pPr>
-      <w:r>
-        <w:rPr>
-          <w:rFonts w:ascii="Arial" w:hAnsi="Arial"/>
-          <w:sz w:val="24"/>
-        </w:rPr>
-        <w:t>3.4  Regjistrimi i notave</w:t>
-      </w:r>
-    </w:p>
-    <w:p>
-      <w:pPr>
-        <w:spacing w:after="80" w:line="290" w:lineRule="auto"/>
-        <w:jc w:val="both"/>
-      </w:pPr>
-      <w:r>
-        <w:rPr>
-          <w:sz w:val="20"/>
-        </w:rPr>
-        <w:t>Mësimdhënësi do të regjistrojë notat për nxënësit e klasave që i janë caktuar. Notat do të ruhen sipas nxënësit dhe lëndës.</w:t>
-      </w:r>
-    </w:p>
-    <w:p>
-      <w:pPr>
-        <w:pStyle w:val="Heading2"/>
-        <w:spacing w:before="180" w:after="60"/>
-      </w:pPr>
-      <w:r>
-        <w:rPr>
-          <w:rFonts w:ascii="Arial" w:hAnsi="Arial"/>
-          <w:sz w:val="24"/>
-        </w:rPr>
-        <w:t>3.5  Evidentimi i mungesave</w:t>
-      </w:r>
-    </w:p>
-    <w:p>
-      <w:pPr>
-        <w:spacing w:after="80" w:line="290" w:lineRule="auto"/>
-        <w:jc w:val="both"/>
-      </w:pPr>
-      <w:r>
-        <w:rPr>
-          <w:sz w:val="20"/>
-        </w:rPr>
-        <w:t>Mësimdhënësi do të shënojë mungesat sipas datës. Më pas ato do të mund të kontrollohen dhe të përmblidhen për secilin nxënës.</w:t>
-      </w:r>
-    </w:p>
-    <w:p>
-      <w:pPr>
-        <w:pStyle w:val="Heading2"/>
-        <w:spacing w:before="180" w:after="60"/>
-      </w:pPr>
-      <w:r>
-        <w:rPr>
-          <w:rFonts w:ascii="Arial" w:hAnsi="Arial"/>
-          <w:sz w:val="24"/>
-        </w:rPr>
-        <w:t>3.6  Pamja personale e nxënësit</w:t>
-      </w:r>
-    </w:p>
-    <w:p>
-      <w:pPr>
-        <w:spacing w:after="80" w:line="290" w:lineRule="auto"/>
-        <w:jc w:val="both"/>
-      </w:pPr>
-      <w:r>
-        <w:rPr>
-          <w:sz w:val="20"/>
-        </w:rPr>
-        <w:t>Nxënësi do të shohë vetëm notat dhe mungesat e veta, pa pasur mundësi t’i ndryshojë.</w:t>
-      </w:r>
-    </w:p>
-    <w:p>
-      <w:pPr>
-        <w:pStyle w:val="Heading2"/>
-        <w:spacing w:before="180" w:after="60"/>
-      </w:pPr>
-      <w:r>
-        <w:rPr>
-          <w:rFonts w:ascii="Arial" w:hAnsi="Arial"/>
-          <w:sz w:val="24"/>
-        </w:rPr>
-        <w:t>3.7  Statistikat bazë të shkollës</w:t>
-      </w:r>
-    </w:p>
-    <w:p>
-      <w:pPr>
-        <w:spacing w:after="80" w:line="290" w:lineRule="auto"/>
-        <w:jc w:val="both"/>
-      </w:pPr>
-      <w:r>
-        <w:rPr>
-          <w:sz w:val="20"/>
-        </w:rPr>
-        <w:t>Drejtori do të shohë numrin e nxënësve dhe klasave, si dhe përmbledhje të thjeshta për notat dhe mungesat.</w:t>
-      </w:r>
-    </w:p>
-    <w:p>
-      <w:pPr>
-        <w:spacing w:before="180" w:after="100"/>
+        <w:spacing w:before="180" w:after="80"/>
         <w:rPr>
           <w:b/>
           <w:color w:val="0F9F9D"/>
@@ -1742,17 +3084,7 @@
     </w:p>
     <w:p>
       <w:pPr>
-        <w:spacing w:before="180" w:after="100"/>
-        <w:rPr>
-          <w:b/>
-          <w:color w:val="0F9F9D"/>
-          <w:sz w:val="17"/>
-        </w:rPr>
-      </w:pPr>
-    </w:p>
-    <w:p>
-      <w:pPr>
-        <w:spacing w:before="180" w:after="100"/>
+        <w:spacing w:before="180" w:after="80"/>
       </w:pPr>
       <w:r>
         <w:rPr>
@@ -1760,40 +3092,21 @@
           <w:color w:val="0F9F9D"/>
           <w:sz w:val="17"/>
         </w:rPr>
-        <w:t>SHEMBULL I PËRDORIMIT</w:t>
+        <w:t>PSE I KAM NDARË NË DY GRUPE?</w:t>
       </w:r>
     </w:p>
-    <w:tbl>
-      <w:tblPr>
-        <w:tblW w:w="0" w:type="auto"/>
-        <w:tblLayout w:type="fixed"/>
-        <w:tblLook w:val="04A0" w:firstRow="1" w:lastRow="0" w:firstColumn="1" w:lastColumn="0" w:noHBand="0" w:noVBand="1"/>
-      </w:tblPr>
-      <w:tblGrid>
-        <w:gridCol w:w="9354"/>
-      </w:tblGrid>
-      <w:tr>
-        <w:tc>
-          <w:tcPr>
-            <w:tcW w:w="9354" w:type="dxa"/>
-            <w:shd w:val="clear" w:color="auto" w:fill="EFF5F8"/>
-          </w:tcPr>
-          <w:p>
-            <w:pPr>
-              <w:spacing w:before="140" w:after="140" w:line="283" w:lineRule="auto"/>
-              <w:ind w:left="142" w:right="113"/>
-            </w:pPr>
-            <w:r>
-              <w:rPr>
-                <w:sz w:val="19"/>
-              </w:rPr>
-              <w:t>Një mësimdhënës hyn në sistem, zgjedh klasën dhe regjistron një mungesë. Informacioni ruhet në databazë; drejtori mund ta kontrollojë, ndërsa nxënësi sheh vetëm mungesat e veta.</w:t>
-            </w:r>
-          </w:p>
-        </w:tc>
-      </w:tr>
-    </w:tbl>
-    <w:p/>
+    <w:p>
+      <w:pPr>
+        <w:spacing w:line="290" w:lineRule="auto"/>
+        <w:jc w:val="both"/>
+      </w:pPr>
+      <w:r>
+        <w:rPr>
+          <w:sz w:val="20"/>
+        </w:rPr>
+        <w:t>Kërkesat funksionale tregojnë veprimet e aplikacionit; ato jofunksionale tregojnë si duhet të sillet sistemi gjatë përdorimit.</w:t>
+      </w:r>
+    </w:p>
     <w:sectPr>
       <w:footerReference w:type="default" r:id="rId9"/>
       <w:pgSz w:w="11906" w:h="16838"/>
@@ -2065,31 +3378,31 @@
       </w:rPr>
     </w:lvl>
   </w:abstractNum>
-  <w:num w:numId="1" w16cid:durableId="118425582">
+  <w:num w:numId="1" w16cid:durableId="724179637">
     <w:abstractNumId w:val="8"/>
   </w:num>
-  <w:num w:numId="2" w16cid:durableId="97412389">
+  <w:num w:numId="2" w16cid:durableId="1696690724">
     <w:abstractNumId w:val="6"/>
   </w:num>
-  <w:num w:numId="3" w16cid:durableId="2065175214">
+  <w:num w:numId="3" w16cid:durableId="1996755859">
     <w:abstractNumId w:val="5"/>
   </w:num>
-  <w:num w:numId="4" w16cid:durableId="1984775182">
+  <w:num w:numId="4" w16cid:durableId="1130437528">
     <w:abstractNumId w:val="4"/>
   </w:num>
-  <w:num w:numId="5" w16cid:durableId="1181894462">
+  <w:num w:numId="5" w16cid:durableId="1737433402">
     <w:abstractNumId w:val="7"/>
   </w:num>
-  <w:num w:numId="6" w16cid:durableId="935289134">
+  <w:num w:numId="6" w16cid:durableId="1124496213">
     <w:abstractNumId w:val="3"/>
   </w:num>
-  <w:num w:numId="7" w16cid:durableId="1936739877">
+  <w:num w:numId="7" w16cid:durableId="1219174188">
     <w:abstractNumId w:val="2"/>
   </w:num>
-  <w:num w:numId="8" w16cid:durableId="730158318">
+  <w:num w:numId="8" w16cid:durableId="683284091">
     <w:abstractNumId w:val="1"/>
   </w:num>
-  <w:num w:numId="9" w16cid:durableId="2586872">
+  <w:num w:numId="9" w16cid:durableId="440343091">
     <w:abstractNumId w:val="0"/>
   </w:num>
 </w:numbering>

</xml_diff>

<commit_message>
docs: shtova teknologjite dhe arkitekturen e School Control
</commit_message>
<xml_diff>
--- a/docs/School_Control_Raporti_Teknik_1.docx
+++ b/docs/School_Control_Raporti_Teknik_1.docx
@@ -25,9 +25,15 @@
           </w:tcPr>
           <w:p>
             <w:pPr>
-              <w:pStyle w:val="NoSpacing"/>
+              <w:spacing w:before="120" w:after="120"/>
+              <w:jc w:val="center"/>
             </w:pPr>
             <w:r>
+              <w:rPr>
+                <w:b/>
+                <w:color w:val="FFFFFF"/>
+                <w:sz w:val="30"/>
+              </w:rPr>
               <w:t>SC</w:t>
             </w:r>
           </w:p>
@@ -967,8 +973,12 @@
     </w:p>
     <w:p>
       <w:pPr>
-        <w:spacing w:after="200" w:line="305" w:lineRule="auto"/>
-        <w:jc w:val="both"/>
+        <w:spacing w:after="100"/>
+        <w:rPr>
+          <w:b/>
+          <w:color w:val="0F9F9D"/>
+          <w:sz w:val="17"/>
+        </w:rPr>
       </w:pPr>
     </w:p>
     <w:p>
@@ -1375,6 +1385,11 @@
       </w:tr>
     </w:tbl>
     <w:p>
+      <w:pPr>
+        <w:spacing w:before="100" w:after="120"/>
+      </w:pPr>
+    </w:p>
+    <w:p>
       <w:r>
         <w:br w:type="page"/>
       </w:r>
@@ -1672,9 +1687,6 @@
       <w:pPr>
         <w:spacing w:after="80" w:line="290" w:lineRule="auto"/>
         <w:jc w:val="both"/>
-        <w:rPr>
-          <w:sz w:val="20"/>
-        </w:rPr>
       </w:pPr>
       <w:r>
         <w:rPr>
@@ -1685,17 +1697,12 @@
     </w:p>
     <w:p>
       <w:pPr>
-        <w:spacing w:after="80" w:line="290" w:lineRule="auto"/>
-        <w:jc w:val="both"/>
+        <w:spacing w:before="180" w:after="100"/>
         <w:rPr>
-          <w:sz w:val="20"/>
+          <w:b/>
+          <w:color w:val="0F9F9D"/>
+          <w:sz w:val="17"/>
         </w:rPr>
-      </w:pPr>
-    </w:p>
-    <w:p>
-      <w:pPr>
-        <w:spacing w:after="80" w:line="290" w:lineRule="auto"/>
-        <w:jc w:val="both"/>
       </w:pPr>
     </w:p>
     <w:p>
@@ -1846,13 +1853,7 @@
           <w:rFonts w:ascii="Arial" w:hAnsi="Arial"/>
           <w:sz w:val="50"/>
         </w:rPr>
-        <w:t xml:space="preserve"> </w:t>
-      </w:r>
-      <w:r>
-        <w:rPr>
-          <w:rFonts w:ascii="Arial" w:hAnsi="Arial"/>
-          <w:sz w:val="50"/>
-        </w:rPr>
+        <w:br/>
         <w:t>jofunksionale</w:t>
       </w:r>
     </w:p>
@@ -3107,6 +3108,1183 @@
         <w:t>Kërkesat funksionale tregojnë veprimet e aplikacionit; ato jofunksionale tregojnë si duhet të sillet sistemi gjatë përdorimit.</w:t>
       </w:r>
     </w:p>
+    <w:p>
+      <w:r>
+        <w:br w:type="page"/>
+      </w:r>
+    </w:p>
+    <w:tbl>
+      <w:tblPr>
+        <w:tblW w:w="0" w:type="auto"/>
+        <w:jc w:val="center"/>
+        <w:tblLayout w:type="fixed"/>
+        <w:tblLook w:val="04A0" w:firstRow="1" w:lastRow="0" w:firstColumn="1" w:lastColumn="0" w:noHBand="0" w:noVBand="1"/>
+      </w:tblPr>
+      <w:tblGrid>
+        <w:gridCol w:w="4677"/>
+        <w:gridCol w:w="4677"/>
+      </w:tblGrid>
+      <w:tr>
+        <w:trPr>
+          <w:jc w:val="center"/>
+        </w:trPr>
+        <w:tc>
+          <w:tcPr>
+            <w:tcW w:w="4677" w:type="dxa"/>
+          </w:tcPr>
+          <w:p>
+            <w:pPr>
+              <w:spacing w:after="60"/>
+            </w:pPr>
+            <w:r>
+              <w:rPr>
+                <w:b/>
+                <w:color w:val="0F9F9D"/>
+                <w:sz w:val="24"/>
+              </w:rPr>
+              <w:lastRenderedPageBreak/>
+              <w:t xml:space="preserve">SC  </w:t>
+            </w:r>
+            <w:r>
+              <w:rPr>
+                <w:b/>
+                <w:sz w:val="20"/>
+              </w:rPr>
+              <w:t>SCHOOL CONTROL</w:t>
+            </w:r>
+          </w:p>
+        </w:tc>
+        <w:tc>
+          <w:tcPr>
+            <w:tcW w:w="4677" w:type="dxa"/>
+          </w:tcPr>
+          <w:p>
+            <w:pPr>
+              <w:spacing w:after="60"/>
+              <w:jc w:val="right"/>
+            </w:pPr>
+            <w:r>
+              <w:rPr>
+                <w:b/>
+                <w:color w:val="56687D"/>
+                <w:sz w:val="17"/>
+              </w:rPr>
+              <w:t>RAPORTI TEKNIK 1</w:t>
+            </w:r>
+          </w:p>
+        </w:tc>
+      </w:tr>
+    </w:tbl>
+    <w:p>
+      <w:pPr>
+        <w:pBdr>
+          <w:bottom w:val="single" w:sz="17" w:space="2" w:color="0F9F9D"/>
+        </w:pBdr>
+        <w:spacing w:after="340"/>
+      </w:pPr>
+    </w:p>
+    <w:p>
+      <w:pPr>
+        <w:spacing w:after="160"/>
+      </w:pPr>
+      <w:r>
+        <w:rPr>
+          <w:b/>
+          <w:color w:val="0F9F9D"/>
+          <w:sz w:val="18"/>
+        </w:rPr>
+        <w:t>KAPITULLI 05  /  ZGJEDHJA E TEKNOLOGJIVE</w:t>
+      </w:r>
+    </w:p>
+    <w:p>
+      <w:pPr>
+        <w:pStyle w:val="Heading1"/>
+        <w:spacing w:after="240" w:line="264" w:lineRule="auto"/>
+      </w:pPr>
+      <w:r>
+        <w:rPr>
+          <w:rFonts w:ascii="Arial" w:hAnsi="Arial"/>
+          <w:sz w:val="50"/>
+        </w:rPr>
+        <w:t>Teknologjitë e planifikuara</w:t>
+      </w:r>
+    </w:p>
+    <w:p>
+      <w:pPr>
+        <w:pBdr>
+          <w:left w:val="single" w:sz="22" w:space="11" w:color="0F9F9D"/>
+        </w:pBdr>
+        <w:spacing w:after="340" w:line="300" w:lineRule="auto"/>
+        <w:ind w:left="140"/>
+      </w:pPr>
+      <w:r>
+        <w:rPr>
+          <w:color w:val="244B6E"/>
+          <w:sz w:val="22"/>
+        </w:rPr>
+        <w:t>School Control do ta ndërtoj si aplikacion web. Për logjikën kryesore kam zgjedhur Python dhe Django, ndërsa përdoruesit do ta hapin sistemin nga shfletuesi në kompjuter ose telefon.</w:t>
+      </w:r>
+    </w:p>
+    <w:p>
+      <w:pPr>
+        <w:pStyle w:val="Heading2"/>
+        <w:spacing w:before="80" w:after="140"/>
+      </w:pPr>
+      <w:r>
+        <w:rPr>
+          <w:rFonts w:ascii="Arial" w:hAnsi="Arial"/>
+        </w:rPr>
+        <w:t>5.1  Teknologjitë dhe roli i tyre</w:t>
+      </w:r>
+    </w:p>
+    <w:p>
+      <w:pPr>
+        <w:spacing w:after="160" w:line="298" w:lineRule="auto"/>
+        <w:jc w:val="both"/>
+      </w:pPr>
+      <w:r>
+        <w:rPr>
+          <w:sz w:val="20"/>
+        </w:rPr>
+        <w:t>Për versionin e parë kam zgjedhur mjete që mund t’i mësoj dhe t’i përdor gjatë këtij semestri.</w:t>
+      </w:r>
+    </w:p>
+    <w:tbl>
+      <w:tblPr>
+        <w:tblW w:w="0" w:type="auto"/>
+        <w:jc w:val="center"/>
+        <w:tblBorders>
+          <w:top w:val="nil"/>
+          <w:left w:val="nil"/>
+          <w:bottom w:val="nil"/>
+          <w:right w:val="nil"/>
+          <w:insideH w:val="nil"/>
+          <w:insideV w:val="nil"/>
+        </w:tblBorders>
+        <w:tblLayout w:type="fixed"/>
+        <w:tblLook w:val="04A0" w:firstRow="1" w:lastRow="0" w:firstColumn="1" w:lastColumn="0" w:noHBand="0" w:noVBand="1"/>
+      </w:tblPr>
+      <w:tblGrid>
+        <w:gridCol w:w="2664"/>
+        <w:gridCol w:w="6552"/>
+      </w:tblGrid>
+      <w:tr>
+        <w:trPr>
+          <w:cantSplit/>
+          <w:jc w:val="center"/>
+        </w:trPr>
+        <w:tc>
+          <w:tcPr>
+            <w:tcW w:w="2664" w:type="dxa"/>
+            <w:shd w:val="clear" w:color="auto" w:fill="172E4F"/>
+            <w:tcMar>
+              <w:top w:w="120" w:type="dxa"/>
+              <w:left w:w="150" w:type="dxa"/>
+              <w:bottom w:w="120" w:type="dxa"/>
+              <w:right w:w="150" w:type="dxa"/>
+            </w:tcMar>
+            <w:vAlign w:val="center"/>
+          </w:tcPr>
+          <w:p>
+            <w:r>
+              <w:rPr>
+                <w:b/>
+                <w:color w:val="FFFFFF"/>
+                <w:sz w:val="18"/>
+              </w:rPr>
+              <w:t>Teknologjia</w:t>
+            </w:r>
+          </w:p>
+        </w:tc>
+        <w:tc>
+          <w:tcPr>
+            <w:tcW w:w="6552" w:type="dxa"/>
+            <w:shd w:val="clear" w:color="auto" w:fill="172E4F"/>
+            <w:tcMar>
+              <w:top w:w="120" w:type="dxa"/>
+              <w:left w:w="150" w:type="dxa"/>
+              <w:bottom w:w="120" w:type="dxa"/>
+              <w:right w:w="150" w:type="dxa"/>
+            </w:tcMar>
+            <w:vAlign w:val="center"/>
+          </w:tcPr>
+          <w:p>
+            <w:r>
+              <w:rPr>
+                <w:b/>
+                <w:color w:val="FFFFFF"/>
+                <w:sz w:val="18"/>
+              </w:rPr>
+              <w:t>Pse do të përdoret në School Control</w:t>
+            </w:r>
+          </w:p>
+        </w:tc>
+      </w:tr>
+      <w:tr>
+        <w:trPr>
+          <w:cantSplit/>
+          <w:jc w:val="center"/>
+        </w:trPr>
+        <w:tc>
+          <w:tcPr>
+            <w:tcW w:w="2664" w:type="dxa"/>
+            <w:shd w:val="clear" w:color="auto" w:fill="EAF2F5"/>
+            <w:tcMar>
+              <w:top w:w="133" w:type="dxa"/>
+              <w:left w:w="150" w:type="dxa"/>
+              <w:bottom w:w="133" w:type="dxa"/>
+              <w:right w:w="150" w:type="dxa"/>
+            </w:tcMar>
+            <w:vAlign w:val="center"/>
+          </w:tcPr>
+          <w:p>
+            <w:pPr>
+              <w:spacing w:line="283" w:lineRule="auto"/>
+            </w:pPr>
+            <w:r>
+              <w:rPr>
+                <w:b/>
+                <w:color w:val="0F9F9D"/>
+                <w:sz w:val="18"/>
+              </w:rPr>
+              <w:t>Python</w:t>
+            </w:r>
+          </w:p>
+        </w:tc>
+        <w:tc>
+          <w:tcPr>
+            <w:tcW w:w="6552" w:type="dxa"/>
+            <w:shd w:val="clear" w:color="auto" w:fill="EAF2F5"/>
+            <w:tcMar>
+              <w:top w:w="133" w:type="dxa"/>
+              <w:left w:w="150" w:type="dxa"/>
+              <w:bottom w:w="133" w:type="dxa"/>
+              <w:right w:w="150" w:type="dxa"/>
+            </w:tcMar>
+            <w:vAlign w:val="center"/>
+          </w:tcPr>
+          <w:p>
+            <w:pPr>
+              <w:spacing w:line="283" w:lineRule="auto"/>
+            </w:pPr>
+            <w:r>
+              <w:rPr>
+                <w:sz w:val="18"/>
+              </w:rPr>
+              <w:t>Gjuha kryesore. Me të do të shkruaj logjikën e sistemit, si regjistrimi i nxënësve dhe ruajtja e notave.</w:t>
+            </w:r>
+          </w:p>
+        </w:tc>
+      </w:tr>
+      <w:tr>
+        <w:trPr>
+          <w:cantSplit/>
+          <w:jc w:val="center"/>
+        </w:trPr>
+        <w:tc>
+          <w:tcPr>
+            <w:tcW w:w="2664" w:type="dxa"/>
+            <w:shd w:val="clear" w:color="auto" w:fill="F5F8FA"/>
+            <w:tcMar>
+              <w:top w:w="133" w:type="dxa"/>
+              <w:left w:w="150" w:type="dxa"/>
+              <w:bottom w:w="133" w:type="dxa"/>
+              <w:right w:w="150" w:type="dxa"/>
+            </w:tcMar>
+            <w:vAlign w:val="center"/>
+          </w:tcPr>
+          <w:p>
+            <w:pPr>
+              <w:spacing w:line="283" w:lineRule="auto"/>
+            </w:pPr>
+            <w:r>
+              <w:rPr>
+                <w:b/>
+                <w:color w:val="0F9F9D"/>
+                <w:sz w:val="18"/>
+              </w:rPr>
+              <w:t>Django</w:t>
+            </w:r>
+          </w:p>
+        </w:tc>
+        <w:tc>
+          <w:tcPr>
+            <w:tcW w:w="6552" w:type="dxa"/>
+            <w:shd w:val="clear" w:color="auto" w:fill="F5F8FA"/>
+            <w:tcMar>
+              <w:top w:w="133" w:type="dxa"/>
+              <w:left w:w="150" w:type="dxa"/>
+              <w:bottom w:w="133" w:type="dxa"/>
+              <w:right w:w="150" w:type="dxa"/>
+            </w:tcMar>
+            <w:vAlign w:val="center"/>
+          </w:tcPr>
+          <w:p>
+            <w:pPr>
+              <w:spacing w:line="283" w:lineRule="auto"/>
+            </w:pPr>
+            <w:r>
+              <w:rPr>
+                <w:sz w:val="18"/>
+              </w:rPr>
+              <w:t>Do të lidhë faqet me databazën dhe do të ndihmojë në menaxhimin e përdoruesve dhe të drejtave të tyre.</w:t>
+            </w:r>
+          </w:p>
+        </w:tc>
+      </w:tr>
+      <w:tr>
+        <w:trPr>
+          <w:cantSplit/>
+          <w:jc w:val="center"/>
+        </w:trPr>
+        <w:tc>
+          <w:tcPr>
+            <w:tcW w:w="2664" w:type="dxa"/>
+            <w:shd w:val="clear" w:color="auto" w:fill="EAF2F5"/>
+            <w:tcMar>
+              <w:top w:w="133" w:type="dxa"/>
+              <w:left w:w="150" w:type="dxa"/>
+              <w:bottom w:w="133" w:type="dxa"/>
+              <w:right w:w="150" w:type="dxa"/>
+            </w:tcMar>
+            <w:vAlign w:val="center"/>
+          </w:tcPr>
+          <w:p>
+            <w:pPr>
+              <w:spacing w:line="283" w:lineRule="auto"/>
+            </w:pPr>
+            <w:r>
+              <w:rPr>
+                <w:b/>
+                <w:color w:val="0F9F9D"/>
+                <w:sz w:val="18"/>
+              </w:rPr>
+              <w:t>HTML, CSS dhe Bootstrap</w:t>
+            </w:r>
+          </w:p>
+        </w:tc>
+        <w:tc>
+          <w:tcPr>
+            <w:tcW w:w="6552" w:type="dxa"/>
+            <w:shd w:val="clear" w:color="auto" w:fill="EAF2F5"/>
+            <w:tcMar>
+              <w:top w:w="133" w:type="dxa"/>
+              <w:left w:w="150" w:type="dxa"/>
+              <w:bottom w:w="133" w:type="dxa"/>
+              <w:right w:w="150" w:type="dxa"/>
+            </w:tcMar>
+            <w:vAlign w:val="center"/>
+          </w:tcPr>
+          <w:p>
+            <w:pPr>
+              <w:spacing w:line="283" w:lineRule="auto"/>
+            </w:pPr>
+            <w:r>
+              <w:rPr>
+                <w:sz w:val="18"/>
+              </w:rPr>
+              <w:t>Do të përdoren për pamjen e aplikacionit, në mënyrë që faqet të jenë të qarta edhe në telefon.</w:t>
+            </w:r>
+          </w:p>
+        </w:tc>
+      </w:tr>
+      <w:tr>
+        <w:trPr>
+          <w:cantSplit/>
+          <w:jc w:val="center"/>
+        </w:trPr>
+        <w:tc>
+          <w:tcPr>
+            <w:tcW w:w="2664" w:type="dxa"/>
+            <w:shd w:val="clear" w:color="auto" w:fill="F5F8FA"/>
+            <w:tcMar>
+              <w:top w:w="133" w:type="dxa"/>
+              <w:left w:w="150" w:type="dxa"/>
+              <w:bottom w:w="133" w:type="dxa"/>
+              <w:right w:w="150" w:type="dxa"/>
+            </w:tcMar>
+            <w:vAlign w:val="center"/>
+          </w:tcPr>
+          <w:p>
+            <w:pPr>
+              <w:spacing w:line="283" w:lineRule="auto"/>
+            </w:pPr>
+            <w:r>
+              <w:rPr>
+                <w:b/>
+                <w:color w:val="0F9F9D"/>
+                <w:sz w:val="18"/>
+              </w:rPr>
+              <w:t>JavaScript</w:t>
+            </w:r>
+          </w:p>
+        </w:tc>
+        <w:tc>
+          <w:tcPr>
+            <w:tcW w:w="6552" w:type="dxa"/>
+            <w:shd w:val="clear" w:color="auto" w:fill="F5F8FA"/>
+            <w:tcMar>
+              <w:top w:w="133" w:type="dxa"/>
+              <w:left w:w="150" w:type="dxa"/>
+              <w:bottom w:w="133" w:type="dxa"/>
+              <w:right w:w="150" w:type="dxa"/>
+            </w:tcMar>
+            <w:vAlign w:val="center"/>
+          </w:tcPr>
+          <w:p>
+            <w:pPr>
+              <w:spacing w:line="283" w:lineRule="auto"/>
+            </w:pPr>
+            <w:r>
+              <w:rPr>
+                <w:sz w:val="18"/>
+              </w:rPr>
+              <w:t>Për veprime të thjeshta në faqe, si njoftimet dhe përditësimi i disa elementeve pa e rihapur faqen.</w:t>
+            </w:r>
+          </w:p>
+        </w:tc>
+      </w:tr>
+      <w:tr>
+        <w:trPr>
+          <w:cantSplit/>
+          <w:jc w:val="center"/>
+        </w:trPr>
+        <w:tc>
+          <w:tcPr>
+            <w:tcW w:w="2664" w:type="dxa"/>
+            <w:shd w:val="clear" w:color="auto" w:fill="EAF2F5"/>
+            <w:tcMar>
+              <w:top w:w="133" w:type="dxa"/>
+              <w:left w:w="150" w:type="dxa"/>
+              <w:bottom w:w="133" w:type="dxa"/>
+              <w:right w:w="150" w:type="dxa"/>
+            </w:tcMar>
+            <w:vAlign w:val="center"/>
+          </w:tcPr>
+          <w:p>
+            <w:pPr>
+              <w:spacing w:line="283" w:lineRule="auto"/>
+            </w:pPr>
+            <w:r>
+              <w:rPr>
+                <w:b/>
+                <w:color w:val="0F9F9D"/>
+                <w:sz w:val="18"/>
+              </w:rPr>
+              <w:t>SQLite</w:t>
+            </w:r>
+          </w:p>
+        </w:tc>
+        <w:tc>
+          <w:tcPr>
+            <w:tcW w:w="6552" w:type="dxa"/>
+            <w:shd w:val="clear" w:color="auto" w:fill="EAF2F5"/>
+            <w:tcMar>
+              <w:top w:w="133" w:type="dxa"/>
+              <w:left w:w="150" w:type="dxa"/>
+              <w:bottom w:w="133" w:type="dxa"/>
+              <w:right w:w="150" w:type="dxa"/>
+            </w:tcMar>
+            <w:vAlign w:val="center"/>
+          </w:tcPr>
+          <w:p>
+            <w:pPr>
+              <w:spacing w:line="283" w:lineRule="auto"/>
+            </w:pPr>
+            <w:r>
+              <w:rPr>
+                <w:sz w:val="18"/>
+              </w:rPr>
+              <w:t>Databaza fillestare ku do të ruhen nxënësit, klasat, notat dhe mungesat gjatë zhvillimit.</w:t>
+            </w:r>
+          </w:p>
+        </w:tc>
+      </w:tr>
+      <w:tr>
+        <w:trPr>
+          <w:cantSplit/>
+          <w:jc w:val="center"/>
+        </w:trPr>
+        <w:tc>
+          <w:tcPr>
+            <w:tcW w:w="2664" w:type="dxa"/>
+            <w:shd w:val="clear" w:color="auto" w:fill="F5F8FA"/>
+            <w:tcMar>
+              <w:top w:w="133" w:type="dxa"/>
+              <w:left w:w="150" w:type="dxa"/>
+              <w:bottom w:w="133" w:type="dxa"/>
+              <w:right w:w="150" w:type="dxa"/>
+            </w:tcMar>
+            <w:vAlign w:val="center"/>
+          </w:tcPr>
+          <w:p>
+            <w:pPr>
+              <w:spacing w:line="283" w:lineRule="auto"/>
+            </w:pPr>
+            <w:r>
+              <w:rPr>
+                <w:b/>
+                <w:color w:val="0F9F9D"/>
+                <w:sz w:val="18"/>
+              </w:rPr>
+              <w:t>Chart.js</w:t>
+            </w:r>
+          </w:p>
+        </w:tc>
+        <w:tc>
+          <w:tcPr>
+            <w:tcW w:w="6552" w:type="dxa"/>
+            <w:shd w:val="clear" w:color="auto" w:fill="F5F8FA"/>
+            <w:tcMar>
+              <w:top w:w="133" w:type="dxa"/>
+              <w:left w:w="150" w:type="dxa"/>
+              <w:bottom w:w="133" w:type="dxa"/>
+              <w:right w:w="150" w:type="dxa"/>
+            </w:tcMar>
+            <w:vAlign w:val="center"/>
+          </w:tcPr>
+          <w:p>
+            <w:pPr>
+              <w:spacing w:line="283" w:lineRule="auto"/>
+            </w:pPr>
+            <w:r>
+              <w:rPr>
+                <w:sz w:val="18"/>
+              </w:rPr>
+              <w:t>Për grafikët e thjeshtë të notave dhe mungesave në panelin e drejtorit.</w:t>
+            </w:r>
+          </w:p>
+        </w:tc>
+      </w:tr>
+      <w:tr>
+        <w:trPr>
+          <w:cantSplit/>
+          <w:jc w:val="center"/>
+        </w:trPr>
+        <w:tc>
+          <w:tcPr>
+            <w:tcW w:w="2664" w:type="dxa"/>
+            <w:shd w:val="clear" w:color="auto" w:fill="EAF2F5"/>
+            <w:tcMar>
+              <w:top w:w="133" w:type="dxa"/>
+              <w:left w:w="150" w:type="dxa"/>
+              <w:bottom w:w="133" w:type="dxa"/>
+              <w:right w:w="150" w:type="dxa"/>
+            </w:tcMar>
+            <w:vAlign w:val="center"/>
+          </w:tcPr>
+          <w:p>
+            <w:pPr>
+              <w:spacing w:line="283" w:lineRule="auto"/>
+            </w:pPr>
+            <w:r>
+              <w:rPr>
+                <w:b/>
+                <w:color w:val="0F9F9D"/>
+                <w:sz w:val="18"/>
+              </w:rPr>
+              <w:t>Git dhe GitHub</w:t>
+            </w:r>
+          </w:p>
+        </w:tc>
+        <w:tc>
+          <w:tcPr>
+            <w:tcW w:w="6552" w:type="dxa"/>
+            <w:shd w:val="clear" w:color="auto" w:fill="EAF2F5"/>
+            <w:tcMar>
+              <w:top w:w="133" w:type="dxa"/>
+              <w:left w:w="150" w:type="dxa"/>
+              <w:bottom w:w="133" w:type="dxa"/>
+              <w:right w:w="150" w:type="dxa"/>
+            </w:tcMar>
+            <w:vAlign w:val="center"/>
+          </w:tcPr>
+          <w:p>
+            <w:pPr>
+              <w:spacing w:line="283" w:lineRule="auto"/>
+            </w:pPr>
+            <w:r>
+              <w:rPr>
+                <w:sz w:val="18"/>
+              </w:rPr>
+              <w:t>Për të ruajtur versionet e kodit dhe për të treguar progresin gjatë semestrit.</w:t>
+            </w:r>
+          </w:p>
+        </w:tc>
+      </w:tr>
+    </w:tbl>
+    <w:p>
+      <w:pPr>
+        <w:pStyle w:val="Heading2"/>
+        <w:spacing w:before="240" w:after="100"/>
+      </w:pPr>
+      <w:r>
+        <w:rPr>
+          <w:rFonts w:ascii="Arial" w:hAnsi="Arial"/>
+        </w:rPr>
+        <w:t>5.2  Pse kam zgjedhur aplikacion web?</w:t>
+      </w:r>
+    </w:p>
+    <w:p>
+      <w:pPr>
+        <w:spacing w:after="160" w:line="298" w:lineRule="auto"/>
+        <w:jc w:val="both"/>
+      </w:pPr>
+      <w:r>
+        <w:rPr>
+          <w:sz w:val="20"/>
+        </w:rPr>
+        <w:t>Aplikacioni web nuk kërkon instalim të veçantë te secili përdorues. Drejtori dhe mësimdhënësit mund ta përdorin nga kompjuteri, ndërsa nxënësi mund t’i kontrollojë të dhënat edhe nga telefoni. Kjo më duket zgjidhje praktike për një shkollë fillore.</w:t>
+      </w:r>
+    </w:p>
+    <w:p>
+      <w:pPr>
+        <w:spacing w:before="240" w:after="100"/>
+      </w:pPr>
+      <w:r>
+        <w:rPr>
+          <w:b/>
+          <w:color w:val="0F9F9D"/>
+          <w:sz w:val="17"/>
+        </w:rPr>
+        <w:t>ÇFARË DO TË BËJ FILLIMISHT?</w:t>
+      </w:r>
+    </w:p>
+    <w:p>
+      <w:pPr>
+        <w:spacing w:line="298" w:lineRule="auto"/>
+        <w:jc w:val="both"/>
+      </w:pPr>
+      <w:r>
+        <w:rPr>
+          <w:sz w:val="20"/>
+        </w:rPr>
+        <w:t>Fillimisht do ta zhvilloj sistemin lokalisht me Django dhe SQLite. Më vonë do të ndërtoj ndërfaqen, do të testoj funksionet kryesore dhe do ta përgatis për demonstrim. Në faqen tjetër do të paraqes mënyrën si lidhen pjesët e sistemit.</w:t>
+      </w:r>
+    </w:p>
+    <w:p>
+      <w:r>
+        <w:br w:type="page"/>
+      </w:r>
+    </w:p>
+    <w:tbl>
+      <w:tblPr>
+        <w:tblW w:w="0" w:type="auto"/>
+        <w:jc w:val="center"/>
+        <w:tblLayout w:type="fixed"/>
+        <w:tblLook w:val="04A0" w:firstRow="1" w:lastRow="0" w:firstColumn="1" w:lastColumn="0" w:noHBand="0" w:noVBand="1"/>
+      </w:tblPr>
+      <w:tblGrid>
+        <w:gridCol w:w="4677"/>
+        <w:gridCol w:w="4677"/>
+      </w:tblGrid>
+      <w:tr>
+        <w:trPr>
+          <w:jc w:val="center"/>
+        </w:trPr>
+        <w:tc>
+          <w:tcPr>
+            <w:tcW w:w="4677" w:type="dxa"/>
+          </w:tcPr>
+          <w:p>
+            <w:pPr>
+              <w:spacing w:after="60"/>
+            </w:pPr>
+            <w:r>
+              <w:rPr>
+                <w:b/>
+                <w:color w:val="0F9F9D"/>
+                <w:sz w:val="24"/>
+              </w:rPr>
+              <w:lastRenderedPageBreak/>
+              <w:t xml:space="preserve">SC  </w:t>
+            </w:r>
+            <w:r>
+              <w:rPr>
+                <w:b/>
+                <w:sz w:val="20"/>
+              </w:rPr>
+              <w:t>SCHOOL CONTROL</w:t>
+            </w:r>
+          </w:p>
+        </w:tc>
+        <w:tc>
+          <w:tcPr>
+            <w:tcW w:w="4677" w:type="dxa"/>
+          </w:tcPr>
+          <w:p>
+            <w:pPr>
+              <w:spacing w:after="60"/>
+              <w:jc w:val="right"/>
+            </w:pPr>
+            <w:r>
+              <w:rPr>
+                <w:b/>
+                <w:color w:val="56687D"/>
+                <w:sz w:val="17"/>
+              </w:rPr>
+              <w:t>RAPORTI TEKNIK 1</w:t>
+            </w:r>
+          </w:p>
+        </w:tc>
+      </w:tr>
+    </w:tbl>
+    <w:p>
+      <w:pPr>
+        <w:pBdr>
+          <w:bottom w:val="single" w:sz="17" w:space="2" w:color="0F9F9D"/>
+        </w:pBdr>
+        <w:spacing w:after="340"/>
+      </w:pPr>
+    </w:p>
+    <w:p>
+      <w:pPr>
+        <w:spacing w:after="160"/>
+      </w:pPr>
+      <w:r>
+        <w:rPr>
+          <w:b/>
+          <w:color w:val="0F9F9D"/>
+          <w:sz w:val="18"/>
+        </w:rPr>
+        <w:t>KAPITULLI 05  /  ARKITEKTURA E SISTEMIT</w:t>
+      </w:r>
+    </w:p>
+    <w:p>
+      <w:pPr>
+        <w:pStyle w:val="Heading1"/>
+        <w:spacing w:after="240" w:line="264" w:lineRule="auto"/>
+      </w:pPr>
+      <w:r>
+        <w:rPr>
+          <w:rFonts w:ascii="Arial" w:hAnsi="Arial"/>
+          <w:sz w:val="50"/>
+        </w:rPr>
+        <w:t>Arkitektura e sistemit</w:t>
+      </w:r>
+    </w:p>
+    <w:p>
+      <w:pPr>
+        <w:pBdr>
+          <w:left w:val="single" w:sz="22" w:space="11" w:color="0F9F9D"/>
+        </w:pBdr>
+        <w:spacing w:after="320" w:line="300" w:lineRule="auto"/>
+        <w:ind w:left="140"/>
+      </w:pPr>
+      <w:r>
+        <w:rPr>
+          <w:color w:val="244B6E"/>
+          <w:sz w:val="22"/>
+        </w:rPr>
+        <w:t>Për School Control kam planifikuar një arkitekturë të thjeshtë me tri pjesë: faqet që përdorim, logjikën që i përpunon veprimet dhe databazën ku ruhen informacionet.</w:t>
+      </w:r>
+    </w:p>
+    <w:p>
+      <w:pPr>
+        <w:pStyle w:val="Heading2"/>
+        <w:spacing w:before="80" w:after="100"/>
+      </w:pPr>
+      <w:r>
+        <w:rPr>
+          <w:rFonts w:ascii="Arial" w:hAnsi="Arial"/>
+        </w:rPr>
+        <w:t>5.3  Si do të lidhen pjesët e sistemit?</w:t>
+      </w:r>
+    </w:p>
+    <w:p>
+      <w:pPr>
+        <w:spacing w:after="180" w:line="298" w:lineRule="auto"/>
+        <w:jc w:val="both"/>
+      </w:pPr>
+      <w:r>
+        <w:rPr>
+          <w:sz w:val="20"/>
+        </w:rPr>
+        <w:t>Përdoruesi do ta hapë aplikacionin në shfletues. Faqja komunikon me Django, ndërsa Django lexon ose ruan të dhënat në SQLite. Diagrami më poshtë e paraqet këtë lidhje.</w:t>
+      </w:r>
+    </w:p>
+    <w:p>
+      <w:pPr>
+        <w:spacing w:before="80" w:after="140"/>
+      </w:pPr>
+      <w:r>
+        <w:rPr>
+          <w:b/>
+          <w:color w:val="0F9F9D"/>
+          <w:sz w:val="17"/>
+        </w:rPr>
+        <w:t>DIAGRAMI I ARKITEKTURËS</w:t>
+      </w:r>
+    </w:p>
+    <w:tbl>
+      <w:tblPr>
+        <w:tblW w:w="0" w:type="auto"/>
+        <w:jc w:val="center"/>
+        <w:tblBorders>
+          <w:top w:val="nil"/>
+          <w:left w:val="nil"/>
+          <w:bottom w:val="nil"/>
+          <w:right w:val="nil"/>
+          <w:insideH w:val="nil"/>
+          <w:insideV w:val="nil"/>
+        </w:tblBorders>
+        <w:tblLayout w:type="fixed"/>
+        <w:tblLook w:val="04A0" w:firstRow="1" w:lastRow="0" w:firstColumn="1" w:lastColumn="0" w:noHBand="0" w:noVBand="1"/>
+      </w:tblPr>
+      <w:tblGrid>
+        <w:gridCol w:w="9144"/>
+      </w:tblGrid>
+      <w:tr>
+        <w:trPr>
+          <w:cantSplit/>
+          <w:jc w:val="center"/>
+        </w:trPr>
+        <w:tc>
+          <w:tcPr>
+            <w:tcW w:w="9144" w:type="dxa"/>
+            <w:tcBorders>
+              <w:left w:val="single" w:sz="25" w:space="0" w:color="0F9F9D"/>
+            </w:tcBorders>
+            <w:shd w:val="clear" w:color="auto" w:fill="EAF2F5"/>
+            <w:tcMar>
+              <w:top w:w="125" w:type="dxa"/>
+              <w:left w:w="190" w:type="dxa"/>
+              <w:bottom w:w="125" w:type="dxa"/>
+              <w:right w:w="165" w:type="dxa"/>
+            </w:tcMar>
+            <w:vAlign w:val="center"/>
+          </w:tcPr>
+          <w:p>
+            <w:pPr>
+              <w:spacing w:after="40" w:line="250" w:lineRule="auto"/>
+            </w:pPr>
+            <w:r>
+              <w:rPr>
+                <w:b/>
+                <w:sz w:val="20"/>
+              </w:rPr>
+              <w:t>PËRDORUESIT</w:t>
+            </w:r>
+          </w:p>
+          <w:p>
+            <w:pPr>
+              <w:spacing w:line="269" w:lineRule="auto"/>
+            </w:pPr>
+            <w:r>
+              <w:rPr>
+                <w:color w:val="244B6E"/>
+                <w:sz w:val="18"/>
+              </w:rPr>
+              <w:t>Drejtori  ·  Mësimdhënësi  ·  Nxënësi</w:t>
+            </w:r>
+          </w:p>
+        </w:tc>
+      </w:tr>
+      <w:tr>
+        <w:trPr>
+          <w:cantSplit/>
+          <w:jc w:val="center"/>
+        </w:trPr>
+        <w:tc>
+          <w:tcPr>
+            <w:tcW w:w="9144" w:type="dxa"/>
+            <w:tcMar>
+              <w:top w:w="26" w:type="dxa"/>
+              <w:left w:w="0" w:type="dxa"/>
+              <w:bottom w:w="26" w:type="dxa"/>
+              <w:right w:w="0" w:type="dxa"/>
+            </w:tcMar>
+          </w:tcPr>
+          <w:p>
+            <w:pPr>
+              <w:spacing w:line="240" w:lineRule="auto"/>
+              <w:jc w:val="center"/>
+            </w:pPr>
+            <w:r>
+              <w:rPr>
+                <w:b/>
+                <w:color w:val="0F9F9D"/>
+                <w:sz w:val="18"/>
+              </w:rPr>
+              <w:t>↓  e hapin sistemin në shfletues</w:t>
+            </w:r>
+          </w:p>
+        </w:tc>
+      </w:tr>
+      <w:tr>
+        <w:trPr>
+          <w:cantSplit/>
+          <w:jc w:val="center"/>
+        </w:trPr>
+        <w:tc>
+          <w:tcPr>
+            <w:tcW w:w="9144" w:type="dxa"/>
+            <w:tcBorders>
+              <w:left w:val="single" w:sz="25" w:space="0" w:color="0F9F9D"/>
+            </w:tcBorders>
+            <w:shd w:val="clear" w:color="auto" w:fill="F5F8FA"/>
+            <w:tcMar>
+              <w:top w:w="125" w:type="dxa"/>
+              <w:left w:w="190" w:type="dxa"/>
+              <w:bottom w:w="125" w:type="dxa"/>
+              <w:right w:w="165" w:type="dxa"/>
+            </w:tcMar>
+            <w:vAlign w:val="center"/>
+          </w:tcPr>
+          <w:p>
+            <w:pPr>
+              <w:spacing w:after="40" w:line="250" w:lineRule="auto"/>
+            </w:pPr>
+            <w:r>
+              <w:rPr>
+                <w:b/>
+                <w:sz w:val="20"/>
+              </w:rPr>
+              <w:t>NDËRFAQJA E APLIKACIONIT</w:t>
+            </w:r>
+          </w:p>
+          <w:p>
+            <w:pPr>
+              <w:spacing w:line="269" w:lineRule="auto"/>
+            </w:pPr>
+            <w:r>
+              <w:rPr>
+                <w:color w:val="244B6E"/>
+                <w:sz w:val="18"/>
+              </w:rPr>
+              <w:t>HTML, CSS, Bootstrap, JavaScript – faqet që shohim dhe përdorim</w:t>
+            </w:r>
+          </w:p>
+        </w:tc>
+      </w:tr>
+      <w:tr>
+        <w:trPr>
+          <w:cantSplit/>
+          <w:jc w:val="center"/>
+        </w:trPr>
+        <w:tc>
+          <w:tcPr>
+            <w:tcW w:w="9144" w:type="dxa"/>
+            <w:tcMar>
+              <w:top w:w="26" w:type="dxa"/>
+              <w:left w:w="0" w:type="dxa"/>
+              <w:bottom w:w="26" w:type="dxa"/>
+              <w:right w:w="0" w:type="dxa"/>
+            </w:tcMar>
+          </w:tcPr>
+          <w:p>
+            <w:pPr>
+              <w:spacing w:line="240" w:lineRule="auto"/>
+              <w:jc w:val="center"/>
+            </w:pPr>
+            <w:r>
+              <w:rPr>
+                <w:b/>
+                <w:color w:val="0F9F9D"/>
+                <w:sz w:val="18"/>
+              </w:rPr>
+              <w:t>↕  dërgon kërkesa dhe merr përgjigje</w:t>
+            </w:r>
+          </w:p>
+        </w:tc>
+      </w:tr>
+      <w:tr>
+        <w:trPr>
+          <w:cantSplit/>
+          <w:jc w:val="center"/>
+        </w:trPr>
+        <w:tc>
+          <w:tcPr>
+            <w:tcW w:w="9144" w:type="dxa"/>
+            <w:tcBorders>
+              <w:left w:val="single" w:sz="25" w:space="0" w:color="62D0CA"/>
+            </w:tcBorders>
+            <w:shd w:val="clear" w:color="auto" w:fill="152D4B"/>
+            <w:tcMar>
+              <w:top w:w="125" w:type="dxa"/>
+              <w:left w:w="190" w:type="dxa"/>
+              <w:bottom w:w="125" w:type="dxa"/>
+              <w:right w:w="165" w:type="dxa"/>
+            </w:tcMar>
+            <w:vAlign w:val="center"/>
+          </w:tcPr>
+          <w:p>
+            <w:pPr>
+              <w:spacing w:after="40" w:line="250" w:lineRule="auto"/>
+            </w:pPr>
+            <w:r>
+              <w:rPr>
+                <w:b/>
+                <w:color w:val="FFFFFF"/>
+                <w:sz w:val="20"/>
+              </w:rPr>
+              <w:t>LOGJIKA E SISTEMIT</w:t>
+            </w:r>
+          </w:p>
+          <w:p>
+            <w:pPr>
+              <w:spacing w:line="269" w:lineRule="auto"/>
+            </w:pPr>
+            <w:r>
+              <w:rPr>
+                <w:color w:val="FFFFFF"/>
+                <w:sz w:val="18"/>
+              </w:rPr>
+              <w:t>Python + Django – kontrollon rolet dhe përpunon veprimet</w:t>
+            </w:r>
+          </w:p>
+        </w:tc>
+      </w:tr>
+      <w:tr>
+        <w:trPr>
+          <w:cantSplit/>
+          <w:jc w:val="center"/>
+        </w:trPr>
+        <w:tc>
+          <w:tcPr>
+            <w:tcW w:w="9144" w:type="dxa"/>
+            <w:tcMar>
+              <w:top w:w="26" w:type="dxa"/>
+              <w:left w:w="0" w:type="dxa"/>
+              <w:bottom w:w="26" w:type="dxa"/>
+              <w:right w:w="0" w:type="dxa"/>
+            </w:tcMar>
+          </w:tcPr>
+          <w:p>
+            <w:pPr>
+              <w:spacing w:line="240" w:lineRule="auto"/>
+              <w:jc w:val="center"/>
+            </w:pPr>
+            <w:r>
+              <w:rPr>
+                <w:b/>
+                <w:color w:val="0F9F9D"/>
+                <w:sz w:val="18"/>
+              </w:rPr>
+              <w:t>↕  lexon dhe ruan të dhënat</w:t>
+            </w:r>
+          </w:p>
+        </w:tc>
+      </w:tr>
+      <w:tr>
+        <w:trPr>
+          <w:cantSplit/>
+          <w:jc w:val="center"/>
+        </w:trPr>
+        <w:tc>
+          <w:tcPr>
+            <w:tcW w:w="9144" w:type="dxa"/>
+            <w:tcBorders>
+              <w:left w:val="single" w:sz="25" w:space="0" w:color="0F9F9D"/>
+            </w:tcBorders>
+            <w:shd w:val="clear" w:color="auto" w:fill="EAF2F5"/>
+            <w:tcMar>
+              <w:top w:w="125" w:type="dxa"/>
+              <w:left w:w="190" w:type="dxa"/>
+              <w:bottom w:w="125" w:type="dxa"/>
+              <w:right w:w="165" w:type="dxa"/>
+            </w:tcMar>
+            <w:vAlign w:val="center"/>
+          </w:tcPr>
+          <w:p>
+            <w:pPr>
+              <w:spacing w:after="40" w:line="250" w:lineRule="auto"/>
+            </w:pPr>
+            <w:r>
+              <w:rPr>
+                <w:b/>
+                <w:sz w:val="20"/>
+              </w:rPr>
+              <w:t>DATABAZA</w:t>
+            </w:r>
+          </w:p>
+          <w:p>
+            <w:pPr>
+              <w:spacing w:line="269" w:lineRule="auto"/>
+            </w:pPr>
+            <w:r>
+              <w:rPr>
+                <w:color w:val="244B6E"/>
+                <w:sz w:val="18"/>
+              </w:rPr>
+              <w:t>SQLite – nxënësit, klasat, lëndët, notat dhe mungesat</w:t>
+            </w:r>
+          </w:p>
+        </w:tc>
+      </w:tr>
+    </w:tbl>
+    <w:p>
+      <w:pPr>
+        <w:spacing w:before="120" w:after="140"/>
+        <w:jc w:val="center"/>
+      </w:pPr>
+      <w:r>
+        <w:rPr>
+          <w:color w:val="657587"/>
+          <w:sz w:val="16"/>
+        </w:rPr>
+        <w:t>Figura 1. Arkitektura e planifikuar e School Control</w:t>
+      </w:r>
+    </w:p>
+    <w:p>
+      <w:pPr>
+        <w:pStyle w:val="Heading2"/>
+        <w:spacing w:after="100"/>
+      </w:pPr>
+      <w:r>
+        <w:rPr>
+          <w:rFonts w:ascii="Arial" w:hAnsi="Arial"/>
+        </w:rPr>
+        <w:t>5.4  Shembull: regjistrimi i një note</w:t>
+      </w:r>
+    </w:p>
+    <w:p>
+      <w:pPr>
+        <w:spacing w:after="100" w:line="298" w:lineRule="auto"/>
+        <w:jc w:val="both"/>
+      </w:pPr>
+      <w:r>
+        <w:rPr>
+          <w:sz w:val="20"/>
+        </w:rPr>
+        <w:t>Kur mësimdhënësi shkruan një notë, faqja ia dërgon të dhënat Django-s. Sistemi kontrollon nëse mësimdhënësi ka të drejtë të vendosë notë për atë klasë dhe pastaj e ruan në databazë. Në fund, nota e re shfaqet në faqe.</w:t>
+      </w:r>
+    </w:p>
+    <w:p>
+      <w:pPr>
+        <w:spacing w:before="160" w:after="80"/>
+        <w:rPr>
+          <w:b/>
+          <w:color w:val="0F9F9D"/>
+          <w:sz w:val="17"/>
+        </w:rPr>
+      </w:pPr>
+    </w:p>
+    <w:p>
+      <w:pPr>
+        <w:spacing w:before="160" w:after="80"/>
+      </w:pPr>
+      <w:r>
+        <w:rPr>
+          <w:b/>
+          <w:color w:val="0F9F9D"/>
+          <w:sz w:val="17"/>
+        </w:rPr>
+        <w:t>PSE E KAM ZGJEDHUR KËTË NDARJE?</w:t>
+      </w:r>
+    </w:p>
+    <w:p>
+      <w:pPr>
+        <w:spacing w:line="298" w:lineRule="auto"/>
+        <w:jc w:val="both"/>
+      </w:pPr>
+      <w:r>
+        <w:rPr>
+          <w:sz w:val="20"/>
+        </w:rPr>
+        <w:t>Kështu mund ta punoj veçmas pamjen e aplikacionit, rregullat e tij dhe ruajtjen e të dhënave. Kjo do të më ndihmojë edhe gjatë testimit dhe rregullimit të gabimeve.</w:t>
+      </w:r>
+    </w:p>
     <w:sectPr>
       <w:footerReference w:type="default" r:id="rId9"/>
       <w:pgSz w:w="11906" w:h="16838"/>
@@ -3378,31 +4556,31 @@
       </w:rPr>
     </w:lvl>
   </w:abstractNum>
-  <w:num w:numId="1" w16cid:durableId="724179637">
+  <w:num w:numId="1" w16cid:durableId="1284312400">
     <w:abstractNumId w:val="8"/>
   </w:num>
-  <w:num w:numId="2" w16cid:durableId="1696690724">
+  <w:num w:numId="2" w16cid:durableId="1614745001">
     <w:abstractNumId w:val="6"/>
   </w:num>
-  <w:num w:numId="3" w16cid:durableId="1996755859">
+  <w:num w:numId="3" w16cid:durableId="44841561">
     <w:abstractNumId w:val="5"/>
   </w:num>
-  <w:num w:numId="4" w16cid:durableId="1130437528">
+  <w:num w:numId="4" w16cid:durableId="1620064821">
     <w:abstractNumId w:val="4"/>
   </w:num>
-  <w:num w:numId="5" w16cid:durableId="1737433402">
+  <w:num w:numId="5" w16cid:durableId="723524697">
     <w:abstractNumId w:val="7"/>
   </w:num>
-  <w:num w:numId="6" w16cid:durableId="1124496213">
+  <w:num w:numId="6" w16cid:durableId="187764537">
     <w:abstractNumId w:val="3"/>
   </w:num>
-  <w:num w:numId="7" w16cid:durableId="1219174188">
+  <w:num w:numId="7" w16cid:durableId="1189878319">
     <w:abstractNumId w:val="2"/>
   </w:num>
-  <w:num w:numId="8" w16cid:durableId="683284091">
+  <w:num w:numId="8" w16cid:durableId="493571835">
     <w:abstractNumId w:val="1"/>
   </w:num>
-  <w:num w:numId="9" w16cid:durableId="440343091">
+  <w:num w:numId="9" w16cid:durableId="22480724">
     <w:abstractNumId w:val="0"/>
   </w:num>
 </w:numbering>

</xml_diff>

<commit_message>
docs: shtova modelin fillestar te databazes
</commit_message>
<xml_diff>
--- a/docs/School_Control_Raporti_Teknik_1.docx
+++ b/docs/School_Control_Raporti_Teknik_1.docx
@@ -155,6 +155,16 @@
         </w:rPr>
         <w:t xml:space="preserve"> </w:t>
       </w:r>
+    </w:p>
+    <w:p>
+      <w:pPr>
+        <w:spacing w:after="100"/>
+        <w:rPr>
+          <w:b/>
+          <w:color w:val="0F9F9D"/>
+          <w:sz w:val="23"/>
+        </w:rPr>
+      </w:pPr>
     </w:p>
     <w:p>
       <w:pPr>
@@ -420,6 +430,16 @@
     <w:p>
       <w:pPr>
         <w:spacing w:after="140"/>
+        <w:rPr>
+          <w:b/>
+          <w:color w:val="7E8C9C"/>
+          <w:sz w:val="17"/>
+        </w:rPr>
+      </w:pPr>
+    </w:p>
+    <w:p>
+      <w:pPr>
+        <w:spacing w:after="140"/>
       </w:pPr>
       <w:r>
         <w:rPr>
@@ -555,6 +575,13 @@
           <w:sz w:val="50"/>
         </w:rPr>
         <w:t xml:space="preserve"> </w:t>
+      </w:r>
+      <w:r>
+        <w:rPr>
+          <w:rFonts w:ascii="Arial" w:hAnsi="Arial"/>
+          <w:sz w:val="50"/>
+        </w:rPr>
+        <w:t>`</w:t>
       </w:r>
       <w:r>
         <w:rPr>
@@ -973,12 +1000,8 @@
     </w:p>
     <w:p>
       <w:pPr>
-        <w:spacing w:after="100"/>
-        <w:rPr>
-          <w:b/>
-          <w:color w:val="0F9F9D"/>
-          <w:sz w:val="17"/>
-        </w:rPr>
+        <w:spacing w:after="200" w:line="305" w:lineRule="auto"/>
+        <w:jc w:val="both"/>
       </w:pPr>
     </w:p>
     <w:p>
@@ -1687,6 +1710,9 @@
       <w:pPr>
         <w:spacing w:after="80" w:line="290" w:lineRule="auto"/>
         <w:jc w:val="both"/>
+        <w:rPr>
+          <w:sz w:val="20"/>
+        </w:rPr>
       </w:pPr>
       <w:r>
         <w:rPr>
@@ -1697,12 +1723,8 @@
     </w:p>
     <w:p>
       <w:pPr>
-        <w:spacing w:before="180" w:after="100"/>
-        <w:rPr>
-          <w:b/>
-          <w:color w:val="0F9F9D"/>
-          <w:sz w:val="17"/>
-        </w:rPr>
+        <w:spacing w:after="80" w:line="290" w:lineRule="auto"/>
+        <w:jc w:val="both"/>
       </w:pPr>
     </w:p>
     <w:p>
@@ -3740,6 +3762,16 @@
     <w:p>
       <w:pPr>
         <w:spacing w:before="240" w:after="100"/>
+        <w:rPr>
+          <w:b/>
+          <w:color w:val="0F9F9D"/>
+          <w:sz w:val="17"/>
+        </w:rPr>
+      </w:pPr>
+    </w:p>
+    <w:p>
+      <w:pPr>
+        <w:spacing w:before="240" w:after="100"/>
       </w:pPr>
       <w:r>
         <w:rPr>
@@ -4285,6 +4317,821 @@
         <w:t>Kështu mund ta punoj veçmas pamjen e aplikacionit, rregullat e tij dhe ruajtjen e të dhënave. Kjo do të më ndihmojë edhe gjatë testimit dhe rregullimit të gabimeve.</w:t>
       </w:r>
     </w:p>
+    <w:p>
+      <w:r>
+        <w:br w:type="page"/>
+      </w:r>
+    </w:p>
+    <w:tbl>
+      <w:tblPr>
+        <w:tblW w:w="0" w:type="auto"/>
+        <w:jc w:val="center"/>
+        <w:tblBorders>
+          <w:top w:val="nil"/>
+          <w:left w:val="nil"/>
+          <w:bottom w:val="nil"/>
+          <w:right w:val="nil"/>
+          <w:insideH w:val="nil"/>
+          <w:insideV w:val="nil"/>
+        </w:tblBorders>
+        <w:tblLayout w:type="fixed"/>
+        <w:tblLook w:val="04A0" w:firstRow="1" w:lastRow="0" w:firstColumn="1" w:lastColumn="0" w:noHBand="0" w:noVBand="1"/>
+      </w:tblPr>
+      <w:tblGrid>
+        <w:gridCol w:w="4677"/>
+        <w:gridCol w:w="4677"/>
+      </w:tblGrid>
+      <w:tr>
+        <w:trPr>
+          <w:jc w:val="center"/>
+        </w:trPr>
+        <w:tc>
+          <w:tcPr>
+            <w:tcW w:w="4677" w:type="dxa"/>
+            <w:vAlign w:val="center"/>
+          </w:tcPr>
+          <w:p>
+            <w:pPr>
+              <w:spacing w:line="240" w:lineRule="auto"/>
+            </w:pPr>
+            <w:r>
+              <w:rPr>
+                <w:b/>
+                <w:color w:val="009E9D"/>
+                <w:sz w:val="26"/>
+              </w:rPr>
+              <w:lastRenderedPageBreak/>
+              <w:t xml:space="preserve">SC  </w:t>
+            </w:r>
+            <w:r>
+              <w:rPr>
+                <w:b/>
+                <w:color w:val="192F4F"/>
+                <w:sz w:val="22"/>
+              </w:rPr>
+              <w:t>SCHOOL CONTROL</w:t>
+            </w:r>
+          </w:p>
+        </w:tc>
+        <w:tc>
+          <w:tcPr>
+            <w:tcW w:w="4677" w:type="dxa"/>
+            <w:vAlign w:val="center"/>
+          </w:tcPr>
+          <w:p>
+            <w:pPr>
+              <w:spacing w:line="240" w:lineRule="auto"/>
+              <w:jc w:val="right"/>
+            </w:pPr>
+            <w:r>
+              <w:rPr>
+                <w:b/>
+                <w:color w:val="657C91"/>
+                <w:sz w:val="18"/>
+              </w:rPr>
+              <w:t>RAPORTI TEKNIK 1</w:t>
+            </w:r>
+          </w:p>
+        </w:tc>
+      </w:tr>
+    </w:tbl>
+    <w:p>
+      <w:pPr>
+        <w:pBdr>
+          <w:bottom w:val="single" w:sz="16" w:space="0" w:color="009E9D"/>
+        </w:pBdr>
+        <w:spacing w:after="280"/>
+      </w:pPr>
+    </w:p>
+    <w:p>
+      <w:pPr>
+        <w:spacing w:after="380" w:line="288" w:lineRule="auto"/>
+      </w:pPr>
+      <w:r>
+        <w:rPr>
+          <w:b/>
+          <w:color w:val="009E9D"/>
+          <w:sz w:val="20"/>
+        </w:rPr>
+        <w:t>KAPITULLI 06  /  MODELI I DATABAZËS</w:t>
+      </w:r>
+    </w:p>
+    <w:p>
+      <w:pPr>
+        <w:spacing w:after="260" w:line="245" w:lineRule="auto"/>
+      </w:pPr>
+      <w:r>
+        <w:rPr>
+          <w:b/>
+          <w:color w:val="192F4F"/>
+          <w:sz w:val="50"/>
+        </w:rPr>
+        <w:t>Modeli fillestar i databazës</w:t>
+      </w:r>
+    </w:p>
+    <w:p>
+      <w:pPr>
+        <w:pBdr>
+          <w:left w:val="single" w:sz="22" w:space="10" w:color="009E9D"/>
+        </w:pBdr>
+        <w:spacing w:after="280" w:line="298" w:lineRule="auto"/>
+      </w:pPr>
+      <w:r>
+        <w:rPr>
+          <w:color w:val="274967"/>
+          <w:sz w:val="22"/>
+        </w:rPr>
+        <w:t>Të dhënat e School Control planifikoj t’i ruaj në SQLite, në tabela të lidhura mes tyre. Kështu, çdo notë dhe mungesë do të lidhet me nxënësin përkatës.</w:t>
+      </w:r>
+    </w:p>
+    <w:p>
+      <w:pPr>
+        <w:spacing w:after="140" w:line="252" w:lineRule="auto"/>
+      </w:pPr>
+      <w:r>
+        <w:rPr>
+          <w:b/>
+          <w:color w:val="192F4F"/>
+          <w:sz w:val="28"/>
+        </w:rPr>
+        <w:t>6.1  Tabelat që planifikoj të krijoj</w:t>
+      </w:r>
+    </w:p>
+    <w:p>
+      <w:pPr>
+        <w:spacing w:after="140" w:line="288" w:lineRule="auto"/>
+      </w:pPr>
+      <w:r>
+        <w:rPr>
+          <w:color w:val="192F4F"/>
+        </w:rPr>
+        <w:t>Për versionin e parë kam zgjedhur këto tetë tabela:</w:t>
+      </w:r>
+    </w:p>
+    <w:p>
+      <w:pPr>
+        <w:spacing w:before="20" w:after="140" w:line="288" w:lineRule="auto"/>
+      </w:pPr>
+      <w:r>
+        <w:rPr>
+          <w:b/>
+          <w:color w:val="009E9D"/>
+          <w:sz w:val="19"/>
+        </w:rPr>
+        <w:t>TABELAT KRYESORE TË PLANIFIKUARA</w:t>
+      </w:r>
+    </w:p>
+    <w:tbl>
+      <w:tblPr>
+        <w:tblW w:w="0" w:type="auto"/>
+        <w:jc w:val="center"/>
+        <w:tblLayout w:type="fixed"/>
+        <w:tblLook w:val="04A0" w:firstRow="1" w:lastRow="0" w:firstColumn="1" w:lastColumn="0" w:noHBand="0" w:noVBand="1"/>
+      </w:tblPr>
+      <w:tblGrid>
+        <w:gridCol w:w="4677"/>
+        <w:gridCol w:w="6696"/>
+      </w:tblGrid>
+      <w:tr>
+        <w:trPr>
+          <w:trHeight w:val="475"/>
+          <w:jc w:val="center"/>
+        </w:trPr>
+        <w:tc>
+          <w:tcPr>
+            <w:tcW w:w="4677" w:type="dxa"/>
+            <w:shd w:val="clear" w:color="auto" w:fill="192F4F"/>
+          </w:tcPr>
+          <w:p>
+            <w:pPr>
+              <w:spacing w:before="20" w:after="20" w:line="240" w:lineRule="auto"/>
+            </w:pPr>
+            <w:r>
+              <w:rPr>
+                <w:b/>
+                <w:color w:val="FFFFFF"/>
+                <w:sz w:val="18"/>
+              </w:rPr>
+              <w:t>Tabela</w:t>
+            </w:r>
+          </w:p>
+        </w:tc>
+        <w:tc>
+          <w:tcPr>
+            <w:tcW w:w="4677" w:type="dxa"/>
+            <w:shd w:val="clear" w:color="auto" w:fill="192F4F"/>
+          </w:tcPr>
+          <w:p>
+            <w:pPr>
+              <w:spacing w:before="20" w:after="20" w:line="240" w:lineRule="auto"/>
+            </w:pPr>
+            <w:r>
+              <w:rPr>
+                <w:b/>
+                <w:color w:val="FFFFFF"/>
+                <w:sz w:val="18"/>
+              </w:rPr>
+              <w:t>Çfarë do të ruhet në të</w:t>
+            </w:r>
+          </w:p>
+        </w:tc>
+      </w:tr>
+      <w:tr>
+        <w:trPr>
+          <w:trHeight w:val="475"/>
+          <w:jc w:val="center"/>
+        </w:trPr>
+        <w:tc>
+          <w:tcPr>
+            <w:tcW w:w="2880" w:type="dxa"/>
+            <w:shd w:val="clear" w:color="auto" w:fill="E9F2F5"/>
+            <w:vAlign w:val="center"/>
+          </w:tcPr>
+          <w:p>
+            <w:pPr>
+              <w:spacing w:before="32" w:after="32" w:line="240" w:lineRule="auto"/>
+            </w:pPr>
+            <w:r>
+              <w:rPr>
+                <w:b/>
+                <w:color w:val="009E9D"/>
+                <w:sz w:val="18"/>
+              </w:rPr>
+              <w:t>Përdoruesi</w:t>
+            </w:r>
+          </w:p>
+        </w:tc>
+        <w:tc>
+          <w:tcPr>
+            <w:tcW w:w="6696" w:type="dxa"/>
+            <w:shd w:val="clear" w:color="auto" w:fill="E9F2F5"/>
+            <w:vAlign w:val="center"/>
+          </w:tcPr>
+          <w:p>
+            <w:pPr>
+              <w:spacing w:before="32" w:after="32" w:line="240" w:lineRule="auto"/>
+            </w:pPr>
+            <w:r>
+              <w:rPr>
+                <w:color w:val="192F4F"/>
+                <w:sz w:val="18"/>
+              </w:rPr>
+              <w:t>Emaili, fjalëkalimi i mbrojtur dhe roli në sistem.</w:t>
+            </w:r>
+          </w:p>
+        </w:tc>
+      </w:tr>
+      <w:tr>
+        <w:trPr>
+          <w:trHeight w:val="475"/>
+          <w:jc w:val="center"/>
+        </w:trPr>
+        <w:tc>
+          <w:tcPr>
+            <w:tcW w:w="2880" w:type="dxa"/>
+            <w:shd w:val="clear" w:color="auto" w:fill="F3F6F8"/>
+            <w:vAlign w:val="center"/>
+          </w:tcPr>
+          <w:p>
+            <w:pPr>
+              <w:spacing w:before="32" w:after="32" w:line="240" w:lineRule="auto"/>
+            </w:pPr>
+            <w:r>
+              <w:rPr>
+                <w:b/>
+                <w:color w:val="009E9D"/>
+                <w:sz w:val="18"/>
+              </w:rPr>
+              <w:t>Klasa</w:t>
+            </w:r>
+          </w:p>
+        </w:tc>
+        <w:tc>
+          <w:tcPr>
+            <w:tcW w:w="6696" w:type="dxa"/>
+            <w:shd w:val="clear" w:color="auto" w:fill="F3F6F8"/>
+            <w:vAlign w:val="center"/>
+          </w:tcPr>
+          <w:p>
+            <w:pPr>
+              <w:spacing w:before="32" w:after="32" w:line="240" w:lineRule="auto"/>
+            </w:pPr>
+            <w:r>
+              <w:rPr>
+                <w:color w:val="192F4F"/>
+                <w:sz w:val="18"/>
+              </w:rPr>
+              <w:t>Emri i klasës dhe mësimdhënësi kujdestar.</w:t>
+            </w:r>
+          </w:p>
+        </w:tc>
+      </w:tr>
+      <w:tr>
+        <w:trPr>
+          <w:trHeight w:val="475"/>
+          <w:jc w:val="center"/>
+        </w:trPr>
+        <w:tc>
+          <w:tcPr>
+            <w:tcW w:w="2880" w:type="dxa"/>
+            <w:shd w:val="clear" w:color="auto" w:fill="E9F2F5"/>
+            <w:vAlign w:val="center"/>
+          </w:tcPr>
+          <w:p>
+            <w:pPr>
+              <w:spacing w:before="32" w:after="32" w:line="240" w:lineRule="auto"/>
+            </w:pPr>
+            <w:r>
+              <w:rPr>
+                <w:b/>
+                <w:color w:val="009E9D"/>
+                <w:sz w:val="18"/>
+              </w:rPr>
+              <w:t>Nxënësi</w:t>
+            </w:r>
+          </w:p>
+        </w:tc>
+        <w:tc>
+          <w:tcPr>
+            <w:tcW w:w="6696" w:type="dxa"/>
+            <w:shd w:val="clear" w:color="auto" w:fill="E9F2F5"/>
+            <w:vAlign w:val="center"/>
+          </w:tcPr>
+          <w:p>
+            <w:pPr>
+              <w:spacing w:before="32" w:after="32" w:line="240" w:lineRule="auto"/>
+            </w:pPr>
+            <w:r>
+              <w:rPr>
+                <w:color w:val="192F4F"/>
+                <w:sz w:val="18"/>
+              </w:rPr>
+              <w:t>Të dhënat bazë dhe klasa ku bën pjesë.</w:t>
+            </w:r>
+          </w:p>
+        </w:tc>
+      </w:tr>
+      <w:tr>
+        <w:trPr>
+          <w:trHeight w:val="475"/>
+          <w:jc w:val="center"/>
+        </w:trPr>
+        <w:tc>
+          <w:tcPr>
+            <w:tcW w:w="2880" w:type="dxa"/>
+            <w:shd w:val="clear" w:color="auto" w:fill="F3F6F8"/>
+            <w:vAlign w:val="center"/>
+          </w:tcPr>
+          <w:p>
+            <w:pPr>
+              <w:spacing w:before="32" w:after="32" w:line="240" w:lineRule="auto"/>
+            </w:pPr>
+            <w:r>
+              <w:rPr>
+                <w:b/>
+                <w:color w:val="009E9D"/>
+                <w:sz w:val="18"/>
+              </w:rPr>
+              <w:t>Mësimdhënësi</w:t>
+            </w:r>
+          </w:p>
+        </w:tc>
+        <w:tc>
+          <w:tcPr>
+            <w:tcW w:w="6696" w:type="dxa"/>
+            <w:shd w:val="clear" w:color="auto" w:fill="F3F6F8"/>
+            <w:vAlign w:val="center"/>
+          </w:tcPr>
+          <w:p>
+            <w:pPr>
+              <w:spacing w:before="32" w:after="32" w:line="240" w:lineRule="auto"/>
+            </w:pPr>
+            <w:r>
+              <w:rPr>
+                <w:color w:val="192F4F"/>
+                <w:sz w:val="18"/>
+              </w:rPr>
+              <w:t>Të dhënat e mësimdhënësit dhe llogaria e tij.</w:t>
+            </w:r>
+          </w:p>
+        </w:tc>
+      </w:tr>
+      <w:tr>
+        <w:trPr>
+          <w:trHeight w:val="475"/>
+          <w:jc w:val="center"/>
+        </w:trPr>
+        <w:tc>
+          <w:tcPr>
+            <w:tcW w:w="2880" w:type="dxa"/>
+            <w:shd w:val="clear" w:color="auto" w:fill="E9F2F5"/>
+            <w:vAlign w:val="center"/>
+          </w:tcPr>
+          <w:p>
+            <w:pPr>
+              <w:spacing w:before="32" w:after="32" w:line="240" w:lineRule="auto"/>
+            </w:pPr>
+            <w:r>
+              <w:rPr>
+                <w:b/>
+                <w:color w:val="009E9D"/>
+                <w:sz w:val="18"/>
+              </w:rPr>
+              <w:t>Lënda</w:t>
+            </w:r>
+          </w:p>
+        </w:tc>
+        <w:tc>
+          <w:tcPr>
+            <w:tcW w:w="6696" w:type="dxa"/>
+            <w:shd w:val="clear" w:color="auto" w:fill="E9F2F5"/>
+            <w:vAlign w:val="center"/>
+          </w:tcPr>
+          <w:p>
+            <w:pPr>
+              <w:spacing w:before="32" w:after="32" w:line="240" w:lineRule="auto"/>
+            </w:pPr>
+            <w:r>
+              <w:rPr>
+                <w:color w:val="192F4F"/>
+                <w:sz w:val="18"/>
+              </w:rPr>
+              <w:t>Emri i lëndëve mësimore.</w:t>
+            </w:r>
+          </w:p>
+        </w:tc>
+      </w:tr>
+      <w:tr>
+        <w:trPr>
+          <w:trHeight w:val="475"/>
+          <w:jc w:val="center"/>
+        </w:trPr>
+        <w:tc>
+          <w:tcPr>
+            <w:tcW w:w="2880" w:type="dxa"/>
+            <w:shd w:val="clear" w:color="auto" w:fill="F3F6F8"/>
+            <w:vAlign w:val="center"/>
+          </w:tcPr>
+          <w:p>
+            <w:pPr>
+              <w:spacing w:before="32" w:after="32" w:line="240" w:lineRule="auto"/>
+            </w:pPr>
+            <w:r>
+              <w:rPr>
+                <w:b/>
+                <w:color w:val="009E9D"/>
+                <w:sz w:val="18"/>
+              </w:rPr>
+              <w:t>Angazhimi</w:t>
+            </w:r>
+          </w:p>
+        </w:tc>
+        <w:tc>
+          <w:tcPr>
+            <w:tcW w:w="6696" w:type="dxa"/>
+            <w:shd w:val="clear" w:color="auto" w:fill="F3F6F8"/>
+            <w:vAlign w:val="center"/>
+          </w:tcPr>
+          <w:p>
+            <w:pPr>
+              <w:spacing w:before="32" w:after="32" w:line="240" w:lineRule="auto"/>
+            </w:pPr>
+            <w:r>
+              <w:rPr>
+                <w:color w:val="192F4F"/>
+                <w:sz w:val="18"/>
+              </w:rPr>
+              <w:t>Cili mësimdhënës jep cilën lëndë në cilën klasë.</w:t>
+            </w:r>
+          </w:p>
+        </w:tc>
+      </w:tr>
+      <w:tr>
+        <w:trPr>
+          <w:trHeight w:val="475"/>
+          <w:jc w:val="center"/>
+        </w:trPr>
+        <w:tc>
+          <w:tcPr>
+            <w:tcW w:w="2880" w:type="dxa"/>
+            <w:shd w:val="clear" w:color="auto" w:fill="E9F2F5"/>
+            <w:vAlign w:val="center"/>
+          </w:tcPr>
+          <w:p>
+            <w:pPr>
+              <w:spacing w:before="32" w:after="32" w:line="240" w:lineRule="auto"/>
+            </w:pPr>
+            <w:r>
+              <w:rPr>
+                <w:b/>
+                <w:color w:val="009E9D"/>
+                <w:sz w:val="18"/>
+              </w:rPr>
+              <w:t>Nota</w:t>
+            </w:r>
+          </w:p>
+        </w:tc>
+        <w:tc>
+          <w:tcPr>
+            <w:tcW w:w="6696" w:type="dxa"/>
+            <w:shd w:val="clear" w:color="auto" w:fill="E9F2F5"/>
+            <w:vAlign w:val="center"/>
+          </w:tcPr>
+          <w:p>
+            <w:pPr>
+              <w:spacing w:before="32" w:after="32" w:line="240" w:lineRule="auto"/>
+            </w:pPr>
+            <w:r>
+              <w:rPr>
+                <w:color w:val="192F4F"/>
+                <w:sz w:val="18"/>
+              </w:rPr>
+              <w:t>Nxënësi, vlerësimi, data dhe angazhimi përkatës.</w:t>
+            </w:r>
+          </w:p>
+        </w:tc>
+      </w:tr>
+      <w:tr>
+        <w:trPr>
+          <w:trHeight w:val="475"/>
+          <w:jc w:val="center"/>
+        </w:trPr>
+        <w:tc>
+          <w:tcPr>
+            <w:tcW w:w="2880" w:type="dxa"/>
+            <w:shd w:val="clear" w:color="auto" w:fill="F3F6F8"/>
+            <w:vAlign w:val="center"/>
+          </w:tcPr>
+          <w:p>
+            <w:pPr>
+              <w:spacing w:before="32" w:after="32" w:line="240" w:lineRule="auto"/>
+            </w:pPr>
+            <w:r>
+              <w:rPr>
+                <w:b/>
+                <w:color w:val="009E9D"/>
+                <w:sz w:val="18"/>
+              </w:rPr>
+              <w:t>Mungesa</w:t>
+            </w:r>
+          </w:p>
+        </w:tc>
+        <w:tc>
+          <w:tcPr>
+            <w:tcW w:w="6696" w:type="dxa"/>
+            <w:shd w:val="clear" w:color="auto" w:fill="F3F6F8"/>
+            <w:vAlign w:val="center"/>
+          </w:tcPr>
+          <w:p>
+            <w:pPr>
+              <w:spacing w:before="32" w:after="32" w:line="240" w:lineRule="auto"/>
+            </w:pPr>
+            <w:r>
+              <w:rPr>
+                <w:color w:val="192F4F"/>
+                <w:sz w:val="18"/>
+              </w:rPr>
+              <w:t>Nxënësi, data, arsyetimi dhe angazhimi përkatës.</w:t>
+            </w:r>
+          </w:p>
+        </w:tc>
+      </w:tr>
+    </w:tbl>
+    <w:p>
+      <w:pPr>
+        <w:spacing w:before="120" w:after="140" w:line="240" w:lineRule="auto"/>
+        <w:jc w:val="center"/>
+      </w:pPr>
+      <w:r>
+        <w:rPr>
+          <w:color w:val="657C91"/>
+          <w:sz w:val="17"/>
+        </w:rPr>
+        <w:t>Tabela 1. Tabelat kryesore të planifikuara për School Control</w:t>
+      </w:r>
+    </w:p>
+    <w:p>
+      <w:pPr>
+        <w:spacing w:before="100" w:after="100" w:line="252" w:lineRule="auto"/>
+        <w:rPr>
+          <w:b/>
+          <w:color w:val="192F4F"/>
+          <w:sz w:val="28"/>
+        </w:rPr>
+      </w:pPr>
+    </w:p>
+    <w:p>
+      <w:pPr>
+        <w:spacing w:before="100" w:after="100" w:line="252" w:lineRule="auto"/>
+      </w:pPr>
+      <w:r>
+        <w:rPr>
+          <w:b/>
+          <w:color w:val="192F4F"/>
+          <w:sz w:val="28"/>
+        </w:rPr>
+        <w:t>6.2  Si do të lidhen tabelat?</w:t>
+      </w:r>
+    </w:p>
+    <w:p>
+      <w:pPr>
+        <w:spacing w:after="140" w:line="288" w:lineRule="auto"/>
+      </w:pPr>
+      <w:r>
+        <w:rPr>
+          <w:color w:val="192F4F"/>
+        </w:rPr>
+        <w:t>Një klasë ka shumë nxënës. Notat dhe mungesat lidhen me nxënësin dhe lëndën që e zhvillon.</w:t>
+      </w:r>
+    </w:p>
+    <w:tbl>
+      <w:tblPr>
+        <w:tblW w:w="0" w:type="auto"/>
+        <w:jc w:val="center"/>
+        <w:tblLayout w:type="fixed"/>
+        <w:tblLook w:val="04A0" w:firstRow="1" w:lastRow="0" w:firstColumn="1" w:lastColumn="0" w:noHBand="0" w:noVBand="1"/>
+      </w:tblPr>
+      <w:tblGrid>
+        <w:gridCol w:w="2880"/>
+        <w:gridCol w:w="6696"/>
+      </w:tblGrid>
+      <w:tr>
+        <w:trPr>
+          <w:trHeight w:val="418"/>
+          <w:jc w:val="center"/>
+        </w:trPr>
+        <w:tc>
+          <w:tcPr>
+            <w:tcW w:w="2880" w:type="dxa"/>
+            <w:shd w:val="clear" w:color="auto" w:fill="E9F2F5"/>
+          </w:tcPr>
+          <w:p>
+            <w:pPr>
+              <w:spacing w:before="32" w:after="32" w:line="240" w:lineRule="auto"/>
+            </w:pPr>
+            <w:r>
+              <w:rPr>
+                <w:b/>
+                <w:color w:val="009E9D"/>
+                <w:sz w:val="17"/>
+              </w:rPr>
+              <w:t>KLASA (1)</w:t>
+            </w:r>
+          </w:p>
+        </w:tc>
+        <w:tc>
+          <w:tcPr>
+            <w:tcW w:w="6696" w:type="dxa"/>
+            <w:shd w:val="clear" w:color="auto" w:fill="E9F2F5"/>
+          </w:tcPr>
+          <w:p>
+            <w:pPr>
+              <w:spacing w:before="32" w:after="32" w:line="240" w:lineRule="auto"/>
+            </w:pPr>
+            <w:r>
+              <w:rPr>
+                <w:color w:val="192F4F"/>
+                <w:sz w:val="17"/>
+              </w:rPr>
+              <w:t>→  SHUMË NXËNËS</w:t>
+            </w:r>
+          </w:p>
+        </w:tc>
+      </w:tr>
+      <w:tr>
+        <w:trPr>
+          <w:trHeight w:val="418"/>
+          <w:jc w:val="center"/>
+        </w:trPr>
+        <w:tc>
+          <w:tcPr>
+            <w:tcW w:w="2880" w:type="dxa"/>
+            <w:shd w:val="clear" w:color="auto" w:fill="F3F6F8"/>
+          </w:tcPr>
+          <w:p>
+            <w:pPr>
+              <w:spacing w:before="32" w:after="32" w:line="240" w:lineRule="auto"/>
+            </w:pPr>
+            <w:r>
+              <w:rPr>
+                <w:b/>
+                <w:color w:val="009E9D"/>
+                <w:sz w:val="17"/>
+              </w:rPr>
+              <w:t>ANGAZHIMI</w:t>
+            </w:r>
+          </w:p>
+        </w:tc>
+        <w:tc>
+          <w:tcPr>
+            <w:tcW w:w="6696" w:type="dxa"/>
+            <w:shd w:val="clear" w:color="auto" w:fill="F3F6F8"/>
+          </w:tcPr>
+          <w:p>
+            <w:pPr>
+              <w:spacing w:before="32" w:after="32" w:line="240" w:lineRule="auto"/>
+            </w:pPr>
+            <w:r>
+              <w:rPr>
+                <w:color w:val="192F4F"/>
+                <w:sz w:val="17"/>
+              </w:rPr>
+              <w:t>→  MËSIMDHËNËS + KLASA + LËNDA</w:t>
+            </w:r>
+          </w:p>
+        </w:tc>
+      </w:tr>
+      <w:tr>
+        <w:trPr>
+          <w:trHeight w:val="418"/>
+          <w:jc w:val="center"/>
+        </w:trPr>
+        <w:tc>
+          <w:tcPr>
+            <w:tcW w:w="2880" w:type="dxa"/>
+            <w:shd w:val="clear" w:color="auto" w:fill="E9F2F5"/>
+          </w:tcPr>
+          <w:p>
+            <w:pPr>
+              <w:spacing w:before="32" w:after="32" w:line="240" w:lineRule="auto"/>
+            </w:pPr>
+            <w:r>
+              <w:rPr>
+                <w:b/>
+                <w:color w:val="009E9D"/>
+                <w:sz w:val="17"/>
+              </w:rPr>
+              <w:t>NXËNËSI + ANGAZHIMI</w:t>
+            </w:r>
+          </w:p>
+        </w:tc>
+        <w:tc>
+          <w:tcPr>
+            <w:tcW w:w="6696" w:type="dxa"/>
+            <w:shd w:val="clear" w:color="auto" w:fill="E9F2F5"/>
+          </w:tcPr>
+          <w:p>
+            <w:pPr>
+              <w:spacing w:before="32" w:after="32" w:line="240" w:lineRule="auto"/>
+            </w:pPr>
+            <w:r>
+              <w:rPr>
+                <w:color w:val="192F4F"/>
+                <w:sz w:val="17"/>
+              </w:rPr>
+              <w:t>→  NOTA / MUNGESA</w:t>
+            </w:r>
+          </w:p>
+        </w:tc>
+      </w:tr>
+    </w:tbl>
+    <w:p>
+      <w:pPr>
+        <w:spacing w:before="120" w:after="160" w:line="240" w:lineRule="auto"/>
+        <w:jc w:val="center"/>
+      </w:pPr>
+      <w:r>
+        <w:rPr>
+          <w:color w:val="657C91"/>
+          <w:sz w:val="17"/>
+        </w:rPr>
+        <w:t>Figura 2. Lidhjet fillestare të të dhënave</w:t>
+      </w:r>
+    </w:p>
+    <w:p>
+      <w:pPr>
+        <w:spacing w:after="100" w:line="288" w:lineRule="auto"/>
+        <w:rPr>
+          <w:b/>
+          <w:color w:val="009E9D"/>
+          <w:sz w:val="19"/>
+        </w:rPr>
+      </w:pPr>
+    </w:p>
+    <w:p>
+      <w:pPr>
+        <w:spacing w:after="100" w:line="288" w:lineRule="auto"/>
+      </w:pPr>
+      <w:r>
+        <w:rPr>
+          <w:b/>
+          <w:color w:val="009E9D"/>
+          <w:sz w:val="19"/>
+        </w:rPr>
+        <w:t>ÇFARË JANË PK DHE FK?</w:t>
+      </w:r>
+    </w:p>
+    <w:p>
+      <w:pPr>
+        <w:spacing w:line="298" w:lineRule="auto"/>
+      </w:pPr>
+      <w:r>
+        <w:rPr>
+          <w:color w:val="192F4F"/>
+        </w:rPr>
+        <w:t>PK është identifikuesi unik i një regjistrimi, ndërsa FK lidh dy tabela. Për shembull, fusha klasa_id te Nxënësi tregon në cilën klasë është regjistruar ai.</w:t>
+      </w:r>
+    </w:p>
     <w:sectPr>
       <w:footerReference w:type="default" r:id="rId9"/>
       <w:pgSz w:w="11906" w:h="16838"/>
@@ -4556,31 +5403,31 @@
       </w:rPr>
     </w:lvl>
   </w:abstractNum>
-  <w:num w:numId="1" w16cid:durableId="1284312400">
+  <w:num w:numId="1" w16cid:durableId="187452067">
     <w:abstractNumId w:val="8"/>
   </w:num>
-  <w:num w:numId="2" w16cid:durableId="1614745001">
+  <w:num w:numId="2" w16cid:durableId="1818763935">
     <w:abstractNumId w:val="6"/>
   </w:num>
-  <w:num w:numId="3" w16cid:durableId="44841561">
+  <w:num w:numId="3" w16cid:durableId="148788045">
     <w:abstractNumId w:val="5"/>
   </w:num>
-  <w:num w:numId="4" w16cid:durableId="1620064821">
+  <w:num w:numId="4" w16cid:durableId="245267953">
     <w:abstractNumId w:val="4"/>
   </w:num>
-  <w:num w:numId="5" w16cid:durableId="723524697">
+  <w:num w:numId="5" w16cid:durableId="1659459397">
     <w:abstractNumId w:val="7"/>
   </w:num>
-  <w:num w:numId="6" w16cid:durableId="187764537">
+  <w:num w:numId="6" w16cid:durableId="1160733404">
     <w:abstractNumId w:val="3"/>
   </w:num>
-  <w:num w:numId="7" w16cid:durableId="1189878319">
+  <w:num w:numId="7" w16cid:durableId="1126118101">
     <w:abstractNumId w:val="2"/>
   </w:num>
-  <w:num w:numId="8" w16cid:durableId="493571835">
+  <w:num w:numId="8" w16cid:durableId="721905089">
     <w:abstractNumId w:val="1"/>
   </w:num>
-  <w:num w:numId="9" w16cid:durableId="22480724">
+  <w:num w:numId="9" w16cid:durableId="1298682411">
     <w:abstractNumId w:val="0"/>
   </w:num>
 </w:numbering>

</xml_diff>

<commit_message>
docs: perfundova Raportin Teknik 1 me 10 faqe
</commit_message>
<xml_diff>
--- a/docs/School_Control_Raporti_Teknik_1.docx
+++ b/docs/School_Control_Raporti_Teknik_1.docx
@@ -581,13 +581,6 @@
           <w:rFonts w:ascii="Arial" w:hAnsi="Arial"/>
           <w:sz w:val="50"/>
         </w:rPr>
-        <w:t>`</w:t>
-      </w:r>
-      <w:r>
-        <w:rPr>
-          <w:rFonts w:ascii="Arial" w:hAnsi="Arial"/>
-          <w:sz w:val="50"/>
-        </w:rPr>
         <w:t>i problemit</w:t>
       </w:r>
     </w:p>
@@ -895,7 +888,14 @@
           <w:rFonts w:ascii="Arial" w:hAnsi="Arial"/>
           <w:sz w:val="50"/>
         </w:rPr>
-        <w:t>e sistemit</w:t>
+        <w:t>e</w:t>
+      </w:r>
+      <w:r>
+        <w:rPr>
+          <w:rFonts w:ascii="Arial" w:hAnsi="Arial"/>
+          <w:sz w:val="50"/>
+        </w:rPr>
+        <w:t xml:space="preserve"> sistemit</w:t>
       </w:r>
     </w:p>
     <w:p>
@@ -1000,8 +1000,12 @@
     </w:p>
     <w:p>
       <w:pPr>
-        <w:spacing w:after="200" w:line="305" w:lineRule="auto"/>
-        <w:jc w:val="both"/>
+        <w:spacing w:after="100"/>
+        <w:rPr>
+          <w:b/>
+          <w:color w:val="0F9F9D"/>
+          <w:sz w:val="17"/>
+        </w:rPr>
       </w:pPr>
     </w:p>
     <w:p>
@@ -1407,11 +1411,6 @@
         </w:tc>
       </w:tr>
     </w:tbl>
-    <w:p>
-      <w:pPr>
-        <w:spacing w:before="100" w:after="120"/>
-      </w:pPr>
-    </w:p>
     <w:p>
       <w:r>
         <w:br w:type="page"/>
@@ -3739,6 +3738,15 @@
       <w:pPr>
         <w:pStyle w:val="Heading2"/>
         <w:spacing w:before="240" w:after="100"/>
+        <w:rPr>
+          <w:rFonts w:ascii="Arial" w:hAnsi="Arial"/>
+        </w:rPr>
+      </w:pPr>
+    </w:p>
+    <w:p>
+      <w:pPr>
+        <w:pStyle w:val="Heading2"/>
+        <w:spacing w:before="240" w:after="100"/>
       </w:pPr>
       <w:r>
         <w:rPr>
@@ -3758,16 +3766,6 @@
         </w:rPr>
         <w:t>Aplikacioni web nuk kërkon instalim të veçantë te secili përdorues. Drejtori dhe mësimdhënësit mund ta përdorin nga kompjuteri, ndërsa nxënësi mund t’i kontrollojë të dhënat edhe nga telefoni. Kjo më duket zgjidhje praktike për një shkollë fillore.</w:t>
       </w:r>
-    </w:p>
-    <w:p>
-      <w:pPr>
-        <w:spacing w:before="240" w:after="100"/>
-        <w:rPr>
-          <w:b/>
-          <w:color w:val="0F9F9D"/>
-          <w:sz w:val="17"/>
-        </w:rPr>
-      </w:pPr>
     </w:p>
     <w:p>
       <w:pPr>
@@ -4281,16 +4279,6 @@
         </w:rPr>
         <w:t>Kur mësimdhënësi shkruan një notë, faqja ia dërgon të dhënat Django-s. Sistemi kontrollon nëse mësimdhënësi ka të drejtë të vendosë notë për atë klasë dhe pastaj e ruan në databazë. Në fund, nota e re shfaqet në faqe.</w:t>
       </w:r>
-    </w:p>
-    <w:p>
-      <w:pPr>
-        <w:spacing w:before="160" w:after="80"/>
-        <w:rPr>
-          <w:b/>
-          <w:color w:val="0F9F9D"/>
-          <w:sz w:val="17"/>
-        </w:rPr>
-      </w:pPr>
     </w:p>
     <w:p>
       <w:pPr>
@@ -4913,16 +4901,6 @@
     <w:p>
       <w:pPr>
         <w:spacing w:before="100" w:after="100" w:line="252" w:lineRule="auto"/>
-        <w:rPr>
-          <w:b/>
-          <w:color w:val="192F4F"/>
-          <w:sz w:val="28"/>
-        </w:rPr>
-      </w:pPr>
-    </w:p>
-    <w:p>
-      <w:pPr>
-        <w:spacing w:before="100" w:after="100" w:line="252" w:lineRule="auto"/>
       </w:pPr>
       <w:r>
         <w:rPr>
@@ -5101,16 +5079,6 @@
     <w:p>
       <w:pPr>
         <w:spacing w:after="100" w:line="288" w:lineRule="auto"/>
-        <w:rPr>
-          <w:b/>
-          <w:color w:val="009E9D"/>
-          <w:sz w:val="19"/>
-        </w:rPr>
-      </w:pPr>
-    </w:p>
-    <w:p>
-      <w:pPr>
-        <w:spacing w:after="100" w:line="288" w:lineRule="auto"/>
       </w:pPr>
       <w:r>
         <w:rPr>
@@ -5130,6 +5098,1238 @@
           <w:color w:val="192F4F"/>
         </w:rPr>
         <w:t>PK është identifikuesi unik i një regjistrimi, ndërsa FK lidh dy tabela. Për shembull, fusha klasa_id te Nxënësi tregon në cilën klasë është regjistruar ai.</w:t>
+      </w:r>
+    </w:p>
+    <w:p>
+      <w:r>
+        <w:br w:type="page"/>
+      </w:r>
+    </w:p>
+    <w:tbl>
+      <w:tblPr>
+        <w:tblW w:w="0" w:type="auto"/>
+        <w:jc w:val="center"/>
+        <w:tblBorders>
+          <w:top w:val="nil"/>
+          <w:left w:val="nil"/>
+          <w:bottom w:val="nil"/>
+          <w:right w:val="nil"/>
+          <w:insideH w:val="nil"/>
+          <w:insideV w:val="nil"/>
+        </w:tblBorders>
+        <w:tblLayout w:type="fixed"/>
+        <w:tblLook w:val="04A0" w:firstRow="1" w:lastRow="0" w:firstColumn="1" w:lastColumn="0" w:noHBand="0" w:noVBand="1"/>
+      </w:tblPr>
+      <w:tblGrid>
+        <w:gridCol w:w="4677"/>
+        <w:gridCol w:w="4677"/>
+      </w:tblGrid>
+      <w:tr>
+        <w:trPr>
+          <w:jc w:val="center"/>
+        </w:trPr>
+        <w:tc>
+          <w:tcPr>
+            <w:tcW w:w="4677" w:type="dxa"/>
+            <w:vAlign w:val="center"/>
+          </w:tcPr>
+          <w:p>
+            <w:pPr>
+              <w:spacing w:line="240" w:lineRule="auto"/>
+            </w:pPr>
+            <w:r>
+              <w:rPr>
+                <w:b/>
+                <w:color w:val="009E9D"/>
+                <w:sz w:val="26"/>
+              </w:rPr>
+              <w:lastRenderedPageBreak/>
+              <w:t xml:space="preserve">SC  </w:t>
+            </w:r>
+            <w:r>
+              <w:rPr>
+                <w:b/>
+                <w:color w:val="192F4F"/>
+                <w:sz w:val="22"/>
+              </w:rPr>
+              <w:t>SCHOOL CONTROL</w:t>
+            </w:r>
+          </w:p>
+        </w:tc>
+        <w:tc>
+          <w:tcPr>
+            <w:tcW w:w="4677" w:type="dxa"/>
+            <w:vAlign w:val="center"/>
+          </w:tcPr>
+          <w:p>
+            <w:pPr>
+              <w:spacing w:line="240" w:lineRule="auto"/>
+              <w:jc w:val="right"/>
+            </w:pPr>
+            <w:r>
+              <w:rPr>
+                <w:b/>
+                <w:color w:val="657C91"/>
+                <w:sz w:val="18"/>
+              </w:rPr>
+              <w:t>RAPORTI TEKNIK 1</w:t>
+            </w:r>
+          </w:p>
+        </w:tc>
+      </w:tr>
+    </w:tbl>
+    <w:p>
+      <w:pPr>
+        <w:pBdr>
+          <w:bottom w:val="single" w:sz="16" w:space="0" w:color="009E9D"/>
+        </w:pBdr>
+        <w:spacing w:after="280"/>
+      </w:pPr>
+    </w:p>
+    <w:p>
+      <w:pPr>
+        <w:spacing w:after="240" w:line="288" w:lineRule="auto"/>
+      </w:pPr>
+      <w:r>
+        <w:rPr>
+          <w:b/>
+          <w:color w:val="009E9D"/>
+          <w:sz w:val="20"/>
+        </w:rPr>
+        <w:t>KAPITULLI 06  /  MODELI I DATABAZËS</w:t>
+      </w:r>
+    </w:p>
+    <w:p>
+      <w:pPr>
+        <w:spacing w:after="300" w:line="245" w:lineRule="auto"/>
+      </w:pPr>
+      <w:r>
+        <w:rPr>
+          <w:b/>
+          <w:color w:val="192F4F"/>
+          <w:sz w:val="50"/>
+        </w:rPr>
+        <w:t>Çelësat dhe lidhjet e databazës</w:t>
+      </w:r>
+    </w:p>
+    <w:p>
+      <w:pPr>
+        <w:pBdr>
+          <w:left w:val="single" w:sz="22" w:space="10" w:color="009E9D"/>
+        </w:pBdr>
+        <w:spacing w:after="280" w:line="298" w:lineRule="auto"/>
+      </w:pPr>
+      <w:r>
+        <w:rPr>
+          <w:color w:val="274967"/>
+          <w:sz w:val="22"/>
+        </w:rPr>
+        <w:t>Pas përcaktimit të tabelave, kam zgjedhur edhe mënyrën si do të lidhen të dhënat. Ky është modeli fillestar, të cilin do ta kontrolloj gjatë krijimit të databazës.</w:t>
+      </w:r>
+    </w:p>
+    <w:p>
+      <w:pPr>
+        <w:spacing w:after="140" w:line="252" w:lineRule="auto"/>
+      </w:pPr>
+      <w:r>
+        <w:rPr>
+          <w:b/>
+          <w:color w:val="192F4F"/>
+          <w:sz w:val="28"/>
+        </w:rPr>
+        <w:t>6.3  Çelësat primarë dhe të huaj</w:t>
+      </w:r>
+    </w:p>
+    <w:p>
+      <w:pPr>
+        <w:spacing w:after="160" w:line="288" w:lineRule="auto"/>
+      </w:pPr>
+      <w:r>
+        <w:rPr>
+          <w:color w:val="192F4F"/>
+        </w:rPr>
+        <w:t>Çdo tabelë do të ketë një identifikues unik id (PK). Fushat me prapashtesën _id do të përdoren për lidhjet me tabelat e tjera (FK).</w:t>
+      </w:r>
+    </w:p>
+    <w:p>
+      <w:pPr>
+        <w:spacing w:before="20" w:after="140" w:line="288" w:lineRule="auto"/>
+      </w:pPr>
+      <w:r>
+        <w:rPr>
+          <w:b/>
+          <w:color w:val="009E9D"/>
+          <w:sz w:val="19"/>
+        </w:rPr>
+        <w:t>ÇELËSAT E PLANIFIKUAR PËR SECILËN TABELË</w:t>
+      </w:r>
+    </w:p>
+    <w:tbl>
+      <w:tblPr>
+        <w:tblW w:w="0" w:type="auto"/>
+        <w:jc w:val="center"/>
+        <w:tblLayout w:type="fixed"/>
+        <w:tblLook w:val="04A0" w:firstRow="1" w:lastRow="0" w:firstColumn="1" w:lastColumn="0" w:noHBand="0" w:noVBand="1"/>
+      </w:tblPr>
+      <w:tblGrid>
+        <w:gridCol w:w="4677"/>
+        <w:gridCol w:w="6696"/>
+      </w:tblGrid>
+      <w:tr>
+        <w:trPr>
+          <w:trHeight w:val="475"/>
+          <w:jc w:val="center"/>
+        </w:trPr>
+        <w:tc>
+          <w:tcPr>
+            <w:tcW w:w="4677" w:type="dxa"/>
+            <w:shd w:val="clear" w:color="auto" w:fill="192F4F"/>
+          </w:tcPr>
+          <w:p>
+            <w:pPr>
+              <w:spacing w:before="20" w:after="20" w:line="240" w:lineRule="auto"/>
+            </w:pPr>
+            <w:r>
+              <w:rPr>
+                <w:b/>
+                <w:color w:val="FFFFFF"/>
+                <w:sz w:val="18"/>
+              </w:rPr>
+              <w:t>Tabela</w:t>
+            </w:r>
+          </w:p>
+        </w:tc>
+        <w:tc>
+          <w:tcPr>
+            <w:tcW w:w="4677" w:type="dxa"/>
+            <w:shd w:val="clear" w:color="auto" w:fill="192F4F"/>
+          </w:tcPr>
+          <w:p>
+            <w:pPr>
+              <w:spacing w:before="20" w:after="20" w:line="240" w:lineRule="auto"/>
+            </w:pPr>
+            <w:r>
+              <w:rPr>
+                <w:b/>
+                <w:color w:val="FFFFFF"/>
+                <w:sz w:val="17"/>
+              </w:rPr>
+              <w:t>PK dhe lidhjet kryesore (FK)</w:t>
+            </w:r>
+          </w:p>
+        </w:tc>
+      </w:tr>
+      <w:tr>
+        <w:trPr>
+          <w:trHeight w:val="475"/>
+          <w:jc w:val="center"/>
+        </w:trPr>
+        <w:tc>
+          <w:tcPr>
+            <w:tcW w:w="2880" w:type="dxa"/>
+            <w:shd w:val="clear" w:color="auto" w:fill="E9F2F5"/>
+            <w:vAlign w:val="center"/>
+          </w:tcPr>
+          <w:p>
+            <w:pPr>
+              <w:spacing w:before="32" w:after="32" w:line="240" w:lineRule="auto"/>
+            </w:pPr>
+            <w:r>
+              <w:rPr>
+                <w:b/>
+                <w:color w:val="009E9D"/>
+                <w:sz w:val="18"/>
+              </w:rPr>
+              <w:t>Përdoruesi</w:t>
+            </w:r>
+          </w:p>
+        </w:tc>
+        <w:tc>
+          <w:tcPr>
+            <w:tcW w:w="6696" w:type="dxa"/>
+            <w:shd w:val="clear" w:color="auto" w:fill="E9F2F5"/>
+            <w:vAlign w:val="center"/>
+          </w:tcPr>
+          <w:p>
+            <w:pPr>
+              <w:spacing w:before="32" w:after="32" w:line="240" w:lineRule="auto"/>
+            </w:pPr>
+            <w:r>
+              <w:rPr>
+                <w:color w:val="192F4F"/>
+                <w:sz w:val="17"/>
+              </w:rPr>
+              <w:t>PK: id  |  Nuk ka FK.</w:t>
+            </w:r>
+          </w:p>
+        </w:tc>
+      </w:tr>
+      <w:tr>
+        <w:trPr>
+          <w:trHeight w:val="475"/>
+          <w:jc w:val="center"/>
+        </w:trPr>
+        <w:tc>
+          <w:tcPr>
+            <w:tcW w:w="2880" w:type="dxa"/>
+            <w:shd w:val="clear" w:color="auto" w:fill="F3F6F8"/>
+            <w:vAlign w:val="center"/>
+          </w:tcPr>
+          <w:p>
+            <w:pPr>
+              <w:spacing w:before="32" w:after="32" w:line="240" w:lineRule="auto"/>
+            </w:pPr>
+            <w:r>
+              <w:rPr>
+                <w:b/>
+                <w:color w:val="009E9D"/>
+                <w:sz w:val="18"/>
+              </w:rPr>
+              <w:t>Klasa</w:t>
+            </w:r>
+          </w:p>
+        </w:tc>
+        <w:tc>
+          <w:tcPr>
+            <w:tcW w:w="6696" w:type="dxa"/>
+            <w:shd w:val="clear" w:color="auto" w:fill="F3F6F8"/>
+            <w:vAlign w:val="center"/>
+          </w:tcPr>
+          <w:p>
+            <w:pPr>
+              <w:spacing w:before="32" w:after="32" w:line="240" w:lineRule="auto"/>
+            </w:pPr>
+            <w:r>
+              <w:rPr>
+                <w:color w:val="192F4F"/>
+                <w:sz w:val="17"/>
+              </w:rPr>
+              <w:t>PK: id  |  FK: kujdestari_id → Mësimdhënësi.</w:t>
+            </w:r>
+          </w:p>
+        </w:tc>
+      </w:tr>
+      <w:tr>
+        <w:trPr>
+          <w:trHeight w:val="475"/>
+          <w:jc w:val="center"/>
+        </w:trPr>
+        <w:tc>
+          <w:tcPr>
+            <w:tcW w:w="2880" w:type="dxa"/>
+            <w:shd w:val="clear" w:color="auto" w:fill="E9F2F5"/>
+            <w:vAlign w:val="center"/>
+          </w:tcPr>
+          <w:p>
+            <w:pPr>
+              <w:spacing w:before="32" w:after="32" w:line="240" w:lineRule="auto"/>
+            </w:pPr>
+            <w:r>
+              <w:rPr>
+                <w:b/>
+                <w:color w:val="009E9D"/>
+                <w:sz w:val="18"/>
+              </w:rPr>
+              <w:t>Nxënësi</w:t>
+            </w:r>
+          </w:p>
+        </w:tc>
+        <w:tc>
+          <w:tcPr>
+            <w:tcW w:w="6696" w:type="dxa"/>
+            <w:shd w:val="clear" w:color="auto" w:fill="E9F2F5"/>
+            <w:vAlign w:val="center"/>
+          </w:tcPr>
+          <w:p>
+            <w:pPr>
+              <w:spacing w:before="32" w:after="32" w:line="240" w:lineRule="auto"/>
+            </w:pPr>
+            <w:r>
+              <w:rPr>
+                <w:color w:val="192F4F"/>
+                <w:sz w:val="17"/>
+              </w:rPr>
+              <w:t>PK: id  |  FK: klasa_id → Klasa; perdoruesi_id → Përdoruesi.</w:t>
+            </w:r>
+          </w:p>
+        </w:tc>
+      </w:tr>
+      <w:tr>
+        <w:trPr>
+          <w:trHeight w:val="475"/>
+          <w:jc w:val="center"/>
+        </w:trPr>
+        <w:tc>
+          <w:tcPr>
+            <w:tcW w:w="2880" w:type="dxa"/>
+            <w:shd w:val="clear" w:color="auto" w:fill="F3F6F8"/>
+            <w:vAlign w:val="center"/>
+          </w:tcPr>
+          <w:p>
+            <w:pPr>
+              <w:spacing w:before="32" w:after="32" w:line="240" w:lineRule="auto"/>
+            </w:pPr>
+            <w:r>
+              <w:rPr>
+                <w:b/>
+                <w:color w:val="009E9D"/>
+                <w:sz w:val="18"/>
+              </w:rPr>
+              <w:t>Mësimdhënësi</w:t>
+            </w:r>
+          </w:p>
+        </w:tc>
+        <w:tc>
+          <w:tcPr>
+            <w:tcW w:w="6696" w:type="dxa"/>
+            <w:shd w:val="clear" w:color="auto" w:fill="F3F6F8"/>
+            <w:vAlign w:val="center"/>
+          </w:tcPr>
+          <w:p>
+            <w:pPr>
+              <w:spacing w:before="32" w:after="32" w:line="240" w:lineRule="auto"/>
+            </w:pPr>
+            <w:r>
+              <w:rPr>
+                <w:color w:val="192F4F"/>
+                <w:sz w:val="17"/>
+              </w:rPr>
+              <w:t>PK: id  |  FK: perdoruesi_id → Përdoruesi.</w:t>
+            </w:r>
+          </w:p>
+        </w:tc>
+      </w:tr>
+      <w:tr>
+        <w:trPr>
+          <w:trHeight w:val="475"/>
+          <w:jc w:val="center"/>
+        </w:trPr>
+        <w:tc>
+          <w:tcPr>
+            <w:tcW w:w="2880" w:type="dxa"/>
+            <w:shd w:val="clear" w:color="auto" w:fill="E9F2F5"/>
+            <w:vAlign w:val="center"/>
+          </w:tcPr>
+          <w:p>
+            <w:pPr>
+              <w:spacing w:before="32" w:after="32" w:line="240" w:lineRule="auto"/>
+            </w:pPr>
+            <w:r>
+              <w:rPr>
+                <w:b/>
+                <w:color w:val="009E9D"/>
+                <w:sz w:val="18"/>
+              </w:rPr>
+              <w:t>Lënda</w:t>
+            </w:r>
+          </w:p>
+        </w:tc>
+        <w:tc>
+          <w:tcPr>
+            <w:tcW w:w="6696" w:type="dxa"/>
+            <w:shd w:val="clear" w:color="auto" w:fill="E9F2F5"/>
+            <w:vAlign w:val="center"/>
+          </w:tcPr>
+          <w:p>
+            <w:pPr>
+              <w:spacing w:before="32" w:after="32" w:line="240" w:lineRule="auto"/>
+            </w:pPr>
+            <w:r>
+              <w:rPr>
+                <w:color w:val="192F4F"/>
+                <w:sz w:val="17"/>
+              </w:rPr>
+              <w:t>PK: id  |  Nuk ka FK.</w:t>
+            </w:r>
+          </w:p>
+        </w:tc>
+      </w:tr>
+      <w:tr>
+        <w:trPr>
+          <w:trHeight w:val="475"/>
+          <w:jc w:val="center"/>
+        </w:trPr>
+        <w:tc>
+          <w:tcPr>
+            <w:tcW w:w="2880" w:type="dxa"/>
+            <w:shd w:val="clear" w:color="auto" w:fill="F3F6F8"/>
+            <w:vAlign w:val="center"/>
+          </w:tcPr>
+          <w:p>
+            <w:pPr>
+              <w:spacing w:before="32" w:after="32" w:line="240" w:lineRule="auto"/>
+            </w:pPr>
+            <w:r>
+              <w:rPr>
+                <w:b/>
+                <w:color w:val="009E9D"/>
+                <w:sz w:val="18"/>
+              </w:rPr>
+              <w:t>Angazhimi</w:t>
+            </w:r>
+          </w:p>
+        </w:tc>
+        <w:tc>
+          <w:tcPr>
+            <w:tcW w:w="6696" w:type="dxa"/>
+            <w:shd w:val="clear" w:color="auto" w:fill="F3F6F8"/>
+            <w:vAlign w:val="center"/>
+          </w:tcPr>
+          <w:p>
+            <w:pPr>
+              <w:spacing w:before="32" w:after="32" w:line="240" w:lineRule="auto"/>
+            </w:pPr>
+            <w:r>
+              <w:rPr>
+                <w:color w:val="192F4F"/>
+                <w:sz w:val="17"/>
+              </w:rPr>
+              <w:t>PK: id  |  FK: mesimdhenesi_id → Mësimdhënësi; klasa_id → Klasa; lenda_id → Lënda.</w:t>
+            </w:r>
+          </w:p>
+        </w:tc>
+      </w:tr>
+      <w:tr>
+        <w:trPr>
+          <w:trHeight w:val="475"/>
+          <w:jc w:val="center"/>
+        </w:trPr>
+        <w:tc>
+          <w:tcPr>
+            <w:tcW w:w="2880" w:type="dxa"/>
+            <w:shd w:val="clear" w:color="auto" w:fill="E9F2F5"/>
+            <w:vAlign w:val="center"/>
+          </w:tcPr>
+          <w:p>
+            <w:pPr>
+              <w:spacing w:before="32" w:after="32" w:line="240" w:lineRule="auto"/>
+            </w:pPr>
+            <w:r>
+              <w:rPr>
+                <w:b/>
+                <w:color w:val="009E9D"/>
+                <w:sz w:val="18"/>
+              </w:rPr>
+              <w:t>Nota</w:t>
+            </w:r>
+          </w:p>
+        </w:tc>
+        <w:tc>
+          <w:tcPr>
+            <w:tcW w:w="6696" w:type="dxa"/>
+            <w:shd w:val="clear" w:color="auto" w:fill="E9F2F5"/>
+            <w:vAlign w:val="center"/>
+          </w:tcPr>
+          <w:p>
+            <w:pPr>
+              <w:spacing w:before="32" w:after="32" w:line="240" w:lineRule="auto"/>
+            </w:pPr>
+            <w:r>
+              <w:rPr>
+                <w:color w:val="192F4F"/>
+                <w:sz w:val="17"/>
+              </w:rPr>
+              <w:t>PK: id  |  FK: nxenesi_id → Nxënësi; angazhimi_id → Angazhimi.</w:t>
+            </w:r>
+          </w:p>
+        </w:tc>
+      </w:tr>
+      <w:tr>
+        <w:trPr>
+          <w:trHeight w:val="475"/>
+          <w:jc w:val="center"/>
+        </w:trPr>
+        <w:tc>
+          <w:tcPr>
+            <w:tcW w:w="2880" w:type="dxa"/>
+            <w:shd w:val="clear" w:color="auto" w:fill="F3F6F8"/>
+            <w:vAlign w:val="center"/>
+          </w:tcPr>
+          <w:p>
+            <w:pPr>
+              <w:spacing w:before="32" w:after="32" w:line="240" w:lineRule="auto"/>
+            </w:pPr>
+            <w:r>
+              <w:rPr>
+                <w:b/>
+                <w:color w:val="009E9D"/>
+                <w:sz w:val="18"/>
+              </w:rPr>
+              <w:t>Mungesa</w:t>
+            </w:r>
+          </w:p>
+        </w:tc>
+        <w:tc>
+          <w:tcPr>
+            <w:tcW w:w="6696" w:type="dxa"/>
+            <w:shd w:val="clear" w:color="auto" w:fill="F3F6F8"/>
+            <w:vAlign w:val="center"/>
+          </w:tcPr>
+          <w:p>
+            <w:pPr>
+              <w:spacing w:before="32" w:after="32" w:line="240" w:lineRule="auto"/>
+            </w:pPr>
+            <w:r>
+              <w:rPr>
+                <w:color w:val="192F4F"/>
+                <w:sz w:val="17"/>
+              </w:rPr>
+              <w:t>PK: id  |  FK: nxenesi_id → Nxënësi; angazhimi_id → Angazhimi.</w:t>
+            </w:r>
+          </w:p>
+        </w:tc>
+      </w:tr>
+    </w:tbl>
+    <w:p>
+      <w:pPr>
+        <w:spacing w:before="120" w:after="240" w:line="240" w:lineRule="auto"/>
+        <w:jc w:val="center"/>
+      </w:pPr>
+      <w:r>
+        <w:rPr>
+          <w:color w:val="657C91"/>
+          <w:sz w:val="17"/>
+        </w:rPr>
+        <w:t>Tabela 2. Çelësat kryesorë dhe lidhjet e planifikuara</w:t>
+      </w:r>
+    </w:p>
+    <w:p>
+      <w:pPr>
+        <w:spacing w:before="60" w:after="120" w:line="252" w:lineRule="auto"/>
+      </w:pPr>
+      <w:r>
+        <w:rPr>
+          <w:b/>
+          <w:color w:val="192F4F"/>
+          <w:sz w:val="28"/>
+        </w:rPr>
+        <w:t>6.4  Llojet e relacioneve</w:t>
+      </w:r>
+    </w:p>
+    <w:p>
+      <w:pPr>
+        <w:spacing w:after="160" w:line="288" w:lineRule="auto"/>
+      </w:pPr>
+      <w:r>
+        <w:rPr>
+          <w:color w:val="192F4F"/>
+        </w:rPr>
+        <w:t>Te School Control do të përdor kryesisht lidhje një-me-shumë (1:N). Për shembull, një klasë përfshin shumë nxënës, por një nxënës i takon një klase në të njëjtën kohë.</w:t>
+      </w:r>
+    </w:p>
+    <w:tbl>
+      <w:tblPr>
+        <w:tblW w:w="0" w:type="auto"/>
+        <w:jc w:val="center"/>
+        <w:tblLayout w:type="fixed"/>
+        <w:tblLook w:val="04A0" w:firstRow="1" w:lastRow="0" w:firstColumn="1" w:lastColumn="0" w:noHBand="0" w:noVBand="1"/>
+      </w:tblPr>
+      <w:tblGrid>
+        <w:gridCol w:w="2880"/>
+        <w:gridCol w:w="6696"/>
+      </w:tblGrid>
+      <w:tr>
+        <w:trPr>
+          <w:trHeight w:val="418"/>
+          <w:jc w:val="center"/>
+        </w:trPr>
+        <w:tc>
+          <w:tcPr>
+            <w:tcW w:w="2880" w:type="dxa"/>
+            <w:shd w:val="clear" w:color="auto" w:fill="E9F2F5"/>
+          </w:tcPr>
+          <w:p>
+            <w:pPr>
+              <w:spacing w:before="32" w:after="32" w:line="240" w:lineRule="auto"/>
+            </w:pPr>
+            <w:r>
+              <w:rPr>
+                <w:b/>
+                <w:color w:val="009E9D"/>
+                <w:sz w:val="18"/>
+              </w:rPr>
+              <w:t>KLASA (1)</w:t>
+            </w:r>
+          </w:p>
+        </w:tc>
+        <w:tc>
+          <w:tcPr>
+            <w:tcW w:w="6696" w:type="dxa"/>
+            <w:shd w:val="clear" w:color="auto" w:fill="E9F2F5"/>
+          </w:tcPr>
+          <w:p>
+            <w:pPr>
+              <w:spacing w:before="32" w:after="32" w:line="240" w:lineRule="auto"/>
+            </w:pPr>
+            <w:r>
+              <w:rPr>
+                <w:color w:val="192F4F"/>
+                <w:sz w:val="18"/>
+              </w:rPr>
+              <w:t>→  SHUMË NXËNËS (N)</w:t>
+            </w:r>
+          </w:p>
+        </w:tc>
+      </w:tr>
+      <w:tr>
+        <w:trPr>
+          <w:trHeight w:val="418"/>
+          <w:jc w:val="center"/>
+        </w:trPr>
+        <w:tc>
+          <w:tcPr>
+            <w:tcW w:w="2880" w:type="dxa"/>
+            <w:shd w:val="clear" w:color="auto" w:fill="F3F6F8"/>
+          </w:tcPr>
+          <w:p>
+            <w:pPr>
+              <w:spacing w:before="32" w:after="32" w:line="240" w:lineRule="auto"/>
+            </w:pPr>
+            <w:r>
+              <w:rPr>
+                <w:b/>
+                <w:color w:val="009E9D"/>
+                <w:sz w:val="18"/>
+              </w:rPr>
+              <w:t>MËSIMDHËNËSI (1)</w:t>
+            </w:r>
+          </w:p>
+        </w:tc>
+        <w:tc>
+          <w:tcPr>
+            <w:tcW w:w="6696" w:type="dxa"/>
+            <w:shd w:val="clear" w:color="auto" w:fill="F3F6F8"/>
+          </w:tcPr>
+          <w:p>
+            <w:pPr>
+              <w:spacing w:before="32" w:after="32" w:line="240" w:lineRule="auto"/>
+            </w:pPr>
+            <w:r>
+              <w:rPr>
+                <w:color w:val="192F4F"/>
+                <w:sz w:val="18"/>
+              </w:rPr>
+              <w:t>→  SHUMË ANGAZHIME (N)</w:t>
+            </w:r>
+          </w:p>
+        </w:tc>
+      </w:tr>
+      <w:tr>
+        <w:trPr>
+          <w:trHeight w:val="418"/>
+          <w:jc w:val="center"/>
+        </w:trPr>
+        <w:tc>
+          <w:tcPr>
+            <w:tcW w:w="2880" w:type="dxa"/>
+            <w:shd w:val="clear" w:color="auto" w:fill="E9F2F5"/>
+          </w:tcPr>
+          <w:p>
+            <w:pPr>
+              <w:spacing w:before="32" w:after="32" w:line="240" w:lineRule="auto"/>
+            </w:pPr>
+            <w:r>
+              <w:rPr>
+                <w:b/>
+                <w:color w:val="009E9D"/>
+                <w:sz w:val="18"/>
+              </w:rPr>
+              <w:t>NXËNËSI (1)</w:t>
+            </w:r>
+          </w:p>
+        </w:tc>
+        <w:tc>
+          <w:tcPr>
+            <w:tcW w:w="6696" w:type="dxa"/>
+            <w:shd w:val="clear" w:color="auto" w:fill="E9F2F5"/>
+          </w:tcPr>
+          <w:p>
+            <w:pPr>
+              <w:spacing w:before="32" w:after="32" w:line="240" w:lineRule="auto"/>
+            </w:pPr>
+            <w:r>
+              <w:rPr>
+                <w:color w:val="192F4F"/>
+                <w:sz w:val="18"/>
+              </w:rPr>
+              <w:t>→  SHUMË NOTA / MUNGESA (N)</w:t>
+            </w:r>
+          </w:p>
+        </w:tc>
+      </w:tr>
+    </w:tbl>
+    <w:p>
+      <w:pPr>
+        <w:spacing w:before="240" w:after="120" w:line="288" w:lineRule="auto"/>
+      </w:pPr>
+      <w:r>
+        <w:rPr>
+          <w:b/>
+          <w:color w:val="009E9D"/>
+          <w:sz w:val="19"/>
+        </w:rPr>
+        <w:t>PSE MË DUHET TABELA ANGAZHIMI?</w:t>
+      </w:r>
+    </w:p>
+    <w:p>
+      <w:pPr>
+        <w:spacing w:line="298" w:lineRule="auto"/>
+      </w:pPr>
+      <w:r>
+        <w:rPr>
+          <w:color w:val="192F4F"/>
+        </w:rPr>
+        <w:t>Një mësimdhënës mund të japë lëndë në disa klasa. Tabela Angazhimi ruan kombinimin mësimdhënës–lëndë–klasë. Kur vendoset një notë, sistemi do të kontrollojë që nxënësi i takon klasës përkatëse.</w:t>
+      </w:r>
+    </w:p>
+    <w:p>
+      <w:r>
+        <w:br w:type="page"/>
+      </w:r>
+    </w:p>
+    <w:tbl>
+      <w:tblPr>
+        <w:tblW w:w="0" w:type="auto"/>
+        <w:jc w:val="center"/>
+        <w:tblBorders>
+          <w:top w:val="nil"/>
+          <w:left w:val="nil"/>
+          <w:bottom w:val="nil"/>
+          <w:right w:val="nil"/>
+          <w:insideH w:val="nil"/>
+          <w:insideV w:val="nil"/>
+        </w:tblBorders>
+        <w:tblLayout w:type="fixed"/>
+        <w:tblLook w:val="04A0" w:firstRow="1" w:lastRow="0" w:firstColumn="1" w:lastColumn="0" w:noHBand="0" w:noVBand="1"/>
+      </w:tblPr>
+      <w:tblGrid>
+        <w:gridCol w:w="4677"/>
+        <w:gridCol w:w="4677"/>
+      </w:tblGrid>
+      <w:tr>
+        <w:trPr>
+          <w:jc w:val="center"/>
+        </w:trPr>
+        <w:tc>
+          <w:tcPr>
+            <w:tcW w:w="4677" w:type="dxa"/>
+            <w:vAlign w:val="center"/>
+          </w:tcPr>
+          <w:p>
+            <w:pPr>
+              <w:spacing w:line="240" w:lineRule="auto"/>
+            </w:pPr>
+            <w:r>
+              <w:rPr>
+                <w:b/>
+                <w:color w:val="009E9D"/>
+                <w:sz w:val="26"/>
+              </w:rPr>
+              <w:lastRenderedPageBreak/>
+              <w:t xml:space="preserve">SC  </w:t>
+            </w:r>
+            <w:r>
+              <w:rPr>
+                <w:b/>
+                <w:color w:val="192F4F"/>
+                <w:sz w:val="22"/>
+              </w:rPr>
+              <w:t>SCHOOL CONTROL</w:t>
+            </w:r>
+          </w:p>
+        </w:tc>
+        <w:tc>
+          <w:tcPr>
+            <w:tcW w:w="4677" w:type="dxa"/>
+            <w:vAlign w:val="center"/>
+          </w:tcPr>
+          <w:p>
+            <w:pPr>
+              <w:spacing w:line="240" w:lineRule="auto"/>
+              <w:jc w:val="right"/>
+            </w:pPr>
+            <w:r>
+              <w:rPr>
+                <w:b/>
+                <w:color w:val="657C91"/>
+                <w:sz w:val="18"/>
+              </w:rPr>
+              <w:t>RAPORTI TEKNIK 1</w:t>
+            </w:r>
+          </w:p>
+        </w:tc>
+      </w:tr>
+    </w:tbl>
+    <w:p>
+      <w:pPr>
+        <w:pBdr>
+          <w:bottom w:val="single" w:sz="16" w:space="0" w:color="009E9D"/>
+        </w:pBdr>
+        <w:spacing w:after="280"/>
+      </w:pPr>
+    </w:p>
+    <w:p>
+      <w:pPr>
+        <w:spacing w:after="240" w:line="288" w:lineRule="auto"/>
+      </w:pPr>
+      <w:r>
+        <w:rPr>
+          <w:b/>
+          <w:color w:val="009E9D"/>
+          <w:sz w:val="20"/>
+        </w:rPr>
+        <w:t>KAPITULLI 07  /  GITHUB DHE PLANI I PUNËS</w:t>
+      </w:r>
+    </w:p>
+    <w:p>
+      <w:pPr>
+        <w:spacing w:after="280" w:line="245" w:lineRule="auto"/>
+      </w:pPr>
+      <w:r>
+        <w:rPr>
+          <w:b/>
+          <w:color w:val="192F4F"/>
+          <w:sz w:val="50"/>
+        </w:rPr>
+        <w:t>Progresi dhe hapat e ardhshëm</w:t>
+      </w:r>
+    </w:p>
+    <w:p>
+      <w:pPr>
+        <w:pBdr>
+          <w:left w:val="single" w:sz="22" w:space="10" w:color="009E9D"/>
+        </w:pBdr>
+        <w:spacing w:after="300" w:line="298" w:lineRule="auto"/>
+      </w:pPr>
+      <w:r>
+        <w:rPr>
+          <w:color w:val="274967"/>
+          <w:sz w:val="22"/>
+        </w:rPr>
+        <w:t>Raportin e parë e kam përdorur për të qartësuar problemin, rolet, kërkesat dhe dizajnin teknik. Punën po e ruaj në GitHub, në mënyrë që progresi të shihet gjatë semestrit.</w:t>
+      </w:r>
+    </w:p>
+    <w:p>
+      <w:pPr>
+        <w:spacing w:after="140" w:line="252" w:lineRule="auto"/>
+      </w:pPr>
+      <w:r>
+        <w:rPr>
+          <w:b/>
+          <w:color w:val="192F4F"/>
+          <w:sz w:val="28"/>
+        </w:rPr>
+        <w:t>7.1  Repository i projektit</w:t>
+      </w:r>
+    </w:p>
+    <w:p>
+      <w:pPr>
+        <w:spacing w:after="120" w:line="288" w:lineRule="auto"/>
+      </w:pPr>
+      <w:r>
+        <w:rPr>
+          <w:color w:val="192F4F"/>
+        </w:rPr>
+        <w:t>Kam krijuar repository publik për School Control. Deri tani aty janë README.md dhe dokumenti i raportit brenda dosjes docs. Kodi i aplikacionit do të shtohet në fazën e implementimit.</w:t>
+      </w:r>
+    </w:p>
+    <w:tbl>
+      <w:tblPr>
+        <w:tblW w:w="0" w:type="auto"/>
+        <w:tblLayout w:type="fixed"/>
+        <w:tblLook w:val="04A0" w:firstRow="1" w:lastRow="0" w:firstColumn="1" w:lastColumn="0" w:noHBand="0" w:noVBand="1"/>
+      </w:tblPr>
+      <w:tblGrid>
+        <w:gridCol w:w="9354"/>
+      </w:tblGrid>
+      <w:tr>
+        <w:tc>
+          <w:tcPr>
+            <w:tcW w:w="9354" w:type="dxa"/>
+            <w:shd w:val="clear" w:color="auto" w:fill="EFF5F8"/>
+          </w:tcPr>
+          <w:p>
+            <w:pPr>
+              <w:spacing w:before="120" w:after="60"/>
+              <w:ind w:left="147"/>
+            </w:pPr>
+            <w:r>
+              <w:rPr>
+                <w:b/>
+                <w:color w:val="009E9D"/>
+                <w:sz w:val="18"/>
+              </w:rPr>
+              <w:t>SCHOOL CONTROL  /  GITHUB PUBLIK</w:t>
+            </w:r>
+          </w:p>
+          <w:p>
+            <w:pPr>
+              <w:spacing w:before="100" w:line="240" w:lineRule="auto"/>
+            </w:pPr>
+            <w:r>
+              <w:rPr>
+                <w:b/>
+                <w:color w:val="192F4F"/>
+                <w:sz w:val="16"/>
+              </w:rPr>
+              <w:t>https://github.com/bekirnafezi/Bekir-Nafezi-Sistemi-per-Menaxhimin-e-Shkollave</w:t>
+            </w:r>
+          </w:p>
+        </w:tc>
+      </w:tr>
+    </w:tbl>
+    <w:p>
+      <w:pPr>
+        <w:spacing w:before="240" w:after="120" w:line="252" w:lineRule="auto"/>
+      </w:pPr>
+      <w:r>
+        <w:rPr>
+          <w:b/>
+          <w:color w:val="192F4F"/>
+          <w:sz w:val="28"/>
+        </w:rPr>
+        <w:t>7.2  Struktura fillestare</w:t>
+      </w:r>
+    </w:p>
+    <w:p>
+      <w:pPr>
+        <w:spacing w:after="100" w:line="288" w:lineRule="auto"/>
+      </w:pPr>
+      <w:r>
+        <w:rPr>
+          <w:color w:val="192F4F"/>
+        </w:rPr>
+        <w:t>Për momentin, dosja e projektit ka një organizim të thjeshtë:</w:t>
+      </w:r>
+    </w:p>
+    <w:tbl>
+      <w:tblPr>
+        <w:tblW w:w="0" w:type="auto"/>
+        <w:jc w:val="center"/>
+        <w:tblLayout w:type="fixed"/>
+        <w:tblLook w:val="04A0" w:firstRow="1" w:lastRow="0" w:firstColumn="1" w:lastColumn="0" w:noHBand="0" w:noVBand="1"/>
+      </w:tblPr>
+      <w:tblGrid>
+        <w:gridCol w:w="2880"/>
+        <w:gridCol w:w="6696"/>
+      </w:tblGrid>
+      <w:tr>
+        <w:trPr>
+          <w:trHeight w:val="418"/>
+          <w:jc w:val="center"/>
+        </w:trPr>
+        <w:tc>
+          <w:tcPr>
+            <w:tcW w:w="2880" w:type="dxa"/>
+            <w:shd w:val="clear" w:color="auto" w:fill="E9F2F5"/>
+          </w:tcPr>
+          <w:p>
+            <w:pPr>
+              <w:spacing w:before="32" w:after="32" w:line="240" w:lineRule="auto"/>
+            </w:pPr>
+            <w:r>
+              <w:rPr>
+                <w:b/>
+                <w:color w:val="009E9D"/>
+                <w:sz w:val="17"/>
+              </w:rPr>
+              <w:t>README.md</w:t>
+            </w:r>
+          </w:p>
+        </w:tc>
+        <w:tc>
+          <w:tcPr>
+            <w:tcW w:w="6696" w:type="dxa"/>
+            <w:shd w:val="clear" w:color="auto" w:fill="E9F2F5"/>
+          </w:tcPr>
+          <w:p>
+            <w:pPr>
+              <w:spacing w:before="32" w:after="32" w:line="240" w:lineRule="auto"/>
+            </w:pPr>
+            <w:r>
+              <w:rPr>
+                <w:color w:val="192F4F"/>
+                <w:sz w:val="18"/>
+              </w:rPr>
+              <w:t>Përshkrimi i shkurtër i projektit.</w:t>
+            </w:r>
+          </w:p>
+        </w:tc>
+      </w:tr>
+      <w:tr>
+        <w:trPr>
+          <w:trHeight w:val="418"/>
+          <w:jc w:val="center"/>
+        </w:trPr>
+        <w:tc>
+          <w:tcPr>
+            <w:tcW w:w="2880" w:type="dxa"/>
+            <w:shd w:val="clear" w:color="auto" w:fill="F3F6F8"/>
+          </w:tcPr>
+          <w:p>
+            <w:pPr>
+              <w:spacing w:before="32" w:after="32" w:line="240" w:lineRule="auto"/>
+            </w:pPr>
+            <w:r>
+              <w:rPr>
+                <w:b/>
+                <w:color w:val="009E9D"/>
+                <w:sz w:val="17"/>
+              </w:rPr>
+              <w:t>docs/</w:t>
+            </w:r>
+          </w:p>
+        </w:tc>
+        <w:tc>
+          <w:tcPr>
+            <w:tcW w:w="6696" w:type="dxa"/>
+            <w:shd w:val="clear" w:color="auto" w:fill="F3F6F8"/>
+          </w:tcPr>
+          <w:p>
+            <w:pPr>
+              <w:spacing w:before="32" w:after="32" w:line="240" w:lineRule="auto"/>
+            </w:pPr>
+            <w:r>
+              <w:rPr>
+                <w:color w:val="192F4F"/>
+                <w:sz w:val="18"/>
+              </w:rPr>
+              <w:t>Dosja ku ruaj dokumentacionin teknik.</w:t>
+            </w:r>
+          </w:p>
+        </w:tc>
+      </w:tr>
+      <w:tr>
+        <w:trPr>
+          <w:trHeight w:val="418"/>
+          <w:jc w:val="center"/>
+        </w:trPr>
+        <w:tc>
+          <w:tcPr>
+            <w:tcW w:w="2880" w:type="dxa"/>
+            <w:shd w:val="clear" w:color="auto" w:fill="E9F2F5"/>
+          </w:tcPr>
+          <w:p>
+            <w:pPr>
+              <w:spacing w:before="32" w:after="32" w:line="240" w:lineRule="auto"/>
+            </w:pPr>
+            <w:r>
+              <w:rPr>
+                <w:b/>
+                <w:color w:val="009E9D"/>
+                <w:sz w:val="18"/>
+              </w:rPr>
+              <w:t>Raporti Word</w:t>
+            </w:r>
+          </w:p>
+        </w:tc>
+        <w:tc>
+          <w:tcPr>
+            <w:tcW w:w="6696" w:type="dxa"/>
+            <w:shd w:val="clear" w:color="auto" w:fill="E9F2F5"/>
+          </w:tcPr>
+          <w:p>
+            <w:pPr>
+              <w:spacing w:before="32" w:after="32" w:line="240" w:lineRule="auto"/>
+            </w:pPr>
+            <w:r>
+              <w:rPr>
+                <w:color w:val="192F4F"/>
+                <w:sz w:val="17"/>
+              </w:rPr>
+              <w:t>docs/School_Control_Raporti_Teknik_1.docx</w:t>
+            </w:r>
+          </w:p>
+        </w:tc>
+      </w:tr>
+    </w:tbl>
+    <w:p>
+      <w:pPr>
+        <w:spacing w:before="260" w:after="100" w:line="252" w:lineRule="auto"/>
+      </w:pPr>
+      <w:r>
+        <w:rPr>
+          <w:b/>
+          <w:color w:val="192F4F"/>
+          <w:sz w:val="28"/>
+        </w:rPr>
+        <w:t>7.3  Plani deri te Raporti Teknik 2</w:t>
+      </w:r>
+    </w:p>
+    <w:p>
+      <w:pPr>
+        <w:spacing w:after="100" w:line="288" w:lineRule="auto"/>
+      </w:pPr>
+      <w:r>
+        <w:rPr>
+          <w:color w:val="192F4F"/>
+        </w:rPr>
+        <w:t>1.  Do ta krijoj projektin Django dhe do ta lidh me databazën SQLite.</w:t>
+      </w:r>
+    </w:p>
+    <w:p>
+      <w:pPr>
+        <w:spacing w:after="100" w:line="288" w:lineRule="auto"/>
+      </w:pPr>
+      <w:r>
+        <w:rPr>
+          <w:color w:val="192F4F"/>
+        </w:rPr>
+        <w:t>2.  Do t’i krijoj modelet dhe lidhjet e tabelave sipas skemës së raportit.</w:t>
+      </w:r>
+    </w:p>
+    <w:p>
+      <w:pPr>
+        <w:spacing w:after="100" w:line="288" w:lineRule="auto"/>
+      </w:pPr>
+      <w:r>
+        <w:rPr>
+          <w:color w:val="192F4F"/>
+        </w:rPr>
+        <w:t>3.  Do të përgatis hyrjen me role dhe regjistrimin bazë të nxënësve.</w:t>
+      </w:r>
+    </w:p>
+    <w:p>
+      <w:pPr>
+        <w:spacing w:after="100" w:line="288" w:lineRule="auto"/>
+        <w:rPr>
+          <w:color w:val="192F4F"/>
+        </w:rPr>
+      </w:pPr>
+      <w:r>
+        <w:rPr>
+          <w:color w:val="192F4F"/>
+        </w:rPr>
+        <w:t>4.  Do të testoj ruajtjen e të dhënave dhe disa kërkesa API me të dhëna provë.</w:t>
+      </w:r>
+    </w:p>
+    <w:p>
+      <w:pPr>
+        <w:spacing w:after="100" w:line="288" w:lineRule="auto"/>
+      </w:pPr>
+    </w:p>
+    <w:p>
+      <w:pPr>
+        <w:spacing w:before="80" w:after="100" w:line="288" w:lineRule="auto"/>
+      </w:pPr>
+      <w:r>
+        <w:rPr>
+          <w:b/>
+          <w:color w:val="009E9D"/>
+          <w:sz w:val="19"/>
+        </w:rPr>
+        <w:t>PËRFUNDIMI I RAPORTIT TEKNIK 1</w:t>
+      </w:r>
+    </w:p>
+    <w:p>
+      <w:pPr>
+        <w:spacing w:line="298" w:lineRule="auto"/>
+      </w:pPr>
+      <w:r>
+        <w:rPr>
+          <w:color w:val="192F4F"/>
+        </w:rPr>
+        <w:t>Me këtë raport kam vendosur bazën e School Control. Hapi tjetër është ta kthej dizajnin në kod funksional, me databazë reale dhe me rezultate që mund t’i demonstroj para profesorit.</w:t>
       </w:r>
     </w:p>
     <w:sectPr>
@@ -5403,31 +6603,31 @@
       </w:rPr>
     </w:lvl>
   </w:abstractNum>
-  <w:num w:numId="1" w16cid:durableId="187452067">
+  <w:num w:numId="1" w16cid:durableId="679354134">
     <w:abstractNumId w:val="8"/>
   </w:num>
-  <w:num w:numId="2" w16cid:durableId="1818763935">
+  <w:num w:numId="2" w16cid:durableId="5912824">
     <w:abstractNumId w:val="6"/>
   </w:num>
-  <w:num w:numId="3" w16cid:durableId="148788045">
+  <w:num w:numId="3" w16cid:durableId="668169022">
     <w:abstractNumId w:val="5"/>
   </w:num>
-  <w:num w:numId="4" w16cid:durableId="245267953">
+  <w:num w:numId="4" w16cid:durableId="1416131700">
     <w:abstractNumId w:val="4"/>
   </w:num>
-  <w:num w:numId="5" w16cid:durableId="1659459397">
+  <w:num w:numId="5" w16cid:durableId="995039286">
     <w:abstractNumId w:val="7"/>
   </w:num>
-  <w:num w:numId="6" w16cid:durableId="1160733404">
+  <w:num w:numId="6" w16cid:durableId="1366255332">
     <w:abstractNumId w:val="3"/>
   </w:num>
-  <w:num w:numId="7" w16cid:durableId="1126118101">
+  <w:num w:numId="7" w16cid:durableId="275791093">
     <w:abstractNumId w:val="2"/>
   </w:num>
-  <w:num w:numId="8" w16cid:durableId="721905089">
+  <w:num w:numId="8" w16cid:durableId="785659454">
     <w:abstractNumId w:val="1"/>
   </w:num>
-  <w:num w:numId="9" w16cid:durableId="1298682411">
+  <w:num w:numId="9" w16cid:durableId="1641225002">
     <w:abstractNumId w:val="0"/>
   </w:num>
 </w:numbering>

</xml_diff>